<commit_message>
Actualización etiquetas de relaciones
</commit_message>
<xml_diff>
--- a/Encargo_Semanal.docx
+++ b/Encargo_Semanal.docx
@@ -1681,7 +1681,7 @@
                 <v:shape id="ole_rId8" type="_x0000_tole_rId8" style="width:238.5pt;height:189.75pt;mso-wrap-distance-right:0pt" filled="f" o:ole="">
                   <v:imagedata r:id="rId9" o:title=""/>
                 </v:shape>
-                <o:OLEObject Type="Embed" ProgID="PBrush" ShapeID="ole_rId8" DrawAspect="Content" ObjectID="_678817985" r:id="rId8"/>
+                <o:OLEObject Type="Embed" ProgID="PBrush" ShapeID="ole_rId8" DrawAspect="Content" ObjectID="_265367157" r:id="rId8"/>
               </w:object>
             </w:r>
           </w:p>
@@ -2081,15 +2081,15 @@
           </mc:Fallback>
         </mc:AlternateContent>
         <w:drawing>
-          <wp:anchor distT="0" distB="0" distL="0" distR="0" simplePos="0" relativeHeight="42" behindDoc="0" locked="0" layoutInCell="0" allowOverlap="1">
+          <wp:anchor distT="0" distB="0" distL="0" distR="0" simplePos="0" relativeHeight="41" behindDoc="0" locked="0" layoutInCell="0" allowOverlap="1">
             <wp:simplePos x="0" y="0"/>
             <wp:positionH relativeFrom="column">
               <wp:align>center</wp:align>
             </wp:positionH>
             <wp:positionV relativeFrom="paragraph">
-              <wp:align>top</wp:align>
+              <wp:posOffset>635</wp:posOffset>
             </wp:positionV>
-            <wp:extent cx="6019165" cy="3147060"/>
+            <wp:extent cx="6019165" cy="3380105"/>
             <wp:effectExtent l="0" t="0" r="0" b="0"/>
             <wp:wrapSquare wrapText="largest"/>
             <wp:docPr id="8" name="Imagen8"/>
@@ -2114,7 +2114,7 @@
                   <pic:spPr bwMode="auto">
                     <a:xfrm>
                       <a:off x="0" y="0"/>
-                      <a:ext cx="6019165" cy="3147060"/>
+                      <a:ext cx="6019165" cy="3380105"/>
                     </a:xfrm>
                     <a:prstGeom prst="rect">
                       <a:avLst/>
@@ -2262,15 +2262,15 @@
           </mc:Fallback>
         </mc:AlternateContent>
         <w:drawing>
-          <wp:anchor distT="0" distB="0" distL="0" distR="0" simplePos="0" relativeHeight="41" behindDoc="0" locked="0" layoutInCell="0" allowOverlap="1">
+          <wp:anchor distT="0" distB="0" distL="0" distR="0" simplePos="0" relativeHeight="42" behindDoc="0" locked="0" layoutInCell="0" allowOverlap="1">
             <wp:simplePos x="0" y="0"/>
             <wp:positionH relativeFrom="column">
               <wp:align>center</wp:align>
             </wp:positionH>
             <wp:positionV relativeFrom="paragraph">
-              <wp:align>top</wp:align>
+              <wp:posOffset>635</wp:posOffset>
             </wp:positionV>
-            <wp:extent cx="6019165" cy="3180080"/>
+            <wp:extent cx="6019165" cy="3416935"/>
             <wp:effectExtent l="0" t="0" r="0" b="0"/>
             <wp:wrapSquare wrapText="largest"/>
             <wp:docPr id="14" name="Imagen7"/>
@@ -2295,7 +2295,7 @@
                   <pic:spPr bwMode="auto">
                     <a:xfrm>
                       <a:off x="0" y="0"/>
-                      <a:ext cx="6019165" cy="3180080"/>
+                      <a:ext cx="6019165" cy="3416935"/>
                     </a:xfrm>
                     <a:prstGeom prst="rect">
                       <a:avLst/>

</xml_diff>

<commit_message>
Adv: Se agrega encargo semana 3
</commit_message>
<xml_diff>
--- a/Encargo_Semanal.docx
+++ b/Encargo_Semanal.docx
@@ -10,7 +10,7 @@
       <w:r>
         <w:rPr/>
         <w:drawing>
-          <wp:anchor distT="0" distB="0" distL="0" distR="0" simplePos="0" relativeHeight="30" behindDoc="0" locked="0" layoutInCell="1" allowOverlap="1">
+          <wp:anchor distT="0" distB="0" distL="0" distR="0" simplePos="0" relativeHeight="28" behindDoc="0" locked="0" layoutInCell="1" allowOverlap="1">
             <wp:simplePos x="0" y="0"/>
             <wp:positionH relativeFrom="column">
               <wp:posOffset>-434340</wp:posOffset>
@@ -64,7 +64,7 @@
         <mc:AlternateContent>
           <mc:Choice Requires="wps">
             <w:drawing>
-              <wp:anchor distT="0" distB="3810" distL="0" distR="0" simplePos="0" relativeHeight="31" behindDoc="0" locked="0" layoutInCell="1" allowOverlap="1" wp14:anchorId="693102DD">
+              <wp:anchor distT="0" distB="3810" distL="0" distR="0" simplePos="0" relativeHeight="29" behindDoc="0" locked="0" layoutInCell="1" allowOverlap="1" wp14:anchorId="693102DD">
                 <wp:simplePos x="0" y="0"/>
                 <wp:positionH relativeFrom="column">
                   <wp:posOffset>1927860</wp:posOffset>
@@ -131,7 +131,7 @@
         <mc:AlternateContent>
           <mc:Choice Requires="wps">
             <w:drawing>
-              <wp:anchor distT="0" distB="0" distL="0" distR="3810" simplePos="0" relativeHeight="32" behindDoc="0" locked="0" layoutInCell="1" allowOverlap="1" wp14:anchorId="36699E54">
+              <wp:anchor distT="0" distB="0" distL="0" distR="3810" simplePos="0" relativeHeight="30" behindDoc="0" locked="0" layoutInCell="1" allowOverlap="1" wp14:anchorId="36699E54">
                 <wp:simplePos x="0" y="0"/>
                 <wp:positionH relativeFrom="column">
                   <wp:posOffset>-325120</wp:posOffset>
@@ -299,7 +299,7 @@
         <mc:AlternateContent>
           <mc:Choice Requires="wps">
             <w:drawing>
-              <wp:anchor distT="0" distB="4445" distL="0" distR="5715" simplePos="0" relativeHeight="33" behindDoc="0" locked="0" layoutInCell="1" allowOverlap="1" wp14:anchorId="3BFABDE3">
+              <wp:anchor distT="0" distB="4445" distL="0" distR="5715" simplePos="0" relativeHeight="31" behindDoc="0" locked="0" layoutInCell="1" allowOverlap="1" wp14:anchorId="3BFABDE3">
                 <wp:simplePos x="0" y="0"/>
                 <wp:positionH relativeFrom="column">
                   <wp:posOffset>-315595</wp:posOffset>
@@ -372,7 +372,7 @@
       </w:pPr>
       <w:r>
         <w:rPr/>
-        <w:t>Semana 2</w:t>
+        <w:t>Semana 3</w:t>
       </w:r>
     </w:p>
     <w:p>
@@ -417,7 +417,7 @@
           <w:bottom w:w="0" w:type="dxa"/>
           <w:end w:w="108" w:type="dxa"/>
         </w:tblCellMar>
-        <w:tblLook w:val="04a0" w:firstRow="1" w:noVBand="1" w:lastRow="0" w:firstColumn="1" w:lastColumn="0" w:noHBand="0"/>
+        <w:tblLook w:val="06a0" w:firstRow="1" w:noVBand="1" w:lastRow="0" w:firstColumn="1" w:lastColumn="0" w:noHBand="1"/>
       </w:tblPr>
       <w:tblGrid>
         <w:gridCol w:w="4961"/>
@@ -425,6 +425,7 @@
       </w:tblGrid>
       <w:tr>
         <w:trPr>
+          <w:tblHeader w:val="true"/>
           <w:trHeight w:val="510" w:hRule="atLeast"/>
         </w:trPr>
         <w:tc>
@@ -445,7 +446,7 @@
               <w:spacing w:lineRule="auto" w:line="240" w:before="120" w:after="0"/>
               <w:jc w:val="start"/>
               <w:rPr>
-                <w:rFonts w:eastAsia="Arial" w:cs=""/>
+                <w:rFonts w:eastAsia="Arial" w:cs="Arial"/>
                 <w:kern w:val="0"/>
                 <w:szCs w:val="22"/>
                 <w:lang w:val="es-CL" w:eastAsia="en-US" w:bidi="ar-SA"/>
@@ -453,7 +454,7 @@
             </w:pPr>
             <w:r>
               <w:rPr>
-                <w:rFonts w:eastAsia="Arial" w:cs=""/>
+                <w:rFonts w:eastAsia="Arial" w:cs="Arial"/>
                 <w:b/>
                 <w:bCs/>
                 <w:kern w:val="0"/>
@@ -464,14 +465,14 @@
             </w:r>
             <w:r>
               <w:rPr>
-                <w:rFonts w:eastAsia="Arial" w:cs=""/>
+                <w:rFonts w:eastAsia="Arial" w:cs="Arial"/>
                 <w:b/>
                 <w:bCs/>
                 <w:kern w:val="0"/>
                 <w:szCs w:val="22"/>
                 <w:lang w:val="es-CL" w:eastAsia="en-US" w:bidi="ar-SA"/>
               </w:rPr>
-              <w:t>Yerko Cortes Baeza - Chirstopher Zuniga Maldonado</w:t>
+              <w:t>Yerko Cortes Baeza</w:t>
             </w:r>
           </w:p>
         </w:tc>
@@ -493,7 +494,7 @@
               <w:spacing w:lineRule="auto" w:line="240" w:before="120" w:after="0"/>
               <w:jc w:val="start"/>
               <w:rPr>
-                <w:rFonts w:eastAsia="Arial" w:cs=""/>
+                <w:rFonts w:eastAsia="Arial" w:cs="Arial"/>
                 <w:kern w:val="0"/>
                 <w:szCs w:val="22"/>
                 <w:lang w:val="es-CL" w:eastAsia="en-US" w:bidi="ar-SA"/>
@@ -501,7 +502,7 @@
             </w:pPr>
             <w:r>
               <w:rPr>
-                <w:rFonts w:eastAsia="Arial" w:cs=""/>
+                <w:rFonts w:eastAsia="Arial" w:cs="Arial"/>
                 <w:kern w:val="0"/>
                 <w:szCs w:val="22"/>
                 <w:lang w:val="es-CL" w:eastAsia="en-US" w:bidi="ar-SA"/>
@@ -512,6 +513,7 @@
       </w:tr>
       <w:tr>
         <w:trPr>
+          <w:tblHeader w:val="true"/>
           <w:trHeight w:val="531" w:hRule="atLeast"/>
         </w:trPr>
         <w:tc>
@@ -538,18 +540,18 @@
             </w:pPr>
             <w:r>
               <w:rPr>
-                <w:rFonts w:eastAsia="Arial" w:cs=""/>
+                <w:rFonts w:eastAsia="Arial" w:cs="Arial"/>
                 <w:b/>
                 <w:bCs/>
                 <w:kern w:val="0"/>
                 <w:szCs w:val="22"/>
                 <w:lang w:val="es-CL" w:eastAsia="en-US" w:bidi="ar-SA"/>
               </w:rPr>
-              <w:t>Asignatura:</w:t>
+              <w:t xml:space="preserve">Asignatura: </w:t>
             </w:r>
             <w:r>
               <w:rPr>
-                <w:rFonts w:eastAsia="Arial" w:cs=""/>
+                <w:rFonts w:eastAsia="Arial" w:cs="Arial"/>
                 <w:b/>
                 <w:bCs/>
                 <w:kern w:val="0"/>
@@ -584,7 +586,7 @@
             </w:pPr>
             <w:r>
               <w:rPr>
-                <w:rFonts w:eastAsia="Arial" w:cs=""/>
+                <w:rFonts w:eastAsia="Arial" w:cs="Arial"/>
                 <w:b/>
                 <w:bCs/>
                 <w:kern w:val="0"/>
@@ -595,20 +597,21 @@
             </w:r>
             <w:r>
               <w:rPr>
-                <w:rFonts w:eastAsia="Arial" w:cs=""/>
+                <w:rFonts w:eastAsia="Arial" w:cs="Arial"/>
                 <w:b/>
                 <w:bCs/>
                 <w:kern w:val="0"/>
                 <w:szCs w:val="22"/>
                 <w:lang w:val="es-CL" w:eastAsia="en-US" w:bidi="ar-SA"/>
               </w:rPr>
-              <w:t>Analista Programador Computacional</w:t>
+              <w:t>Analista programador computacional</w:t>
             </w:r>
           </w:p>
         </w:tc>
       </w:tr>
       <w:tr>
         <w:trPr>
+          <w:tblHeader w:val="true"/>
           <w:trHeight w:val="536" w:hRule="atLeast"/>
         </w:trPr>
         <w:tc>
@@ -629,7 +632,7 @@
               <w:spacing w:lineRule="auto" w:line="240" w:before="120" w:after="0"/>
               <w:jc w:val="start"/>
               <w:rPr>
-                <w:rFonts w:eastAsia="Arial" w:cs=""/>
+                <w:rFonts w:eastAsia="Arial" w:cs="Arial"/>
                 <w:kern w:val="0"/>
                 <w:szCs w:val="22"/>
                 <w:lang w:val="es-CL" w:eastAsia="en-US" w:bidi="ar-SA"/>
@@ -637,25 +640,25 @@
             </w:pPr>
             <w:r>
               <w:rPr>
-                <w:rFonts w:eastAsia="Arial" w:cs=""/>
+                <w:rFonts w:eastAsia="Arial" w:cs="Arial"/>
                 <w:b/>
                 <w:bCs/>
                 <w:kern w:val="0"/>
                 <w:szCs w:val="22"/>
                 <w:lang w:val="es-CL" w:eastAsia="en-US" w:bidi="ar-SA"/>
               </w:rPr>
-              <w:t xml:space="preserve">Profesor: </w:t>
+              <w:t>Profesor:</w:t>
             </w:r>
             <w:r>
               <w:rPr>
-                <w:rFonts w:eastAsia="Arial" w:cs=""/>
+                <w:rFonts w:eastAsia="Arial" w:cs="Arial"/>
                 <w:b/>
                 <w:bCs/>
                 <w:kern w:val="0"/>
                 <w:szCs w:val="22"/>
                 <w:lang w:val="es-CL" w:eastAsia="en-US" w:bidi="ar-SA"/>
               </w:rPr>
-              <w:t>Armando Romero</w:t>
+              <w:t>Armando Romero Muñoz</w:t>
             </w:r>
           </w:p>
         </w:tc>
@@ -677,7 +680,7 @@
               <w:spacing w:lineRule="auto" w:line="240" w:before="120" w:after="0"/>
               <w:jc w:val="start"/>
               <w:rPr>
-                <w:rFonts w:eastAsia="Arial" w:cs=""/>
+                <w:rFonts w:eastAsia="Arial" w:cs="Arial"/>
                 <w:kern w:val="0"/>
                 <w:szCs w:val="22"/>
                 <w:lang w:val="es-CL" w:eastAsia="en-US" w:bidi="ar-SA"/>
@@ -685,25 +688,25 @@
             </w:pPr>
             <w:r>
               <w:rPr>
-                <w:rFonts w:eastAsia="Arial" w:cs=""/>
+                <w:rFonts w:eastAsia="Arial" w:cs="Arial"/>
                 <w:b/>
                 <w:bCs/>
                 <w:kern w:val="0"/>
                 <w:szCs w:val="22"/>
                 <w:lang w:val="es-CL" w:eastAsia="en-US" w:bidi="ar-SA"/>
               </w:rPr>
-              <w:t xml:space="preserve">Fecha: </w:t>
+              <w:t>Fecha:</w:t>
             </w:r>
             <w:r>
               <w:rPr>
-                <w:rFonts w:eastAsia="Arial" w:cs=""/>
+                <w:rFonts w:eastAsia="Arial" w:cs="Arial"/>
                 <w:b/>
                 <w:bCs/>
                 <w:kern w:val="0"/>
                 <w:szCs w:val="22"/>
                 <w:lang w:val="es-CL" w:eastAsia="en-US" w:bidi="ar-SA"/>
               </w:rPr>
-              <w:t>24-08-2026</w:t>
+              <w:t>31-08-2026</w:t>
             </w:r>
           </w:p>
         </w:tc>
@@ -739,7 +742,182 @@
       </w:pPr>
       <w:r>
         <w:rPr/>
-        <w:t>En esta segunda semana, realizarás una actividad formativa en pareja llamada "Representando procesos de Modelamiento Entidad-Relación (MER)”, en donde como parte del objetivo de diseñar un modelo conceptual de datos para la representación de información, te invitamos a desarrollar un Modelo Entidad-Relación (MER) basado en un caso práctico, que dará continuidad al trabajo realizado en la primera semana. En esta actividad, será necesario que:</w:t>
+        <w:t>En esta tercera semana, realizarás una actividad sumativa individual llamada "Modelando jerarquía entre entidades", donde deberás dar solución al caso de negocio planteado, desarrollando un Modelo Entidad-Relación-Extendido (MER-E) basado en un contexto de la vida real. En esta actividad, será necesario que:</w:t>
+      </w:r>
+    </w:p>
+    <w:p>
+      <w:pPr>
+        <w:pStyle w:val="ListParagraph"/>
+        <w:numPr>
+          <w:ilvl w:val="0"/>
+          <w:numId w:val="4"/>
+        </w:numPr>
+        <w:rPr/>
+      </w:pPr>
+      <w:r>
+        <w:rPr/>
+        <w:t>Identifiques todas las entidades, los supertipos y subtipos con sus atributos identificadores, atributos obligatorios y opcionales.</w:t>
+      </w:r>
+    </w:p>
+    <w:p>
+      <w:pPr>
+        <w:pStyle w:val="ListParagraph"/>
+        <w:numPr>
+          <w:ilvl w:val="0"/>
+          <w:numId w:val="4"/>
+        </w:numPr>
+        <w:rPr/>
+      </w:pPr>
+      <w:r>
+        <w:rPr/>
+        <w:t>Identifiques las relaciones entre las entidades.</w:t>
+      </w:r>
+    </w:p>
+    <w:p>
+      <w:pPr>
+        <w:pStyle w:val="ListParagraph"/>
+        <w:numPr>
+          <w:ilvl w:val="0"/>
+          <w:numId w:val="4"/>
+        </w:numPr>
+        <w:rPr/>
+      </w:pPr>
+      <w:r>
+        <w:rPr/>
+        <w:t xml:space="preserve">Analices y determines los tipos de datos más </w:t>
+      </w:r>
+      <w:r>
+        <w:rPr>
+          <w:u w:val="none"/>
+        </w:rPr>
+        <w:t>adecuados</w:t>
+      </w:r>
+      <w:r>
+        <w:rPr/>
+        <w:t xml:space="preserve"> para cada atributo, así como su dominio. </w:t>
+      </w:r>
+    </w:p>
+    <w:p>
+      <w:pPr>
+        <w:pStyle w:val="Normal"/>
+        <w:rPr/>
+      </w:pPr>
+      <w:r>
+        <w:rPr/>
+      </w:r>
+    </w:p>
+    <w:p>
+      <w:pPr>
+        <w:pStyle w:val="Heading2"/>
+        <w:rPr/>
+      </w:pPr>
+      <w:r>
+        <w:rPr/>
+        <w:t>Instrucciones específicas</w:t>
+      </w:r>
+    </w:p>
+    <w:p>
+      <w:pPr>
+        <w:pStyle w:val="Normal"/>
+        <w:rPr/>
+      </w:pPr>
+      <w:r>
+        <w:rPr/>
+        <w:t>Para llevar a cabo la actividad sumativa de la semana, a continuación te presentaremos el</w:t>
+        <w:br/>
+        <w:t>contexto de negocio que deberás analizar en detalle:</w:t>
+      </w:r>
+    </w:p>
+    <w:p>
+      <w:pPr>
+        <w:pStyle w:val="Normal"/>
+        <w:rPr>
+          <w:rStyle w:val="Ttulo3Car"/>
+        </w:rPr>
+      </w:pPr>
+      <w:r>
+        <w:rPr>
+          <w:rStyle w:val="Ttulo3Car"/>
+        </w:rPr>
+        <w:t xml:space="preserve">CONTEXTO CASO: Compañía HiLogic Solutions </w:t>
+      </w:r>
+    </w:p>
+    <w:p>
+      <w:pPr>
+        <w:pStyle w:val="Normal"/>
+        <w:rPr>
+          <w:lang w:val="es-MX"/>
+        </w:rPr>
+      </w:pPr>
+      <w:r>
+        <w:rPr>
+          <w:lang w:val="es-MX"/>
+        </w:rPr>
+        <w:t xml:space="preserve">HiLogic Solutions es una empresa especializada en la comercialización de productos y servicios tecnológicos, con el objetivo de satisfacer las necesidades tanto de empresas como de consumidores individuales. En un mercado caracterizado por la constante innovación, HiLogic se ha consolidado como un actor clave, ofreciendo soluciones tecnológicas avanzadas en áreas como hardware, dispositivos móviles y equipos de comunicación. </w:t>
+      </w:r>
+    </w:p>
+    <w:p>
+      <w:pPr>
+        <w:pStyle w:val="Normal"/>
+        <w:rPr/>
+      </w:pPr>
+      <w:r>
+        <w:rPr>
+          <w:lang w:val="es-MX"/>
+        </w:rPr>
+        <w:t>Actualmente la empresa ofrece una variedad de productos de tecnología a un muy buen precio, tales como: PC, teléfonos celulares, módems, notebooks, impresoras, dispositivos tecnológicos, y una variedad de accesorios, que ofrece en ocho sucursales ubicadas estratégicamente.  Existe la posibilidad de abrir cinco nuevas sucursales en los próximos años.</w:t>
+      </w:r>
+      <w:r>
+        <w:rPr/>
+        <w:t xml:space="preserve"> </w:t>
+      </w:r>
+      <w:r>
+        <w:br w:type="page"/>
+      </w:r>
+    </w:p>
+    <w:p>
+      <w:pPr>
+        <w:pStyle w:val="Normal"/>
+        <w:spacing w:before="0" w:after="160"/>
+        <w:rPr/>
+      </w:pPr>
+      <w:r>
+        <w:rPr>
+          <w:lang w:val="es-MX"/>
+        </w:rPr>
+        <w:t>En los últimos periodos de facturación, la compañía ha enfrentado diversos problemas relacionados con la cuadratura de los ingresos por ventas y en las comisiones asociadas a ventas que eventualmente se asignan a vendedores y supervisores contratados. Por este motivo, ha decidido recopilar la información relevante para implementar una base de datos de calidad en el corto plazo.</w:t>
+      </w:r>
+    </w:p>
+    <w:p>
+      <w:pPr>
+        <w:pStyle w:val="Normal"/>
+        <w:rPr>
+          <w:lang w:val="es-MX"/>
+        </w:rPr>
+      </w:pPr>
+      <w:r>
+        <w:rPr>
+          <w:lang w:val="es-MX"/>
+        </w:rPr>
+        <w:t>Para esta fase del desarrollo, se solicita la generación del modelo Entidad-Relación Extendido (MER-E), según los requisitos de negocio detallados a continuación.</w:t>
+      </w:r>
+    </w:p>
+    <w:p>
+      <w:pPr>
+        <w:pStyle w:val="Normal"/>
+        <w:rPr>
+          <w:b/>
+          <w:bCs/>
+          <w:lang w:val="es-MX"/>
+        </w:rPr>
+      </w:pPr>
+      <w:r>
+        <w:rPr>
+          <w:b/>
+          <w:bCs/>
+          <w:lang w:val="es-MX"/>
+        </w:rPr>
+        <w:t>Reglas de negocio:</w:t>
       </w:r>
     </w:p>
     <w:p>
@@ -749,11 +927,15 @@
           <w:ilvl w:val="0"/>
           <w:numId w:val="3"/>
         </w:numPr>
-        <w:rPr/>
-      </w:pPr>
-      <w:r>
-        <w:rPr/>
-        <w:t>Identifiques todas las entidades, con sus atributos identificadores, atributos obligatorios y opcionales.</w:t>
+        <w:rPr>
+          <w:lang w:val="es-MX"/>
+        </w:rPr>
+      </w:pPr>
+      <w:r>
+        <w:rPr>
+          <w:lang w:val="es-MX"/>
+        </w:rPr>
+        <w:t>La compañía tiene 8 sucursales ubicadas en distintas comunas. De las sucursales se requiere almacenar el “número de sucursal” que identifique a cada una de ellas, el nombre y la dirección completa. El nombre de la sucursal no puede repetirse en la base de datos.</w:t>
       </w:r>
     </w:p>
     <w:p>
@@ -763,11 +945,15 @@
           <w:ilvl w:val="0"/>
           <w:numId w:val="3"/>
         </w:numPr>
-        <w:rPr/>
-      </w:pPr>
-      <w:r>
-        <w:rPr/>
-        <w:t>Identifiques las relaciones entre las entidades.</w:t>
+        <w:rPr>
+          <w:lang w:val="es-MX"/>
+        </w:rPr>
+      </w:pPr>
+      <w:r>
+        <w:rPr>
+          <w:lang w:val="es-MX"/>
+        </w:rPr>
+        <w:t>La compañía vende diferentes productos que se identifican por un código numérico, una descripción, un valor (precio unitario que puede estar entre los 2 mil pesos hasta los 5 millones de pesos), marca del producto y el stock disponible en la bodega. La cantidad de productos en bodega no puede superar las 3.000 unidades.</w:t>
       </w:r>
     </w:p>
     <w:p>
@@ -777,81 +963,15 @@
           <w:ilvl w:val="0"/>
           <w:numId w:val="3"/>
         </w:numPr>
-        <w:rPr/>
-      </w:pPr>
-      <w:r>
-        <w:rPr/>
-        <w:t xml:space="preserve">Analices y determines los tipos de datos más adecuados para cada atributo, así como su dominio. </w:t>
-      </w:r>
-    </w:p>
-    <w:p>
-      <w:pPr>
-        <w:pStyle w:val="Heading2"/>
-        <w:rPr/>
-      </w:pPr>
-      <w:r>
-        <w:rPr/>
-        <w:t>Instrucciones específicas</w:t>
-      </w:r>
-    </w:p>
-    <w:p>
-      <w:pPr>
-        <w:pStyle w:val="Normal"/>
-        <w:rPr/>
-      </w:pPr>
-      <w:r>
-        <w:rPr/>
-        <w:t>A continuación, se presenta el contexto de negocio que ya conoces de la actividad previa (semana 1), pero con un mayor nivel de detalle en esta fase. El propósito es que puedas diseñar el modelo conceptual: MER (Modelo Entidad-Relación).</w:t>
-      </w:r>
-    </w:p>
-    <w:p>
-      <w:pPr>
-        <w:pStyle w:val="Heading3"/>
-        <w:rPr/>
-      </w:pPr>
-      <w:r>
-        <w:rPr/>
-        <w:t>Contexto de negocio: Línea aérea BT&amp;Airways</w:t>
-      </w:r>
-    </w:p>
-    <w:p>
-      <w:pPr>
-        <w:pStyle w:val="Normal"/>
-        <w:rPr/>
-      </w:pPr>
-      <w:r>
-        <w:rPr/>
-        <w:t xml:space="preserve">Se te ha asignado la tarea de brindar asesoría a la aerolínea BT&amp;Airways, que lleva más de 25 años operando en el mercado de transporte de pasajeros a nivel global. En los últimos 10 años, la compañía ha experimentado un crecimiento significativo, pero ha enfrentado diversos problemas en sus plataformas de TI, especialmente en el módulo destinado al registro de la venta de vuelos. Actualmente, se manejan aproximadamente 35 mil vuelos, y se estima que este número podría triplicarse en los próximos años. Debido a esto, la empresa ha decidido recopilar toda la información relevante para implementar una base de datos de calidad óptima a largo plazo. </w:t>
-      </w:r>
-    </w:p>
-    <w:p>
-      <w:pPr>
-        <w:pStyle w:val="Normal"/>
-        <w:rPr/>
-      </w:pPr>
-      <w:r>
-        <w:rPr/>
-        <w:t xml:space="preserve">En esta etapa, se solicita que generes el modelo entidad-relación (MER), según las especificaciones detalladas a continuación. </w:t>
-      </w:r>
-      <w:r>
-        <w:br w:type="page"/>
-      </w:r>
-    </w:p>
-    <w:p>
-      <w:pPr>
-        <w:pStyle w:val="Normal"/>
-        <w:spacing w:before="0" w:after="160"/>
-        <w:rPr>
-          <w:b/>
-          <w:bCs/>
-        </w:rPr>
-      </w:pPr>
-      <w:r>
-        <w:rPr>
-          <w:b/>
-          <w:bCs/>
-        </w:rPr>
-        <w:t>Reglas de negocio:</w:t>
+        <w:rPr>
+          <w:lang w:val="es-MX"/>
+        </w:rPr>
+      </w:pPr>
+      <w:r>
+        <w:rPr>
+          <w:lang w:val="es-MX"/>
+        </w:rPr>
+        <w:t>Los clientes pueden adquirir del orden de 5.000 productos distintos en cualquiera de las sucursales disponibles.</w:t>
       </w:r>
     </w:p>
     <w:p>
@@ -859,9 +979,8 @@
         <w:pStyle w:val="ListParagraph"/>
         <w:numPr>
           <w:ilvl w:val="0"/>
-          <w:numId w:val="1"/>
+          <w:numId w:val="3"/>
         </w:numPr>
-        <w:ind w:hanging="360" w:start="360"/>
         <w:rPr>
           <w:lang w:val="es-MX"/>
         </w:rPr>
@@ -870,22 +989,101 @@
         <w:rPr>
           <w:lang w:val="es-MX"/>
         </w:rPr>
-        <w:t xml:space="preserve">La compañía se dedica al transporte de pasajeros a diferentes destinos, y para llevar a los pasajeros a su destino, se deben vender pasajes de avión, que por simplicidad denominaremos </w:t>
-      </w:r>
-      <w:r>
-        <w:rPr>
-          <w:b/>
-          <w:bCs/>
-          <w:shd w:fill="729FCF" w:val="clear"/>
+        <w:t>Cuando el cliente realiza una compra el vendedor le debe emitir una boleta con el siguiente detalle: número de boleta, fecha de boleta, monto de venta, cantidad de productos.</w:t>
+      </w:r>
+    </w:p>
+    <w:p>
+      <w:pPr>
+        <w:pStyle w:val="ListParagraph"/>
+        <w:numPr>
+          <w:ilvl w:val="0"/>
+          <w:numId w:val="3"/>
+        </w:numPr>
+        <w:rPr>
           <w:lang w:val="es-MX"/>
         </w:rPr>
-        <w:t>vuelos</w:t>
-      </w:r>
+      </w:pPr>
       <w:r>
         <w:rPr>
           <w:lang w:val="es-MX"/>
         </w:rPr>
-        <w:t>. A continuación, se presenta una imagen del vuelo N°567890).</w:t>
+        <w:t>Con el tiempo, los clientes acumulan puntos en función de las compras realizadas, lo que permite clasificar a dos tipos de clientes. Según el puntaje acumulado, se identifica al Cliente VIP, quien recibirá un porcentaje de descuento (entre 1% y 99.9%) en futuras compras. Por otro lado, los clientes Normales recibirán un descuento fijo en pesos, que se aplicará en la siguiente compra y tendrá un límite máximo de 20.000 pesos.</w:t>
+      </w:r>
+      <w:r>
+        <w:rPr/>
+        <w:t xml:space="preserve"> </w:t>
+      </w:r>
+    </w:p>
+    <w:p>
+      <w:pPr>
+        <w:pStyle w:val="ListParagraph"/>
+        <w:numPr>
+          <w:ilvl w:val="0"/>
+          <w:numId w:val="3"/>
+        </w:numPr>
+        <w:rPr>
+          <w:lang w:val="es-MX"/>
+        </w:rPr>
+      </w:pPr>
+      <w:r>
+        <w:rPr>
+          <w:lang w:val="es-MX"/>
+        </w:rPr>
+        <w:t>Los trabajadores contratados pueden tener un sólo cargo en la empresa, tales como:  administrativo, gerente, supervisor, jefe de área, vendedores, etc.   Debe registrarse en el contrato a qué sucursal pertenecerán, que es parte de la identificación de contrato. No se debe permitir que un trabajador se cambie de sucursal, debe permanecer en la sucursal que lo contrató.</w:t>
+      </w:r>
+    </w:p>
+    <w:p>
+      <w:pPr>
+        <w:pStyle w:val="ListParagraph"/>
+        <w:numPr>
+          <w:ilvl w:val="0"/>
+          <w:numId w:val="3"/>
+        </w:numPr>
+        <w:rPr>
+          <w:lang w:val="es-MX"/>
+        </w:rPr>
+      </w:pPr>
+      <w:r>
+        <w:rPr>
+          <w:lang w:val="es-MX"/>
+        </w:rPr>
+        <w:t>Existe un listado de quince cargos en la empresa tipificados con código numérico y una descripción. Se sabe que hay cargos aún no han sido asignados.</w:t>
+      </w:r>
+    </w:p>
+    <w:p>
+      <w:pPr>
+        <w:pStyle w:val="ListParagraph"/>
+        <w:numPr>
+          <w:ilvl w:val="0"/>
+          <w:numId w:val="3"/>
+        </w:numPr>
+        <w:rPr>
+          <w:lang w:val="es-MX"/>
+        </w:rPr>
+      </w:pPr>
+      <w:r>
+        <w:rPr>
+          <w:lang w:val="es-MX"/>
+        </w:rPr>
+        <w:t>Está la posibilidad que un trabajador sea recontratado por la compañía en otra fecha posterior y en otra sucursal, para lo que habría que realizar un nuevo contrato.</w:t>
+      </w:r>
+    </w:p>
+    <w:p>
+      <w:pPr>
+        <w:pStyle w:val="ListParagraph"/>
+        <w:numPr>
+          <w:ilvl w:val="0"/>
+          <w:numId w:val="3"/>
+        </w:numPr>
+        <w:rPr>
+          <w:lang w:val="es-MX"/>
+        </w:rPr>
+      </w:pPr>
+      <w:r>
+        <w:rPr>
+          <w:lang w:val="es-MX"/>
+        </w:rPr>
+        <w:t>La empresa en los últimos años está recibiendo alumnos pasantes para capacitarlos en ventas, a los que se le realiza un contrato diferente al resto de los trabajadores con contrato indefinido (ver vista de usuario).  Por ejemplo: los practicantes pueden o no tener un cargo asignado, en cambio a los trabajadores con contrato indefinido se les debe registrar un cargo, una AFP, y un sistema de salud. Revisa en detalle la siguiente vista de usuario, para observar las diferencias contractuales.</w:t>
       </w:r>
     </w:p>
     <w:p>
@@ -923,7 +1121,7 @@
           <w:iCs/>
           <w:lang w:val="es-MX"/>
         </w:rPr>
-        <w:t>Ejemplo de un boleto de avión con detalles de pasajero y vuelo (vista de usuario 1)</w:t>
+        <w:t>Vista de usuario: los espacios que no se rellenaron son optativos</w:t>
       </w:r>
     </w:p>
     <w:p>
@@ -938,9 +1136,9 @@
         <w:rPr/>
         <w:drawing>
           <wp:inline distT="0" distB="0" distL="0" distR="0">
-            <wp:extent cx="6238240" cy="2162810"/>
+            <wp:extent cx="5913755" cy="3246755"/>
             <wp:effectExtent l="0" t="0" r="0" b="0"/>
-            <wp:docPr id="5" name="Imagen 361874288" descr="La figura ilustra un boleto de avión que contiene información clave para el pasajero, incluyendo el nombre del viajero (Juan Ordoñez Barrios), el origen y destino del vuelo (Santiago - SCL a Buenos Aires - EZE), la fecha y hora de salida (10 de enero de 2025, 13:00), el número de asiento (21A) y el número de vuelo (567890). Este diseño simula un formato estándar utilizado en el sector aeronáutico, incorporando códigos de barras para validación y control del embarque."/>
+            <wp:docPr id="5" name="Imagen 940319334" descr="Esta figura muestra el modelo relacional que conecta la entidad Cheque con la entidad Persona mediante una relación de emisión. Cada cheque, identificado por su id_cheque, tiene atributos como fecha_emision y monto. En el caso de los espacios no rellenados, estos se consideran optativos y no afectan el flujo general del modelo. Una persona, representada con su rut_persona, dv_persona y nom_persona, puede emitir uno o más cheques. "/>
             <wp:cNvGraphicFramePr>
               <a:graphicFrameLocks xmlns:a="http://schemas.openxmlformats.org/drawingml/2006/main" noChangeAspect="1"/>
             </wp:cNvGraphicFramePr>
@@ -948,7 +1146,7 @@
               <a:graphicData uri="http://schemas.openxmlformats.org/drawingml/2006/picture">
                 <pic:pic xmlns:pic="http://schemas.openxmlformats.org/drawingml/2006/picture">
                   <pic:nvPicPr>
-                    <pic:cNvPr id="5" name="Imagen 361874288" descr="La figura ilustra un boleto de avión que contiene información clave para el pasajero, incluyendo el nombre del viajero (Juan Ordoñez Barrios), el origen y destino del vuelo (Santiago - SCL a Buenos Aires - EZE), la fecha y hora de salida (10 de enero de 2025, 13:00), el número de asiento (21A) y el número de vuelo (567890). Este diseño simula un formato estándar utilizado en el sector aeronáutico, incorporando códigos de barras para validación y control del embarque."/>
+                    <pic:cNvPr id="5" name="Imagen 940319334" descr="Esta figura muestra el modelo relacional que conecta la entidad Cheque con la entidad Persona mediante una relación de emisión. Cada cheque, identificado por su id_cheque, tiene atributos como fecha_emision y monto. En el caso de los espacios no rellenados, estos se consideran optativos y no afectan el flujo general del modelo. Una persona, representada con su rut_persona, dv_persona y nom_persona, puede emitir uno o más cheques. "/>
                     <pic:cNvPicPr>
                       <a:picLocks noChangeAspect="1" noChangeArrowheads="1"/>
                     </pic:cNvPicPr>
@@ -962,7 +1160,7 @@
                   <pic:spPr bwMode="auto">
                     <a:xfrm>
                       <a:off x="0" y="0"/>
-                      <a:ext cx="6238240" cy="2162810"/>
+                      <a:ext cx="5913755" cy="3246755"/>
                     </a:xfrm>
                     <a:prstGeom prst="rect">
                       <a:avLst/>
@@ -985,375 +1183,21 @@
         <w:rPr>
           <w:i/>
           <w:iCs/>
-          <w:lang w:val="es-MX"/>
         </w:rPr>
         <w:t>Nota.</w:t>
       </w:r>
       <w:r>
-        <w:rPr>
-          <w:lang w:val="es-MX"/>
-        </w:rPr>
-        <w:t xml:space="preserve"> </w:t>
-      </w:r>
-      <w:r>
-        <w:rPr/>
-        <w:t xml:space="preserve">La figura ilustra un boleto de avión que contiene información clave para el pasajero. </w:t>
-      </w:r>
-    </w:p>
-    <w:p>
-      <w:pPr>
-        <w:pStyle w:val="Normal"/>
-        <w:rPr>
-          <w:lang w:val="es-MX"/>
-        </w:rPr>
-      </w:pPr>
-      <w:r>
-        <w:rPr>
-          <w:lang w:val="es-MX"/>
-        </w:rPr>
-      </w:r>
-    </w:p>
-    <w:p>
-      <w:pPr>
-        <w:pStyle w:val="ListParagraph"/>
-        <w:numPr>
-          <w:ilvl w:val="0"/>
-          <w:numId w:val="1"/>
-        </w:numPr>
-        <w:ind w:hanging="360" w:start="360"/>
-        <w:rPr>
-          <w:lang w:val="es-MX"/>
-        </w:rPr>
-      </w:pPr>
-      <w:r>
-        <w:rPr>
-          <w:lang w:val="es-MX"/>
-        </w:rPr>
-        <w:t xml:space="preserve">La línea área dispone de una flota de 25 aviones. Para cada </w:t>
-      </w:r>
-      <w:r>
-        <w:rPr>
-          <w:shd w:fill="729FCF" w:val="clear"/>
-          <w:lang w:val="es-MX"/>
-        </w:rPr>
-        <w:t>avión</w:t>
-      </w:r>
-      <w:r>
-        <w:rPr>
-          <w:lang w:val="es-MX"/>
-        </w:rPr>
-        <w:t xml:space="preserve"> existe una </w:t>
-      </w:r>
-      <w:r>
-        <w:rPr>
-          <w:shd w:fill="EC9BA4" w:val="clear"/>
-          <w:lang w:val="es-MX"/>
-        </w:rPr>
-        <w:t>matrícula numérica que es única, la marca y el modelo de la aeronave, y la capacidad</w:t>
-      </w:r>
-      <w:r>
-        <w:rPr>
-          <w:lang w:val="es-MX"/>
-        </w:rPr>
-        <w:t xml:space="preserve"> (que va desde los 200 a los 800 asientos).</w:t>
-      </w:r>
-    </w:p>
-    <w:p>
-      <w:pPr>
-        <w:pStyle w:val="ListParagraph"/>
-        <w:numPr>
-          <w:ilvl w:val="0"/>
-          <w:numId w:val="1"/>
-        </w:numPr>
-        <w:ind w:hanging="360" w:start="360"/>
-        <w:rPr>
-          <w:lang w:val="es-MX"/>
-        </w:rPr>
-      </w:pPr>
-      <w:r>
-        <w:rPr>
-          <w:lang w:val="es-MX"/>
-        </w:rPr>
-        <w:t xml:space="preserve">Cuando un pasajero realiza una </w:t>
-      </w:r>
-      <w:r>
-        <w:rPr>
-          <w:shd w:fill="729FCF" w:val="clear"/>
-          <w:lang w:val="es-MX"/>
-        </w:rPr>
-        <w:t>reserva</w:t>
-      </w:r>
-      <w:r>
-        <w:rPr>
-          <w:lang w:val="es-MX"/>
-        </w:rPr>
-        <w:t xml:space="preserve"> del vuelo, se debe registrar un </w:t>
-      </w:r>
-      <w:r>
-        <w:rPr>
-          <w:shd w:fill="EC9BA4" w:val="clear"/>
-          <w:lang w:val="es-MX"/>
-        </w:rPr>
-        <w:t>número de reserva, la fecha reserva de la reserva, la fecha del viaje, el asiento del vuelo seleccionado (en caso de que se seleccione al hacer la reserva) y el estado (que puede ser confirmado o nula)</w:t>
-      </w:r>
-      <w:r>
-        <w:rPr>
-          <w:lang w:val="es-MX"/>
-        </w:rPr>
-        <w:t xml:space="preserve">. Un pasajero puede reservar y viajar en más de una oportunidad, y cada reserva le corresponde a único pasajero. </w:t>
-      </w:r>
-    </w:p>
-    <w:p>
-      <w:pPr>
-        <w:pStyle w:val="ListParagraph"/>
-        <w:numPr>
-          <w:ilvl w:val="0"/>
-          <w:numId w:val="1"/>
-        </w:numPr>
-        <w:ind w:hanging="360" w:start="360"/>
-        <w:rPr>
-          <w:lang w:val="es-MX"/>
-        </w:rPr>
-      </w:pPr>
-      <w:r>
-        <w:rPr>
-          <w:lang w:val="es-MX"/>
-        </w:rPr>
-        <w:t>En ocasiones puede ocurrir que un pasajero no confirme la reserva.</w:t>
-      </w:r>
-    </w:p>
-    <w:p>
-      <w:pPr>
-        <w:pStyle w:val="ListParagraph"/>
-        <w:numPr>
-          <w:ilvl w:val="0"/>
-          <w:numId w:val="1"/>
-        </w:numPr>
-        <w:ind w:hanging="360" w:start="360"/>
-        <w:rPr>
-          <w:lang w:val="es-MX"/>
-        </w:rPr>
-      </w:pPr>
-      <w:r>
-        <w:rPr>
-          <w:lang w:val="es-MX"/>
-        </w:rPr>
-        <w:t>En un vuelo como mínimo debe existir un pasajero y podrían viajar de acuerdo con la capacidad de cada avión.</w:t>
-      </w:r>
-    </w:p>
-    <w:p>
-      <w:pPr>
-        <w:pStyle w:val="ListParagraph"/>
-        <w:numPr>
-          <w:ilvl w:val="0"/>
-          <w:numId w:val="1"/>
-        </w:numPr>
-        <w:ind w:hanging="360" w:start="360"/>
-        <w:rPr>
-          <w:lang w:val="es-MX"/>
-        </w:rPr>
-      </w:pPr>
-      <w:r>
-        <w:rPr>
-          <w:lang w:val="es-MX"/>
-        </w:rPr>
-        <w:t>Cada vuelo está asociada a un sólo avión, pero el mismo avión puede volar muchas veces.</w:t>
-      </w:r>
-    </w:p>
-    <w:p>
-      <w:pPr>
-        <w:pStyle w:val="ListParagraph"/>
-        <w:numPr>
-          <w:ilvl w:val="0"/>
-          <w:numId w:val="1"/>
-        </w:numPr>
-        <w:ind w:hanging="360" w:start="360"/>
-        <w:rPr>
-          <w:lang w:val="es-MX"/>
-        </w:rPr>
-      </w:pPr>
-      <w:r>
-        <w:rPr>
-          <w:lang w:val="es-MX"/>
-        </w:rPr>
-        <w:t>Un empleado administrativo de la compañía atenderá al pasajero y, a través del sistema, le asignará un número de vuelo. La compañía tiene 450 empleados de los que se registra: RUT, nombre completo, dirección, sueldo base, fecha de ingreso a la compañía, género (M, F, O), teléfono móvil y algún teléfono de contacto si es que lo posee.</w:t>
-      </w:r>
-    </w:p>
-    <w:p>
-      <w:pPr>
-        <w:pStyle w:val="ListParagraph"/>
-        <w:numPr>
-          <w:ilvl w:val="0"/>
-          <w:numId w:val="1"/>
-        </w:numPr>
-        <w:ind w:hanging="360" w:start="360"/>
-        <w:rPr>
-          <w:lang w:val="es-MX"/>
-        </w:rPr>
-      </w:pPr>
-      <w:r>
-        <w:rPr>
-          <w:lang w:val="es-MX"/>
-        </w:rPr>
-        <w:t>Un empleado puede ser piloto o administrativo, y conviene registrar esta característica. Para los pilotos se debe registrar además la cantidad de horas de vuelos acumuladas y la AFP a la que pertenece. En cambio, para los empleados administrativos se debe registrar la cantidad de horas extras y la AFP a la que se afiliaron.</w:t>
-      </w:r>
-    </w:p>
-    <w:p>
-      <w:pPr>
-        <w:pStyle w:val="ListParagraph"/>
-        <w:numPr>
-          <w:ilvl w:val="0"/>
-          <w:numId w:val="1"/>
-        </w:numPr>
-        <w:ind w:hanging="360" w:start="360"/>
-        <w:rPr>
-          <w:lang w:val="es-MX"/>
-        </w:rPr>
-      </w:pPr>
-      <w:r>
-        <w:rPr>
-          <w:lang w:val="es-MX"/>
-        </w:rPr>
-        <w:t xml:space="preserve">De cada vuelo se requiere almacenar la siguiente información: </w:t>
-      </w:r>
-      <w:r>
-        <w:rPr>
-          <w:shd w:fill="EC9BA4" w:val="clear"/>
-          <w:lang w:val="es-MX"/>
-        </w:rPr>
-        <w:t>fecha de despegue, fecha de llegada al aeropuerto de destino, la ciudad destino, número de vuelo, hora salida del aeropuerto y la ciudad origen</w:t>
-      </w:r>
-      <w:r>
-        <w:rPr>
-          <w:lang w:val="es-MX"/>
-        </w:rPr>
-        <w:t xml:space="preserve">. Una reserva está siempre asociada a un único vuelo, pero el mismo lo pueden reservar muchos pasajeros. </w:t>
-      </w:r>
-    </w:p>
-    <w:p>
-      <w:pPr>
-        <w:pStyle w:val="ListParagraph"/>
-        <w:numPr>
-          <w:ilvl w:val="0"/>
-          <w:numId w:val="1"/>
-        </w:numPr>
-        <w:ind w:hanging="360" w:start="360"/>
-        <w:rPr>
-          <w:lang w:val="es-MX"/>
-        </w:rPr>
-      </w:pPr>
-      <w:r>
-        <w:rPr>
-          <w:lang w:val="es-MX"/>
-        </w:rPr>
-        <w:t xml:space="preserve">Para cada </w:t>
-      </w:r>
-      <w:r>
-        <w:rPr>
-          <w:shd w:fill="729FCF" w:val="clear"/>
-          <w:lang w:val="es-MX"/>
-        </w:rPr>
-        <w:t>pasajero</w:t>
-      </w:r>
-      <w:r>
-        <w:rPr>
-          <w:lang w:val="es-MX"/>
-        </w:rPr>
-        <w:t xml:space="preserve">, se requiere almacenar los siguientes datos: </w:t>
-      </w:r>
-      <w:r>
-        <w:rPr>
-          <w:shd w:fill="EC9BA4" w:val="clear"/>
-          <w:lang w:val="es-MX"/>
-        </w:rPr>
-        <w:t>número de pasaporte o cédula de identidad, nombre completo, fecha de nacimiento, nacionalidad, y un número de teléfono de contacto o correo electrónico (si es que la persona lo proporciona), y el equipaje asociado</w:t>
-      </w:r>
-      <w:r>
-        <w:rPr>
-          <w:lang w:val="es-MX"/>
-        </w:rPr>
-        <w:t>.</w:t>
-      </w:r>
-    </w:p>
-    <w:p>
-      <w:pPr>
-        <w:pStyle w:val="ListParagraph"/>
-        <w:numPr>
-          <w:ilvl w:val="0"/>
-          <w:numId w:val="1"/>
-        </w:numPr>
-        <w:ind w:hanging="360" w:start="360"/>
-        <w:rPr>
-          <w:lang w:val="es-MX"/>
-        </w:rPr>
-      </w:pPr>
-      <w:r>
-        <w:rPr>
-          <w:lang w:val="es-MX"/>
-        </w:rPr>
-        <w:t xml:space="preserve">Si un pasajero lleva </w:t>
-      </w:r>
-      <w:r>
-        <w:rPr>
-          <w:shd w:fill="729FCF" w:val="clear"/>
-          <w:lang w:val="es-MX"/>
-        </w:rPr>
-        <w:t>equipaje</w:t>
-      </w:r>
-      <w:r>
-        <w:rPr>
-          <w:lang w:val="es-MX"/>
-        </w:rPr>
-        <w:t xml:space="preserve">, éste se debe registrar al realizar la reserva mediante un </w:t>
-      </w:r>
-      <w:r>
-        <w:rPr>
-          <w:shd w:fill="EC9BA4" w:val="clear"/>
-          <w:lang w:val="es-MX"/>
-        </w:rPr>
-        <w:t>código, el color de la maleta, el peso y opcionalmente una descripción</w:t>
-      </w:r>
-      <w:r>
-        <w:rPr>
-          <w:lang w:val="es-MX"/>
-        </w:rPr>
-        <w:t>. El peso de la maleta se registra en kilogramos, por ejemplo: 25,9 kg. Es conveniente que el equipaje quede identificado por su dueño.</w:t>
-      </w:r>
-    </w:p>
-    <w:p>
-      <w:pPr>
-        <w:pStyle w:val="ListParagraph"/>
-        <w:numPr>
-          <w:ilvl w:val="0"/>
-          <w:numId w:val="1"/>
-        </w:numPr>
-        <w:ind w:hanging="360" w:start="360"/>
-        <w:rPr>
-          <w:lang w:val="es-MX"/>
-        </w:rPr>
-      </w:pPr>
-      <w:r>
-        <w:rPr>
-          <w:lang w:val="es-MX"/>
-        </w:rPr>
-        <w:t>Un equipaje puede estar asociado a varias reservas.  El pasajero puede incluir varias maletas (equipaje) en su reserva.  El equipaje debe estar etiquetado como tipo de embarque (prioritario o normal) y opcionalmente indicar si es frágil (Si).</w:t>
-      </w:r>
-    </w:p>
-    <w:p>
-      <w:pPr>
-        <w:pStyle w:val="Normal"/>
-        <w:numPr>
-          <w:ilvl w:val="0"/>
-          <w:numId w:val="4"/>
-        </w:numPr>
-        <w:rPr>
-          <w:lang w:val="es-MX"/>
-        </w:rPr>
-      </w:pPr>
-      <w:r>
-        <w:rPr>
-          <w:lang w:val="es-MX"/>
-        </w:rPr>
+        <w:rPr/>
+        <w:t xml:space="preserve"> La imagen muestra la vista de usuario de tipos de contratos.</w:t>
+      </w:r>
+    </w:p>
+    <w:p>
+      <w:pPr>
+        <w:pStyle w:val="Normal"/>
+        <w:rPr/>
+      </w:pPr>
+      <w:r>
+        <w:rPr/>
       </w:r>
       <w:r>
         <w:br w:type="page"/>
@@ -1484,14 +1328,14 @@
         <w:tblLook w:val="04a0" w:firstRow="1" w:noVBand="1" w:lastRow="0" w:firstColumn="1" w:lastColumn="0" w:noHBand="0"/>
       </w:tblPr>
       <w:tblGrid>
-        <w:gridCol w:w="4928"/>
-        <w:gridCol w:w="4985"/>
+        <w:gridCol w:w="5059"/>
+        <w:gridCol w:w="4854"/>
       </w:tblGrid>
       <w:tr>
         <w:trPr/>
         <w:tc>
           <w:tcPr>
-            <w:tcW w:w="4928" w:type="dxa"/>
+            <w:tcW w:w="5059" w:type="dxa"/>
             <w:tcBorders/>
           </w:tcPr>
           <w:p>
@@ -1501,14 +1345,14 @@
               <w:spacing w:before="120" w:after="120"/>
               <w:jc w:val="center"/>
               <w:rPr>
-                <w:rFonts w:eastAsia="Arial" w:cs=""/>
+                <w:rFonts w:eastAsia="Arial" w:cs="Arial"/>
                 <w:szCs w:val="22"/>
                 <w:lang w:val="es-CL" w:eastAsia="en-US" w:bidi="ar-SA"/>
               </w:rPr>
             </w:pPr>
             <w:r>
               <w:rPr>
-                <w:rFonts w:eastAsia="Arial" w:cs=""/>
+                <w:rFonts w:eastAsia="Arial" w:cs="Arial"/>
                 <w:szCs w:val="22"/>
                 <w:lang w:val="es-CL" w:eastAsia="en-US" w:bidi="ar-SA"/>
               </w:rPr>
@@ -1518,7 +1362,7 @@
         </w:tc>
         <w:tc>
           <w:tcPr>
-            <w:tcW w:w="4985" w:type="dxa"/>
+            <w:tcW w:w="4854" w:type="dxa"/>
             <w:tcBorders/>
           </w:tcPr>
           <w:p>
@@ -1528,14 +1372,14 @@
               <w:spacing w:before="120" w:after="120"/>
               <w:jc w:val="center"/>
               <w:rPr>
-                <w:rFonts w:eastAsia="Arial" w:cs=""/>
+                <w:rFonts w:eastAsia="Arial" w:cs="Arial"/>
                 <w:szCs w:val="22"/>
                 <w:lang w:val="es-CL" w:eastAsia="en-US" w:bidi="ar-SA"/>
               </w:rPr>
             </w:pPr>
             <w:r>
               <w:rPr>
-                <w:rFonts w:eastAsia="Arial" w:cs=""/>
+                <w:rFonts w:eastAsia="Arial" w:cs="Arial"/>
                 <w:szCs w:val="22"/>
                 <w:lang w:val="es-CL" w:eastAsia="en-US" w:bidi="ar-SA"/>
               </w:rPr>
@@ -1546,11 +1390,11 @@
       </w:tr>
       <w:tr>
         <w:trPr>
-          <w:trHeight w:val="4872" w:hRule="atLeast"/>
+          <w:trHeight w:val="5156" w:hRule="atLeast"/>
         </w:trPr>
         <w:tc>
           <w:tcPr>
-            <w:tcW w:w="4928" w:type="dxa"/>
+            <w:tcW w:w="5059" w:type="dxa"/>
             <w:tcBorders/>
           </w:tcPr>
           <w:p>
@@ -1566,100 +1410,12 @@
             </w:pPr>
             <w:r>
               <w:rPr>
-                <w:rFonts w:eastAsia="Arial" w:cs=""/>
+                <w:rFonts w:eastAsia="Arial" w:cs="Arial"/>
                 <w:szCs w:val="22"/>
                 <w:lang w:val="es-CL" w:eastAsia="en-US" w:bidi="ar-SA"/>
               </w:rPr>
-              <w:drawing>
-                <wp:inline distT="0" distB="0" distL="0" distR="0">
-                  <wp:extent cx="2976245" cy="2971800"/>
-                  <wp:effectExtent l="0" t="0" r="0" b="0"/>
-                  <wp:docPr id="6" name="Imagen3"/>
-                  <wp:cNvGraphicFramePr>
-                    <a:graphicFrameLocks xmlns:a="http://schemas.openxmlformats.org/drawingml/2006/main" noChangeAspect="1"/>
-                  </wp:cNvGraphicFramePr>
-                  <a:graphic xmlns:a="http://schemas.openxmlformats.org/drawingml/2006/main">
-                    <a:graphicData uri="http://schemas.openxmlformats.org/drawingml/2006/picture">
-                      <pic:pic xmlns:pic="http://schemas.openxmlformats.org/drawingml/2006/picture">
-                        <pic:nvPicPr>
-                          <pic:cNvPr id="6" name="Imagen3"/>
-                          <pic:cNvPicPr>
-                            <a:picLocks noChangeAspect="1" noChangeArrowheads="1"/>
-                          </pic:cNvPicPr>
-                        </pic:nvPicPr>
-                        <pic:blipFill>
-                          <a:blip r:embed="rId7"/>
-                          <a:stretch>
-                            <a:fillRect/>
-                          </a:stretch>
-                        </pic:blipFill>
-                        <pic:spPr bwMode="auto">
-                          <a:xfrm>
-                            <a:off x="0" y="0"/>
-                            <a:ext cx="2976245" cy="2971800"/>
-                          </a:xfrm>
-                          <a:prstGeom prst="rect">
-                            <a:avLst/>
-                          </a:prstGeom>
-                          <a:noFill/>
-                        </pic:spPr>
-                      </pic:pic>
-                    </a:graphicData>
-                  </a:graphic>
-                </wp:inline>
-              </w:drawing>
-            </w:r>
-          </w:p>
-          <w:p>
-            <w:pPr>
-              <w:pStyle w:val="Normal"/>
-              <w:widowControl/>
-              <w:spacing w:lineRule="auto" w:line="240" w:before="0" w:after="0"/>
-              <w:jc w:val="start"/>
-              <w:rPr>
-                <w:rFonts w:eastAsia="Arial" w:cs=""/>
-                <w:kern w:val="0"/>
-                <w:szCs w:val="22"/>
-                <w:lang w:val="es-CL" w:eastAsia="en-US" w:bidi="ar-SA"/>
-              </w:rPr>
-            </w:pPr>
-            <w:r>
-              <w:rPr>
-                <w:rFonts w:eastAsia="Arial" w:cs=""/>
-                <w:kern w:val="0"/>
-                <w:szCs w:val="22"/>
-                <w:lang w:val="es-CL" w:eastAsia="en-US" w:bidi="ar-SA"/>
-              </w:rPr>
-            </w:r>
-          </w:p>
-        </w:tc>
-        <w:tc>
-          <w:tcPr>
-            <w:tcW w:w="4985" w:type="dxa"/>
-            <w:tcBorders/>
-          </w:tcPr>
-          <w:p>
-            <w:pPr>
-              <w:pStyle w:val="Normal"/>
-              <w:widowControl/>
-              <w:spacing w:lineRule="auto" w:line="240" w:before="0" w:after="0"/>
-              <w:jc w:val="start"/>
-              <w:rPr>
-                <w:rFonts w:eastAsia="Arial" w:cs=""/>
-                <w:kern w:val="0"/>
-                <w:szCs w:val="22"/>
-                <w:lang w:val="es-CL" w:eastAsia="en-US" w:bidi="ar-SA"/>
-              </w:rPr>
-            </w:pPr>
-            <w:r>
-              <w:rPr>
-                <w:rFonts w:eastAsia="Arial" w:cs=""/>
-                <w:kern w:val="0"/>
-                <w:szCs w:val="22"/>
-                <w:lang w:val="es-CL" w:eastAsia="en-US" w:bidi="ar-SA"/>
-              </w:rPr>
-              <w:object w:dxaOrig="12225" w:dyaOrig="9750">
-                <v:shapetype id="_x0000_tole_rId8" coordsize="21600,21600" o:spt="8" o:preferrelative="t" path="m@4@5l@4@11@9@11@9@5xe" filled="f" stroked="f">
+              <w:object w:dxaOrig="10530" w:dyaOrig="9540">
+                <v:shapetype id="_x0000_tole_rId7" coordsize="21600,21600" o:spt="7" o:preferrelative="t" path="m@4@5l@4@11@9@11@9@5xe" filled="f" stroked="f">
                   <v:stroke joinstyle="miter"/>
                   <v:formulas>
                     <v:f eqn="if lineDrawn pixelLineWidth 0"/>
@@ -1678,10 +1434,85 @@
                   <v:path o:extrusionok="f" gradientshapeok="t" o:connecttype="rect"/>
                   <o:lock v:ext="edit" aspectratio="t"/>
                 </v:shapetype>
-                <v:shape id="ole_rId8" type="_x0000_tole_rId8" style="width:238.5pt;height:189.75pt;mso-wrap-distance-right:0pt" filled="f" o:ole="">
-                  <v:imagedata r:id="rId9" o:title=""/>
+                <v:shape id="ole_rId7" type="_x0000_tole_rId7" style="width:246pt;height:222pt;mso-wrap-distance-right:0pt" filled="f" o:ole="">
+                  <v:imagedata r:id="rId8" o:title=""/>
                 </v:shape>
-                <o:OLEObject Type="Embed" ProgID="PBrush" ShapeID="ole_rId8" DrawAspect="Content" ObjectID="_265367157" r:id="rId8"/>
+                <o:OLEObject Type="Embed" ProgID="PBrush" ShapeID="ole_rId7" DrawAspect="Content" ObjectID="_1619578241" r:id="rId7"/>
+              </w:object>
+            </w:r>
+          </w:p>
+          <w:p>
+            <w:pPr>
+              <w:pStyle w:val="Normal"/>
+              <w:widowControl/>
+              <w:spacing w:lineRule="auto" w:line="240" w:before="0" w:after="0"/>
+              <w:jc w:val="start"/>
+              <w:rPr>
+                <w:rFonts w:eastAsia="Arial" w:cs="Arial"/>
+                <w:kern w:val="0"/>
+                <w:szCs w:val="22"/>
+                <w:lang w:val="es-CL" w:eastAsia="en-US" w:bidi="ar-SA"/>
+              </w:rPr>
+            </w:pPr>
+            <w:r>
+              <w:rPr>
+                <w:rFonts w:eastAsia="Arial" w:cs="Arial"/>
+                <w:kern w:val="0"/>
+                <w:szCs w:val="22"/>
+                <w:lang w:val="es-CL" w:eastAsia="en-US" w:bidi="ar-SA"/>
+              </w:rPr>
+            </w:r>
+          </w:p>
+        </w:tc>
+        <w:tc>
+          <w:tcPr>
+            <w:tcW w:w="4854" w:type="dxa"/>
+            <w:tcBorders/>
+          </w:tcPr>
+          <w:p>
+            <w:pPr>
+              <w:pStyle w:val="Normal"/>
+              <w:widowControl/>
+              <w:spacing w:lineRule="auto" w:line="240" w:before="0" w:after="0"/>
+              <w:jc w:val="start"/>
+              <w:rPr>
+                <w:rFonts w:eastAsia="Arial" w:cs="Arial"/>
+                <w:kern w:val="0"/>
+                <w:szCs w:val="22"/>
+                <w:lang w:val="es-CL" w:eastAsia="en-US" w:bidi="ar-SA"/>
+              </w:rPr>
+            </w:pPr>
+            <w:r>
+              <w:rPr>
+                <w:rFonts w:eastAsia="Arial" w:cs="Arial"/>
+                <w:kern w:val="0"/>
+                <w:szCs w:val="22"/>
+                <w:lang w:val="es-CL" w:eastAsia="en-US" w:bidi="ar-SA"/>
+              </w:rPr>
+              <w:object w:dxaOrig="12225" w:dyaOrig="9750">
+                <v:shapetype id="_x0000_tole_rId9" coordsize="21600,21600" o:spt="9" o:preferrelative="t" path="m@4@5l@4@11@9@11@9@5xe" filled="f" stroked="f">
+                  <v:stroke joinstyle="miter"/>
+                  <v:formulas>
+                    <v:f eqn="if lineDrawn pixelLineWidth 0"/>
+                    <v:f eqn="sum @0 1 0"/>
+                    <v:f eqn="sum 0 0 @1"/>
+                    <v:f eqn="prod @2 1 2"/>
+                    <v:f eqn="prod @3 21600 pixelWidth"/>
+                    <v:f eqn="prod @3 21600 pixelHeight"/>
+                    <v:f eqn="sum @0 0 1"/>
+                    <v:f eqn="prod @6 1 2"/>
+                    <v:f eqn="prod @7 21600 pixelWidth"/>
+                    <v:f eqn="sum @8 21600 0"/>
+                    <v:f eqn="prod @7 21600 pixelHeight"/>
+                    <v:f eqn="sum @10 21600 0"/>
+                  </v:formulas>
+                  <v:path o:extrusionok="f" gradientshapeok="t" o:connecttype="rect"/>
+                  <o:lock v:ext="edit" aspectratio="t"/>
+                </v:shapetype>
+                <v:shape id="ole_rId9" type="_x0000_tole_rId9" style="width:235.5pt;height:188.25pt;mso-wrap-distance-right:0pt" filled="f" o:ole="">
+                  <v:imagedata r:id="rId10" o:title=""/>
+                </v:shape>
+                <o:OLEObject Type="Embed" ProgID="PBrush" ShapeID="ole_rId9" DrawAspect="Content" ObjectID="_2026552067" r:id="rId9"/>
               </w:object>
             </w:r>
           </w:p>
@@ -1700,6 +1531,7 @@
     <w:p>
       <w:pPr>
         <w:pStyle w:val="Normal"/>
+        <w:ind w:start="459"/>
         <w:rPr/>
       </w:pPr>
       <w:r>
@@ -1729,7 +1561,7 @@
         <mc:AlternateContent>
           <mc:Choice Requires="wps">
             <w:drawing>
-              <wp:anchor distT="40005" distB="58420" distL="109220" distR="118110" simplePos="0" relativeHeight="36" behindDoc="0" locked="0" layoutInCell="0" allowOverlap="1" wp14:anchorId="25D5EF06">
+              <wp:anchor distT="40005" distB="58420" distL="109220" distR="118110" simplePos="0" relativeHeight="34" behindDoc="0" locked="0" layoutInCell="0" allowOverlap="1" wp14:anchorId="25D5EF06">
                 <wp:simplePos x="0" y="0"/>
                 <wp:positionH relativeFrom="column">
                   <wp:posOffset>75565</wp:posOffset>
@@ -1740,7 +1572,7 @@
                 <wp:extent cx="6201410" cy="5240655"/>
                 <wp:effectExtent l="5080" t="5715" r="5080" b="4445"/>
                 <wp:wrapSquare wrapText="bothSides"/>
-                <wp:docPr id="7" name="Cuadro de texto 2"/>
+                <wp:docPr id="6" name="Cuadro de texto 2"/>
                 <a:graphic xmlns:a="http://schemas.openxmlformats.org/drawingml/2006/main">
                   <a:graphicData uri="http://schemas.microsoft.com/office/word/2010/wordprocessingShape">
                     <wps:wsp>
@@ -2087,12 +1919,12 @@
               <wp:align>center</wp:align>
             </wp:positionH>
             <wp:positionV relativeFrom="paragraph">
-              <wp:posOffset>635</wp:posOffset>
+              <wp:align>top</wp:align>
             </wp:positionV>
-            <wp:extent cx="6019165" cy="3380105"/>
+            <wp:extent cx="6019165" cy="4164330"/>
             <wp:effectExtent l="0" t="0" r="0" b="0"/>
             <wp:wrapSquare wrapText="largest"/>
-            <wp:docPr id="8" name="Imagen8"/>
+            <wp:docPr id="7" name="Imagen5"/>
             <wp:cNvGraphicFramePr>
               <a:graphicFrameLocks xmlns:a="http://schemas.openxmlformats.org/drawingml/2006/main" noChangeAspect="1"/>
             </wp:cNvGraphicFramePr>
@@ -2100,13 +1932,13 @@
               <a:graphicData uri="http://schemas.openxmlformats.org/drawingml/2006/picture">
                 <pic:pic xmlns:pic="http://schemas.openxmlformats.org/drawingml/2006/picture">
                   <pic:nvPicPr>
-                    <pic:cNvPr id="8" name="Imagen8"/>
+                    <pic:cNvPr id="7" name="Imagen5"/>
                     <pic:cNvPicPr>
                       <a:picLocks noChangeAspect="1" noChangeArrowheads="1"/>
                     </pic:cNvPicPr>
                   </pic:nvPicPr>
                   <pic:blipFill>
-                    <a:blip r:embed="rId10"/>
+                    <a:blip r:embed="rId11"/>
                     <a:stretch>
                       <a:fillRect/>
                     </a:stretch>
@@ -2114,7 +1946,7 @@
                   <pic:spPr bwMode="auto">
                     <a:xfrm>
                       <a:off x="0" y="0"/>
-                      <a:ext cx="6019165" cy="3380105"/>
+                      <a:ext cx="6019165" cy="4164330"/>
                     </a:xfrm>
                     <a:prstGeom prst="rect">
                       <a:avLst/>
@@ -2142,12 +1974,12 @@
           <w:bCs/>
         </w:rPr>
         <w:sectPr>
-          <w:headerReference w:type="even" r:id="rId11"/>
-          <w:headerReference w:type="default" r:id="rId12"/>
-          <w:headerReference w:type="first" r:id="rId13"/>
-          <w:footerReference w:type="even" r:id="rId14"/>
-          <w:footerReference w:type="default" r:id="rId15"/>
-          <w:footerReference w:type="first" r:id="rId16"/>
+          <w:headerReference w:type="even" r:id="rId12"/>
+          <w:headerReference w:type="default" r:id="rId13"/>
+          <w:headerReference w:type="first" r:id="rId14"/>
+          <w:footerReference w:type="even" r:id="rId15"/>
+          <w:footerReference w:type="default" r:id="rId16"/>
+          <w:footerReference w:type="first" r:id="rId17"/>
           <w:type w:val="nextPage"/>
           <w:pgSz w:w="12240" w:h="15840"/>
           <w:pgMar w:left="1134" w:right="1183" w:gutter="0" w:header="708" w:top="1560" w:footer="708" w:bottom="1417"/>
@@ -2174,7 +2006,7 @@
         <mc:AlternateContent>
           <mc:Choice Requires="wps">
             <w:drawing>
-              <wp:anchor distT="40640" distB="52705" distL="109220" distR="118110" simplePos="0" relativeHeight="38" behindDoc="0" locked="0" layoutInCell="0" allowOverlap="1" wp14:anchorId="6BD093D9">
+              <wp:anchor distT="40640" distB="52705" distL="109220" distR="118110" simplePos="0" relativeHeight="36" behindDoc="0" locked="0" layoutInCell="0" allowOverlap="1" wp14:anchorId="6BD093D9">
                 <wp:simplePos x="0" y="0"/>
                 <wp:positionH relativeFrom="column">
                   <wp:posOffset>-635</wp:posOffset>
@@ -2185,7 +2017,7 @@
                 <wp:extent cx="6201410" cy="4953000"/>
                 <wp:effectExtent l="5080" t="5080" r="5080" b="5080"/>
                 <wp:wrapSquare wrapText="bothSides"/>
-                <wp:docPr id="13" name="Cuadro de texto 2"/>
+                <wp:docPr id="12" name="Cuadro de texto 2"/>
                 <a:graphic xmlns:a="http://schemas.openxmlformats.org/drawingml/2006/main">
                   <a:graphicData uri="http://schemas.microsoft.com/office/word/2010/wordprocessingShape">
                     <wps:wsp>
@@ -2268,12 +2100,12 @@
               <wp:align>center</wp:align>
             </wp:positionH>
             <wp:positionV relativeFrom="paragraph">
-              <wp:posOffset>635</wp:posOffset>
+              <wp:align>top</wp:align>
             </wp:positionV>
-            <wp:extent cx="6019165" cy="3416935"/>
+            <wp:extent cx="6019165" cy="4236085"/>
             <wp:effectExtent l="0" t="0" r="0" b="0"/>
             <wp:wrapSquare wrapText="largest"/>
-            <wp:docPr id="14" name="Imagen7"/>
+            <wp:docPr id="13" name="Imagen7"/>
             <wp:cNvGraphicFramePr>
               <a:graphicFrameLocks xmlns:a="http://schemas.openxmlformats.org/drawingml/2006/main" noChangeAspect="1"/>
             </wp:cNvGraphicFramePr>
@@ -2281,153 +2113,7 @@
               <a:graphicData uri="http://schemas.openxmlformats.org/drawingml/2006/picture">
                 <pic:pic xmlns:pic="http://schemas.openxmlformats.org/drawingml/2006/picture">
                   <pic:nvPicPr>
-                    <pic:cNvPr id="14" name="Imagen7"/>
-                    <pic:cNvPicPr>
-                      <a:picLocks noChangeAspect="1" noChangeArrowheads="1"/>
-                    </pic:cNvPicPr>
-                  </pic:nvPicPr>
-                  <pic:blipFill>
-                    <a:blip r:embed="rId17"/>
-                    <a:stretch>
-                      <a:fillRect/>
-                    </a:stretch>
-                  </pic:blipFill>
-                  <pic:spPr bwMode="auto">
-                    <a:xfrm>
-                      <a:off x="0" y="0"/>
-                      <a:ext cx="6019165" cy="3416935"/>
-                    </a:xfrm>
-                    <a:prstGeom prst="rect">
-                      <a:avLst/>
-                    </a:prstGeom>
-                    <a:noFill/>
-                  </pic:spPr>
-                </pic:pic>
-              </a:graphicData>
-            </a:graphic>
-          </wp:anchor>
-        </w:drawing>
-      </w:r>
-      <w:r>
-        <w:rPr/>
-        <w:t>Modelo en notación de Bachman o Ingeniería de la Información:</w:t>
-      </w:r>
-    </w:p>
-    <w:p>
-      <w:pPr>
-        <w:pStyle w:val="ListParagraph"/>
-        <w:numPr>
-          <w:ilvl w:val="0"/>
-          <w:numId w:val="0"/>
-        </w:numPr>
-        <w:ind w:hanging="0" w:start="720"/>
-        <w:rPr/>
-      </w:pPr>
-      <w:r>
-        <w:rPr/>
-      </w:r>
-    </w:p>
-    <w:p>
-      <w:pPr>
-        <w:pStyle w:val="Normal"/>
-        <w:ind w:start="459"/>
-        <w:rPr>
-          <w:b/>
-          <w:bCs/>
-        </w:rPr>
-      </w:pPr>
-      <w:r>
-        <w:rPr>
-          <w:b/>
-          <w:bCs/>
-        </w:rPr>
-      </w:r>
-      <w:r>
-        <w:br w:type="page"/>
-      </w:r>
-    </w:p>
-    <w:p>
-      <w:pPr>
-        <w:pStyle w:val="Normal"/>
-        <w:spacing w:before="0" w:after="160"/>
-        <w:rPr>
-          <w:b/>
-          <w:bCs/>
-        </w:rPr>
-      </w:pPr>
-      <w:r>
-        <w:rPr>
-          <w:b/>
-          <w:bCs/>
-        </w:rPr>
-        <w:t xml:space="preserve">Paso 2: </w:t>
-      </w:r>
-    </w:p>
-    <w:p>
-      <w:pPr>
-        <w:pStyle w:val="Normal"/>
-        <w:rPr/>
-      </w:pPr>
-      <w:r>
-        <w:rPr/>
-        <w:t>Además, tendrás que descargar el resultado y generar un archivo DMD y una subcarpeta. Para ello, tendrás que hacer clic en la opción “Guardar como” del menú “Archivo”, lo que desplegará el submenú que se ilustra en la siguiente imagen:</w:t>
-      </w:r>
-    </w:p>
-    <w:p>
-      <w:pPr>
-        <w:pStyle w:val="Normal"/>
-        <w:spacing w:lineRule="auto" w:line="240"/>
-        <w:rPr>
-          <w:b/>
-          <w:bCs/>
-        </w:rPr>
-      </w:pPr>
-      <w:r>
-        <w:rPr>
-          <w:b/>
-          <w:bCs/>
-        </w:rPr>
-        <w:t>Figura 2</w:t>
-      </w:r>
-    </w:p>
-    <w:p>
-      <w:pPr>
-        <w:pStyle w:val="Normal"/>
-        <w:spacing w:lineRule="auto" w:line="240"/>
-        <w:rPr/>
-      </w:pPr>
-      <w:r>
-        <w:rPr>
-          <w:i/>
-          <w:iCs/>
-        </w:rPr>
-        <w:t>Cómo guardar Diseño en un archivo .dmd</w:t>
-      </w:r>
-      <w:r>
-        <w:rPr/>
-        <w:t> </w:t>
-      </w:r>
-    </w:p>
-    <w:p>
-      <w:pPr>
-        <w:pStyle w:val="Normal"/>
-        <w:rPr/>
-      </w:pPr>
-      <w:r>
-        <w:rPr/>
-        <w:drawing>
-          <wp:inline distT="0" distB="0" distL="0" distR="0">
-            <wp:extent cx="3857625" cy="3005455"/>
-            <wp:effectExtent l="0" t="0" r="0" b="0"/>
-            <wp:docPr id="15" name="Imagen 16" descr="Ventana para guardar el archivo SQL"/>
-            <wp:cNvGraphicFramePr>
-              <a:graphicFrameLocks xmlns:a="http://schemas.openxmlformats.org/drawingml/2006/main" noChangeAspect="1"/>
-            </wp:cNvGraphicFramePr>
-            <a:graphic xmlns:a="http://schemas.openxmlformats.org/drawingml/2006/main">
-              <a:graphicData uri="http://schemas.openxmlformats.org/drawingml/2006/picture">
-                <pic:pic xmlns:pic="http://schemas.openxmlformats.org/drawingml/2006/picture">
-                  <pic:nvPicPr>
-                    <pic:cNvPr id="15" name="Imagen 16" descr="Ventana para guardar el archivo SQL"/>
+                    <pic:cNvPr id="13" name="Imagen7"/>
                     <pic:cNvPicPr>
                       <a:picLocks noChangeAspect="1" noChangeArrowheads="1"/>
                     </pic:cNvPicPr>
@@ -2441,7 +2127,161 @@
                   <pic:spPr bwMode="auto">
                     <a:xfrm>
                       <a:off x="0" y="0"/>
-                      <a:ext cx="3857625" cy="3005455"/>
+                      <a:ext cx="6019165" cy="4236085"/>
+                    </a:xfrm>
+                    <a:prstGeom prst="rect">
+                      <a:avLst/>
+                    </a:prstGeom>
+                    <a:noFill/>
+                  </pic:spPr>
+                </pic:pic>
+              </a:graphicData>
+            </a:graphic>
+          </wp:anchor>
+        </w:drawing>
+      </w:r>
+      <w:r>
+        <w:rPr/>
+        <w:t>Modelo en notación de Bachman o Ingeniería de la Información:</w:t>
+      </w:r>
+    </w:p>
+    <w:p>
+      <w:pPr>
+        <w:pStyle w:val="ListParagraph"/>
+        <w:numPr>
+          <w:ilvl w:val="0"/>
+          <w:numId w:val="0"/>
+        </w:numPr>
+        <w:ind w:hanging="0" w:start="720"/>
+        <w:rPr/>
+      </w:pPr>
+      <w:r>
+        <w:rPr/>
+      </w:r>
+    </w:p>
+    <w:p>
+      <w:pPr>
+        <w:pStyle w:val="Normal"/>
+        <w:ind w:start="459"/>
+        <w:rPr>
+          <w:b/>
+          <w:bCs/>
+        </w:rPr>
+      </w:pPr>
+      <w:r>
+        <w:rPr>
+          <w:b/>
+          <w:bCs/>
+        </w:rPr>
+      </w:r>
+      <w:r>
+        <w:br w:type="page"/>
+      </w:r>
+    </w:p>
+    <w:p>
+      <w:pPr>
+        <w:pStyle w:val="Normal"/>
+        <w:spacing w:before="0" w:after="160"/>
+        <w:rPr>
+          <w:b/>
+          <w:bCs/>
+        </w:rPr>
+      </w:pPr>
+      <w:r>
+        <w:rPr>
+          <w:b/>
+          <w:bCs/>
+        </w:rPr>
+        <w:t xml:space="preserve">Paso 2: </w:t>
+      </w:r>
+    </w:p>
+    <w:p>
+      <w:pPr>
+        <w:pStyle w:val="Normal"/>
+        <w:rPr/>
+      </w:pPr>
+      <w:r>
+        <w:rPr/>
+        <w:t>Además, tendrás que descargar el resultado y generar un archivo DMD y una subcarpeta.</w:t>
+      </w:r>
+    </w:p>
+    <w:p>
+      <w:pPr>
+        <w:pStyle w:val="Normal"/>
+        <w:rPr/>
+      </w:pPr>
+      <w:r>
+        <w:rPr/>
+        <w:t>Para ello, tendrás que hacer clic en la opción “Guardar como” del menú “Archivo”, lo que desplegará el submenú que se ilustra en la siguiente imagen:</w:t>
+      </w:r>
+    </w:p>
+    <w:p>
+      <w:pPr>
+        <w:pStyle w:val="Normal"/>
+        <w:rPr>
+          <w:b/>
+          <w:bCs/>
+        </w:rPr>
+      </w:pPr>
+      <w:r>
+        <w:rPr>
+          <w:b/>
+          <w:bCs/>
+        </w:rPr>
+        <w:t>Figura 2</w:t>
+      </w:r>
+    </w:p>
+    <w:p>
+      <w:pPr>
+        <w:pStyle w:val="Normal"/>
+        <w:rPr/>
+      </w:pPr>
+      <w:r>
+        <w:rPr>
+          <w:i/>
+          <w:iCs/>
+        </w:rPr>
+        <w:t>Cómo guardar Diseño en un archivo .dmd</w:t>
+      </w:r>
+      <w:r>
+        <w:rPr/>
+        <w:t> </w:t>
+      </w:r>
+    </w:p>
+    <w:p>
+      <w:pPr>
+        <w:pStyle w:val="Normal"/>
+        <w:rPr/>
+      </w:pPr>
+      <w:r>
+        <w:rPr/>
+        <w:drawing>
+          <wp:inline distT="0" distB="0" distL="0" distR="0">
+            <wp:extent cx="4107815" cy="3200400"/>
+            <wp:effectExtent l="0" t="0" r="0" b="0"/>
+            <wp:docPr id="14" name="Imagen 16" descr="Ventana para guardar el archivo SQL"/>
+            <wp:cNvGraphicFramePr>
+              <a:graphicFrameLocks xmlns:a="http://schemas.openxmlformats.org/drawingml/2006/main" noChangeAspect="1"/>
+            </wp:cNvGraphicFramePr>
+            <a:graphic xmlns:a="http://schemas.openxmlformats.org/drawingml/2006/main">
+              <a:graphicData uri="http://schemas.openxmlformats.org/drawingml/2006/picture">
+                <pic:pic xmlns:pic="http://schemas.openxmlformats.org/drawingml/2006/picture">
+                  <pic:nvPicPr>
+                    <pic:cNvPr id="14" name="Imagen 16" descr="Ventana para guardar el archivo SQL"/>
+                    <pic:cNvPicPr>
+                      <a:picLocks noChangeAspect="1" noChangeArrowheads="1"/>
+                    </pic:cNvPicPr>
+                  </pic:nvPicPr>
+                  <pic:blipFill>
+                    <a:blip r:embed="rId19"/>
+                    <a:stretch>
+                      <a:fillRect/>
+                    </a:stretch>
+                  </pic:blipFill>
+                  <pic:spPr bwMode="auto">
+                    <a:xfrm>
+                      <a:off x="0" y="0"/>
+                      <a:ext cx="4107815" cy="3200400"/>
                     </a:xfrm>
                     <a:prstGeom prst="rect">
                       <a:avLst/>
@@ -2489,7 +2329,7 @@
         </w:rPr>
         <w:t xml:space="preserve"> [Software]. Oracle. </w:t>
       </w:r>
-      <w:hyperlink r:id="rId19" w:tgtFrame="_blank">
+      <w:hyperlink r:id="rId20" w:tgtFrame="_blank">
         <w:r>
           <w:rPr>
             <w:rStyle w:val="Hyperlink"/>
@@ -2515,29 +2355,12 @@
           <w:b/>
           <w:bCs/>
         </w:rPr>
-      </w:r>
-    </w:p>
-    <w:p>
-      <w:pPr>
-        <w:pStyle w:val="Normal"/>
-        <w:spacing w:lineRule="auto" w:line="240"/>
-        <w:rPr>
-          <w:b/>
-          <w:bCs/>
-        </w:rPr>
-      </w:pPr>
-      <w:r>
-        <w:rPr>
-          <w:b/>
-          <w:bCs/>
-        </w:rPr>
         <w:t>Figura 3</w:t>
       </w:r>
     </w:p>
     <w:p>
       <w:pPr>
         <w:pStyle w:val="Normal"/>
-        <w:spacing w:lineRule="auto" w:line="240"/>
         <w:rPr>
           <w:i/>
           <w:iCs/>
@@ -2550,23 +2373,13 @@
         </w:rPr>
         <w:t>Ejemplo de archivos de diseño generado con SQL Developer Data Modeler</w:t>
       </w:r>
-    </w:p>
-    <w:p>
-      <w:pPr>
-        <w:pStyle w:val="Normal"/>
-        <w:ind w:start="459"/>
-        <w:rPr>
-          <w:b/>
-          <w:bCs/>
-        </w:rPr>
-      </w:pPr>
       <w:r>
         <w:rPr/>
         <w:drawing>
           <wp:inline distT="0" distB="0" distL="0" distR="0">
-            <wp:extent cx="3743325" cy="904875"/>
+            <wp:extent cx="3657600" cy="904875"/>
             <wp:effectExtent l="0" t="0" r="0" b="0"/>
-            <wp:docPr id="16" name="Imagen 18" descr="La figura muestra la estructura de archivos generada al guardar un modelo en Oracle Data Modeler. Se observa una carpeta denominada Modelo_Base, que contiene recursos asociados al modelo, y un archivo con extensión .dmd llamado Modelo_Base.dmd, que corresponde al archivo principal del modelo lógico o físico creado. Este formato organiza los datos y configuraciones necesarias para el trabajo con diagramas y relaciones."/>
+            <wp:docPr id="15" name="Imagen 18" descr="La figura muestra la estructura de archivos generada al guardar un modelo en Oracle Data Modeler. Se observa una carpeta denominada Modelo_Base, que contiene recursos asociados al modelo, y un archivo con extensión .dmd llamado Modelo_Base.dmd, que corresponde al archivo principal del modelo lógico o físico creado. Este formato organiza los datos y configuraciones necesarias para el trabajo con diagramas y relaciones."/>
             <wp:cNvGraphicFramePr>
               <a:graphicFrameLocks xmlns:a="http://schemas.openxmlformats.org/drawingml/2006/main" noChangeAspect="1"/>
             </wp:cNvGraphicFramePr>
@@ -2574,13 +2387,14 @@
               <a:graphicData uri="http://schemas.openxmlformats.org/drawingml/2006/picture">
                 <pic:pic xmlns:pic="http://schemas.openxmlformats.org/drawingml/2006/picture">
                   <pic:nvPicPr>
-                    <pic:cNvPr id="16" name="Imagen 18" descr="La figura muestra la estructura de archivos generada al guardar un modelo en Oracle Data Modeler. Se observa una carpeta denominada Modelo_Base, que contiene recursos asociados al modelo, y un archivo con extensión .dmd llamado Modelo_Base.dmd, que corresponde al archivo principal del modelo lógico o físico creado. Este formato organiza los datos y configuraciones necesarias para el trabajo con diagramas y relaciones."/>
+                    <pic:cNvPr id="15" name="Imagen 18" descr="La figura muestra la estructura de archivos generada al guardar un modelo en Oracle Data Modeler. Se observa una carpeta denominada Modelo_Base, que contiene recursos asociados al modelo, y un archivo con extensión .dmd llamado Modelo_Base.dmd, que corresponde al archivo principal del modelo lógico o físico creado. Este formato organiza los datos y configuraciones necesarias para el trabajo con diagramas y relaciones."/>
                     <pic:cNvPicPr>
                       <a:picLocks noChangeAspect="1" noChangeArrowheads="1"/>
                     </pic:cNvPicPr>
                   </pic:nvPicPr>
                   <pic:blipFill>
-                    <a:blip r:embed="rId20"/>
+                    <a:blip r:embed="rId21"/>
+                    <a:srcRect l="2289" t="0" r="0" b="0"/>
                     <a:stretch>
                       <a:fillRect/>
                     </a:stretch>
@@ -2588,7 +2402,7 @@
                   <pic:spPr bwMode="auto">
                     <a:xfrm>
                       <a:off x="0" y="0"/>
-                      <a:ext cx="3743325" cy="904875"/>
+                      <a:ext cx="3657600" cy="904875"/>
                     </a:xfrm>
                     <a:prstGeom prst="rect">
                       <a:avLst/>
@@ -2650,7 +2464,7 @@
           <wp:inline distT="0" distB="0" distL="0" distR="0">
             <wp:extent cx="3810000" cy="2257425"/>
             <wp:effectExtent l="0" t="0" r="0" b="0"/>
-            <wp:docPr id="17" name="Imagen 20" descr="La figura muestra el contenido detallado de la carpeta de recursos asociada a un modelo de Oracle Data Modeler. "/>
+            <wp:docPr id="16" name="Imagen 20" descr="La figura muestra el contenido detallado de la carpeta de recursos asociada a un modelo de Oracle Data Modeler. "/>
             <wp:cNvGraphicFramePr>
               <a:graphicFrameLocks xmlns:a="http://schemas.openxmlformats.org/drawingml/2006/main" noChangeAspect="1"/>
             </wp:cNvGraphicFramePr>
@@ -2658,13 +2472,13 @@
               <a:graphicData uri="http://schemas.openxmlformats.org/drawingml/2006/picture">
                 <pic:pic xmlns:pic="http://schemas.openxmlformats.org/drawingml/2006/picture">
                   <pic:nvPicPr>
-                    <pic:cNvPr id="17" name="Imagen 20" descr="La figura muestra el contenido detallado de la carpeta de recursos asociada a un modelo de Oracle Data Modeler. "/>
+                    <pic:cNvPr id="16" name="Imagen 20" descr="La figura muestra el contenido detallado de la carpeta de recursos asociada a un modelo de Oracle Data Modeler. "/>
                     <pic:cNvPicPr>
                       <a:picLocks noChangeAspect="1" noChangeArrowheads="1"/>
                     </pic:cNvPicPr>
                   </pic:nvPicPr>
                   <pic:blipFill>
-                    <a:blip r:embed="rId21"/>
+                    <a:blip r:embed="rId22"/>
                     <a:stretch>
                       <a:fillRect/>
                     </a:stretch>
@@ -2720,7 +2534,7 @@
         </w:rPr>
         <w:t xml:space="preserve"> [Software]. Oracle. </w:t>
       </w:r>
-      <w:hyperlink r:id="rId22">
+      <w:hyperlink r:id="rId23">
         <w:r>
           <w:rPr>
             <w:rStyle w:val="Hyperlink"/>
@@ -2736,27 +2550,20 @@
     <w:p>
       <w:pPr>
         <w:pStyle w:val="Normal"/>
+        <w:rPr/>
+      </w:pPr>
+      <w:r>
+        <w:rPr/>
+      </w:r>
+    </w:p>
+    <w:p>
+      <w:pPr>
+        <w:pStyle w:val="Normal"/>
+        <w:rPr/>
+      </w:pPr>
+      <w:r>
         <w:rPr>
           <w:b/>
-          <w:bCs/>
-        </w:rPr>
-      </w:pPr>
-      <w:r>
-        <w:rPr>
-          <w:b/>
-          <w:bCs/>
-        </w:rPr>
-      </w:r>
-    </w:p>
-    <w:p>
-      <w:pPr>
-        <w:pStyle w:val="Normal"/>
-        <w:rPr/>
-      </w:pPr>
-      <w:r>
-        <w:rPr>
-          <w:b/>
-          <w:bCs/>
         </w:rPr>
         <w:t xml:space="preserve">Paso 3: </w:t>
       </w:r>
@@ -2812,7 +2619,7 @@
           <wp:inline distT="0" distB="0" distL="0" distR="0">
             <wp:extent cx="2242185" cy="1259205"/>
             <wp:effectExtent l="0" t="0" r="0" b="0"/>
-            <wp:docPr id="18" name="Imagen 22" descr="La figura muestra la estructura interna del archivo comprimido Encargo_Semanal.zip."/>
+            <wp:docPr id="17" name="Imagen 22" descr="La figura muestra la estructura interna del archivo comprimido Encargo_Semanal.zip."/>
             <wp:cNvGraphicFramePr>
               <a:graphicFrameLocks xmlns:a="http://schemas.openxmlformats.org/drawingml/2006/main" noChangeAspect="1"/>
             </wp:cNvGraphicFramePr>
@@ -2820,13 +2627,13 @@
               <a:graphicData uri="http://schemas.openxmlformats.org/drawingml/2006/picture">
                 <pic:pic xmlns:pic="http://schemas.openxmlformats.org/drawingml/2006/picture">
                   <pic:nvPicPr>
-                    <pic:cNvPr id="18" name="Imagen 22" descr="La figura muestra la estructura interna del archivo comprimido Encargo_Semanal.zip."/>
+                    <pic:cNvPr id="17" name="Imagen 22" descr="La figura muestra la estructura interna del archivo comprimido Encargo_Semanal.zip."/>
                     <pic:cNvPicPr>
                       <a:picLocks noChangeAspect="1" noChangeArrowheads="1"/>
                     </pic:cNvPicPr>
                   </pic:nvPicPr>
                   <pic:blipFill>
-                    <a:blip r:embed="rId23"/>
+                    <a:blip r:embed="rId24"/>
                     <a:stretch>
                       <a:fillRect/>
                     </a:stretch>
@@ -2851,7 +2658,11 @@
     <w:p>
       <w:pPr>
         <w:pStyle w:val="Normal"/>
-        <w:rPr/>
+        <w:rPr>
+          <w:b/>
+          <w:bCs/>
+          <w:lang w:val="en-US"/>
+        </w:rPr>
       </w:pPr>
       <w:r>
         <w:rPr>
@@ -2884,7 +2695,7 @@
         </w:rPr>
         <w:t xml:space="preserve"> [Software]. Oracle. </w:t>
       </w:r>
-      <w:hyperlink r:id="rId24" w:tgtFrame="_blank">
+      <w:hyperlink r:id="rId25" w:tgtFrame="_blank">
         <w:r>
           <w:rPr>
             <w:rStyle w:val="Hyperlink"/>
@@ -2894,6 +2705,12 @@
         </w:r>
       </w:hyperlink>
       <w:r>
+        <w:rPr>
+          <w:lang w:val="en-US"/>
+        </w:rPr>
+        <w:t xml:space="preserve"> </w:t>
+      </w:r>
+      <w:r>
         <w:br w:type="page"/>
       </w:r>
     </w:p>
@@ -2929,7 +2746,7 @@
         </w:tabs>
         <w:rPr/>
       </w:pPr>
-      <w:hyperlink r:id="rId25" w:tgtFrame="_blank">
+      <w:hyperlink r:id="rId26" w:tgtFrame="_blank">
         <w:r>
           <w:rPr>
             <w:rStyle w:val="Hyperlink"/>
@@ -2989,7 +2806,7 @@
           <wp:inline distT="0" distB="0" distL="0" distR="0">
             <wp:extent cx="5948045" cy="2364105"/>
             <wp:effectExtent l="0" t="0" r="0" b="0"/>
-            <wp:docPr id="19" name="Imagen 24"/>
+            <wp:docPr id="18" name="Imagen 24" descr="Interfaz de usuario gráfica, Texto, Aplicación&#10;&#10;El contenido generado por IA puede ser incorrecto."/>
             <wp:cNvGraphicFramePr>
               <a:graphicFrameLocks xmlns:a="http://schemas.openxmlformats.org/drawingml/2006/main" noChangeAspect="1"/>
             </wp:cNvGraphicFramePr>
@@ -2997,13 +2814,13 @@
               <a:graphicData uri="http://schemas.openxmlformats.org/drawingml/2006/picture">
                 <pic:pic xmlns:pic="http://schemas.openxmlformats.org/drawingml/2006/picture">
                   <pic:nvPicPr>
-                    <pic:cNvPr id="19" name="Imagen 24"/>
+                    <pic:cNvPr id="18" name="Imagen 24" descr="Interfaz de usuario gráfica, Texto, Aplicación&#10;&#10;El contenido generado por IA puede ser incorrecto."/>
                     <pic:cNvPicPr>
                       <a:picLocks noChangeAspect="1" noChangeArrowheads="1"/>
                     </pic:cNvPicPr>
                   </pic:nvPicPr>
                   <pic:blipFill>
-                    <a:blip r:embed="rId26"/>
+                    <a:blip r:embed="rId27"/>
                     <a:stretch>
                       <a:fillRect/>
                     </a:stretch>
@@ -3056,7 +2873,7 @@
         <w:rPr/>
         <w:t xml:space="preserve"> </w:t>
       </w:r>
-      <w:hyperlink r:id="rId27">
+      <w:hyperlink r:id="rId28">
         <w:r>
           <w:rPr>
             <w:rStyle w:val="Hyperlink"/>
@@ -3072,19 +2889,6 @@
     <w:p>
       <w:pPr>
         <w:pStyle w:val="Normal"/>
-        <w:tabs>
-          <w:tab w:val="clear" w:pos="708"/>
-          <w:tab w:val="left" w:pos="2790" w:leader="none"/>
-        </w:tabs>
-        <w:rPr/>
-      </w:pPr>
-      <w:r>
-        <w:rPr/>
-      </w:r>
-    </w:p>
-    <w:p>
-      <w:pPr>
-        <w:pStyle w:val="Normal"/>
         <w:rPr/>
       </w:pPr>
       <w:r>
@@ -3135,7 +2939,7 @@
           <wp:inline distT="0" distB="0" distL="0" distR="0">
             <wp:extent cx="6138545" cy="1688465"/>
             <wp:effectExtent l="0" t="0" r="0" b="0"/>
-            <wp:docPr id="20" name="Imagen4"/>
+            <wp:docPr id="19" name="Imagen3" descr="Interfaz de usuario gráfica, Texto, Aplicación, Correo electrónico&#10;&#10;El contenido generado por IA puede ser incorrecto."/>
             <wp:cNvGraphicFramePr>
               <a:graphicFrameLocks xmlns:a="http://schemas.openxmlformats.org/drawingml/2006/main" noChangeAspect="1"/>
             </wp:cNvGraphicFramePr>
@@ -3143,13 +2947,13 @@
               <a:graphicData uri="http://schemas.openxmlformats.org/drawingml/2006/picture">
                 <pic:pic xmlns:pic="http://schemas.openxmlformats.org/drawingml/2006/picture">
                   <pic:nvPicPr>
-                    <pic:cNvPr id="20" name="Imagen4"/>
+                    <pic:cNvPr id="19" name="Imagen3" descr="Interfaz de usuario gráfica, Texto, Aplicación, Correo electrónico&#10;&#10;El contenido generado por IA puede ser incorrecto."/>
                     <pic:cNvPicPr>
                       <a:picLocks noChangeAspect="1" noChangeArrowheads="1"/>
                     </pic:cNvPicPr>
                   </pic:nvPicPr>
                   <pic:blipFill>
-                    <a:blip r:embed="rId28"/>
+                    <a:blip r:embed="rId29"/>
                     <a:srcRect l="0" t="0" r="0" b="27115"/>
                     <a:stretch>
                       <a:fillRect/>
@@ -3211,7 +3015,7 @@
         </w:rPr>
         <w:t xml:space="preserve"> </w:t>
       </w:r>
-      <w:hyperlink r:id="rId29" w:tgtFrame="_blank">
+      <w:hyperlink r:id="rId30" w:tgtFrame="_blank">
         <w:r>
           <w:rPr>
             <w:rStyle w:val="Hyperlink"/>
@@ -3245,17 +3049,7 @@
       </w:r>
       <w:r>
         <w:rPr/>
-        <w:t xml:space="preserve"> Finalmente, deberás subir al AVA este documento Word sin comprimir (con las capturas Barker y Bachman o Ingeniería de la </w:t>
-      </w:r>
-      <w:r>
-        <w:rPr>
-          <w:u w:val="single"/>
-        </w:rPr>
-        <w:t>información</w:t>
-      </w:r>
-      <w:r>
-        <w:rPr/>
-        <w:t>) y el enlace de tu repositorio GitHub en la sección “Entrega”. </w:t>
+        <w:t xml:space="preserve"> Finalmente, deberás subir al AVA este documento Word sin comprimir (con las capturas Barker y Bachman o Ingeniería de la información) y el enlace de tu repositorio GitHub en la sección “Entrega”. </w:t>
       </w:r>
     </w:p>
     <w:p>
@@ -3301,9 +3095,9 @@
         <w:rPr/>
         <w:drawing>
           <wp:inline distT="0" distB="0" distL="0" distR="0">
-            <wp:extent cx="6299835" cy="2197100"/>
+            <wp:extent cx="6195060" cy="2197100"/>
             <wp:effectExtent l="0" t="0" r="0" b="0"/>
-            <wp:docPr id="21" name="Imagen 10" descr="Interfaz de usuario gráfica, Texto&#10;&#10;Descripción generada automáticamente"/>
+            <wp:docPr id="20" name="Imagen 10" descr="Interfaz de usuario gráfica, Texto&#10;&#10;Descripción generada automáticamente"/>
             <wp:cNvGraphicFramePr>
               <a:graphicFrameLocks xmlns:a="http://schemas.openxmlformats.org/drawingml/2006/main" noChangeAspect="1"/>
             </wp:cNvGraphicFramePr>
@@ -3311,14 +3105,14 @@
               <a:graphicData uri="http://schemas.openxmlformats.org/drawingml/2006/picture">
                 <pic:pic xmlns:pic="http://schemas.openxmlformats.org/drawingml/2006/picture">
                   <pic:nvPicPr>
-                    <pic:cNvPr id="21" name="Imagen 10" descr="Interfaz de usuario gráfica, Texto&#10;&#10;Descripción generada automáticamente"/>
+                    <pic:cNvPr id="20" name="Imagen 10" descr="Interfaz de usuario gráfica, Texto&#10;&#10;Descripción generada automáticamente"/>
                     <pic:cNvPicPr>
                       <a:picLocks noChangeAspect="1" noChangeArrowheads="1"/>
                     </pic:cNvPicPr>
                   </pic:nvPicPr>
                   <pic:blipFill>
-                    <a:blip r:embed="rId30"/>
-                    <a:srcRect l="0" t="26471" r="0" b="0"/>
+                    <a:blip r:embed="rId31"/>
+                    <a:srcRect l="1662" t="26471" r="0" b="0"/>
                     <a:stretch>
                       <a:fillRect/>
                     </a:stretch>
@@ -3326,7 +3120,7 @@
                   <pic:spPr bwMode="auto">
                     <a:xfrm>
                       <a:off x="0" y="0"/>
-                      <a:ext cx="6299835" cy="2197100"/>
+                      <a:ext cx="6195060" cy="2197100"/>
                     </a:xfrm>
                     <a:prstGeom prst="rect">
                       <a:avLst/>
@@ -3347,15 +3141,60 @@
     <w:p>
       <w:pPr>
         <w:pStyle w:val="Normal"/>
+        <w:rPr/>
+      </w:pPr>
+      <w:r>
+        <w:rPr/>
+      </w:r>
+    </w:p>
+    <w:p>
+      <w:pPr>
+        <w:pStyle w:val="Normal"/>
+        <w:rPr/>
+      </w:pPr>
+      <w:r>
+        <w:rPr/>
+      </w:r>
+    </w:p>
+    <w:p>
+      <w:pPr>
+        <w:pStyle w:val="Normal"/>
+        <w:rPr/>
+      </w:pPr>
+      <w:r>
+        <w:rPr/>
+      </w:r>
+    </w:p>
+    <w:p>
+      <w:pPr>
+        <w:pStyle w:val="Normal"/>
+        <w:rPr/>
+      </w:pPr>
+      <w:r>
+        <w:rPr/>
+      </w:r>
+    </w:p>
+    <w:p>
+      <w:pPr>
+        <w:pStyle w:val="Normal"/>
+        <w:rPr/>
+      </w:pPr>
+      <w:r>
+        <w:rPr/>
+      </w:r>
+    </w:p>
+    <w:p>
+      <w:pPr>
+        <w:pStyle w:val="Normal"/>
         <w:spacing w:before="0" w:after="160"/>
         <w:rPr/>
         <w:sectPr>
-          <w:headerReference w:type="even" r:id="rId31"/>
-          <w:headerReference w:type="default" r:id="rId32"/>
-          <w:headerReference w:type="first" r:id="rId33"/>
-          <w:footerReference w:type="even" r:id="rId34"/>
-          <w:footerReference w:type="default" r:id="rId35"/>
-          <w:footerReference w:type="first" r:id="rId36"/>
+          <w:headerReference w:type="even" r:id="rId32"/>
+          <w:headerReference w:type="default" r:id="rId33"/>
+          <w:headerReference w:type="first" r:id="rId34"/>
+          <w:footerReference w:type="even" r:id="rId35"/>
+          <w:footerReference w:type="default" r:id="rId36"/>
+          <w:footerReference w:type="first" r:id="rId37"/>
           <w:type w:val="nextPage"/>
           <w:pgSz w:w="12240" w:h="15840"/>
           <w:pgMar w:left="1134" w:right="1183" w:gutter="0" w:header="708" w:top="1560" w:footer="708" w:bottom="1417"/>
@@ -3443,18 +3282,18 @@
         <mc:AlternateContent>
           <mc:Choice Requires="wps">
             <w:drawing>
-              <wp:anchor distT="0" distB="0" distL="0" distR="9525" simplePos="0" relativeHeight="34" behindDoc="0" locked="0" layoutInCell="1" allowOverlap="1" wp14:anchorId="71A805CC">
+              <wp:anchor distT="0" distB="0" distL="0" distR="9525" simplePos="0" relativeHeight="32" behindDoc="0" locked="0" layoutInCell="1" allowOverlap="1" wp14:anchorId="71A805CC">
                 <wp:simplePos x="0" y="0"/>
                 <wp:positionH relativeFrom="column">
-                  <wp:posOffset>-375285</wp:posOffset>
+                  <wp:posOffset>-374650</wp:posOffset>
                 </wp:positionH>
                 <wp:positionV relativeFrom="paragraph">
-                  <wp:posOffset>401320</wp:posOffset>
+                  <wp:posOffset>426720</wp:posOffset>
                 </wp:positionV>
                 <wp:extent cx="7019925" cy="4500245"/>
                 <wp:effectExtent l="1270" t="1270" r="0" b="0"/>
                 <wp:wrapNone/>
-                <wp:docPr id="26" name="Rectángulo: esquinas redondeadas 1"/>
+                <wp:docPr id="25" name="Rectángulo: esquinas redondeadas 1"/>
                 <a:graphic xmlns:a="http://schemas.openxmlformats.org/drawingml/2006/main">
                   <a:graphicData uri="http://schemas.microsoft.com/office/word/2010/wordprocessingShape">
                     <wps:wsp>
@@ -3499,7 +3338,7 @@
           </mc:Choice>
           <mc:Fallback>
             <w:pict>
-              <v:roundrect id="shape_0" fillcolor="#e6e7e8" stroked="f" o:allowincell="f" style="position:absolute;margin-left:-29.55pt;margin-top:31.6pt;width:552.7pt;height:354.3pt;mso-wrap-style:none;v-text-anchor:middle" wp14:anchorId="71A805CC">
+              <v:roundrect id="shape_0" fillcolor="#e6e7e8" stroked="f" o:allowincell="f" style="position:absolute;margin-left:-29.5pt;margin-top:33.6pt;width:552.7pt;height:354.3pt;mso-wrap-style:none;v-text-anchor:middle" wp14:anchorId="71A805CC">
                 <v:fill o:detectmouseclick="t" type="solid" color2="#191817"/>
                 <v:stroke color="#3465a4" weight="12600" joinstyle="miter" endcap="flat"/>
                 <w10:wrap type="none"/>
@@ -3553,7 +3392,7 @@
       <w:r>
         <w:rPr/>
         <w:drawing>
-          <wp:anchor distT="0" distB="0" distL="0" distR="0" simplePos="0" relativeHeight="35" behindDoc="0" locked="0" layoutInCell="1" allowOverlap="1">
+          <wp:anchor distT="0" distB="0" distL="0" distR="0" simplePos="0" relativeHeight="33" behindDoc="0" locked="0" layoutInCell="1" allowOverlap="1">
             <wp:simplePos x="0" y="0"/>
             <wp:positionH relativeFrom="column">
               <wp:posOffset>1642745</wp:posOffset>
@@ -3564,7 +3403,7 @@
             <wp:extent cx="2990850" cy="1179195"/>
             <wp:effectExtent l="0" t="0" r="0" b="0"/>
             <wp:wrapNone/>
-            <wp:docPr id="27" name="Imagen 2" descr="Duoc UC Online"/>
+            <wp:docPr id="26" name="Imagen 2" descr="Duoc UC Online"/>
             <wp:cNvGraphicFramePr>
               <a:graphicFrameLocks xmlns:a="http://schemas.openxmlformats.org/drawingml/2006/main" noChangeAspect="1"/>
             </wp:cNvGraphicFramePr>
@@ -3572,13 +3411,13 @@
               <a:graphicData uri="http://schemas.openxmlformats.org/drawingml/2006/picture">
                 <pic:pic xmlns:pic="http://schemas.openxmlformats.org/drawingml/2006/picture">
                   <pic:nvPicPr>
-                    <pic:cNvPr id="27" name="Imagen 2" descr="Duoc UC Online"/>
+                    <pic:cNvPr id="26" name="Imagen 2" descr="Duoc UC Online"/>
                     <pic:cNvPicPr>
                       <a:picLocks noChangeAspect="1" noChangeArrowheads="1"/>
                     </pic:cNvPicPr>
                   </pic:nvPicPr>
                   <pic:blipFill>
-                    <a:blip r:embed="rId37"/>
+                    <a:blip r:embed="rId38"/>
                     <a:stretch>
                       <a:fillRect/>
                     </a:stretch>
@@ -3694,11 +3533,11 @@
       </w:r>
     </w:p>
     <w:sectPr>
-      <w:headerReference w:type="default" r:id="rId38"/>
-      <w:headerReference w:type="first" r:id="rId39"/>
-      <w:footerReference w:type="even" r:id="rId40"/>
-      <w:footerReference w:type="default" r:id="rId41"/>
-      <w:footerReference w:type="first" r:id="rId42"/>
+      <w:headerReference w:type="default" r:id="rId39"/>
+      <w:headerReference w:type="first" r:id="rId40"/>
+      <w:footerReference w:type="even" r:id="rId41"/>
+      <w:footerReference w:type="default" r:id="rId42"/>
+      <w:footerReference w:type="first" r:id="rId43"/>
       <w:type w:val="nextPage"/>
       <w:pgSz w:w="12240" w:h="15840"/>
       <w:pgMar w:left="1134" w:right="1185" w:gutter="0" w:header="709" w:top="1559" w:footer="283" w:bottom="340"/>
@@ -3759,7 +3598,7 @@
                   <wp:extent cx="1195070" cy="287655"/>
                   <wp:effectExtent l="9525" t="10795" r="10160" b="1270"/>
                   <wp:wrapNone/>
-                  <wp:docPr id="10" name="Grupo 1"/>
+                  <wp:docPr id="9" name="Grupo 1"/>
                   <a:graphic xmlns:a="http://schemas.openxmlformats.org/drawingml/2006/main">
                     <a:graphicData uri="http://schemas.microsoft.com/office/word/2010/wordprocessingGroup">
                       <wpg:wgp>
@@ -3774,7 +3613,7 @@
                         </wpg:grpSpPr>
                         <pic:pic xmlns:pic="http://schemas.openxmlformats.org/drawingml/2006/picture">
                           <pic:nvPicPr>
-                            <pic:cNvPr id="11" name="Imagen 1" descr="Logotipo&#10;&#10;Descripción generada automáticamente"/>
+                            <pic:cNvPr id="10" name="Imagen 1" descr="Logotipo&#10;&#10;Descripción generada automáticamente"/>
                             <pic:cNvPicPr/>
                           </pic:nvPicPr>
                           <pic:blipFill>
@@ -3796,7 +3635,7 @@
                           </pic:spPr>
                         </pic:pic>
                         <wps:wsp>
-                          <wps:cNvPr id="12" name="Rectángulo: esquinas redondeadas 2"/>
+                          <wps:cNvPr id="11" name="Rectángulo: esquinas redondeadas 2"/>
                           <wps:cNvSpPr/>
                           <wps:spPr>
                             <a:xfrm>
@@ -3968,7 +3807,7 @@
 <w:ftr xmlns:o="urn:schemas-microsoft-com:office:office" xmlns:r="http://schemas.openxmlformats.org/officeDocument/2006/relationships" xmlns:v="urn:schemas-microsoft-com:vml" xmlns:w="http://schemas.openxmlformats.org/wordprocessingml/2006/main" xmlns:w10="urn:schemas-microsoft-com:office:word" xmlns:wp="http://schemas.openxmlformats.org/drawingml/2006/wordprocessingDrawing" xmlns:pic="http://schemas.openxmlformats.org/drawingml/2006/picture" xmlns:wps="http://schemas.microsoft.com/office/word/2010/wordprocessingShape" xmlns:wpg="http://schemas.microsoft.com/office/word/2010/wordprocessingGroup" xmlns:mc="http://schemas.openxmlformats.org/markup-compatibility/2006" xmlns:wp14="http://schemas.microsoft.com/office/word/2010/wordprocessingDrawing" xmlns:w14="http://schemas.microsoft.com/office/word/2010/wordml" xmlns:w15="http://schemas.microsoft.com/office/word/2012/wordml" mc:Ignorable="w14 wp14 w15">
   <w:sdt>
     <w:sdtPr>
-      <w:id w:val="-770158945"/>
+      <w:id w:val="-529718792"/>
       <w:docPartObj>
         <w:docPartGallery w:val="Page Numbers (Bottom of Page)"/>
         <w:docPartUnique w:val="true"/>
@@ -3986,7 +3825,7 @@
           <mc:AlternateContent>
             <mc:Choice Requires="wpg">
               <w:drawing>
-                <wp:anchor distT="0" distB="16510" distL="0" distR="23495" simplePos="0" relativeHeight="9" behindDoc="1" locked="0" layoutInCell="1" allowOverlap="1" wp14:anchorId="0A2BBC52">
+                <wp:anchor distT="0" distB="16510" distL="0" distR="23495" simplePos="0" relativeHeight="27" behindDoc="1" locked="0" layoutInCell="1" allowOverlap="1" wp14:anchorId="0694215B">
                   <wp:simplePos x="0" y="0"/>
                   <wp:positionH relativeFrom="column">
                     <wp:posOffset>5206365</wp:posOffset>
@@ -3997,7 +3836,7 @@
                   <wp:extent cx="1195070" cy="287655"/>
                   <wp:effectExtent l="9525" t="10795" r="10160" b="1270"/>
                   <wp:wrapNone/>
-                  <wp:docPr id="23" name="Grupo 1"/>
+                  <wp:docPr id="22" name="Grupo 1"/>
                   <a:graphic xmlns:a="http://schemas.openxmlformats.org/drawingml/2006/main">
                     <a:graphicData uri="http://schemas.microsoft.com/office/word/2010/wordprocessingGroup">
                       <wpg:wgp>
@@ -4012,7 +3851,7 @@
                         </wpg:grpSpPr>
                         <pic:pic xmlns:pic="http://schemas.openxmlformats.org/drawingml/2006/picture">
                           <pic:nvPicPr>
-                            <pic:cNvPr id="24" name="Imagen 1" descr="Logotipo&#10;&#10;Descripción generada automáticamente"/>
+                            <pic:cNvPr id="23" name="Imagen 1" descr="Logotipo&#10;&#10;Descripción generada automáticamente"/>
                             <pic:cNvPicPr/>
                           </pic:nvPicPr>
                           <pic:blipFill>
@@ -4034,7 +3873,7 @@
                           </pic:spPr>
                         </pic:pic>
                         <wps:wsp>
-                          <wps:cNvPr id="25" name="Rectángulo: esquinas redondeadas 2"/>
+                          <wps:cNvPr id="24" name="Rectángulo: esquinas redondeadas 2"/>
                           <wps:cNvSpPr/>
                           <wps:spPr>
                             <a:xfrm>
@@ -4187,7 +4026,7 @@
 <w:ftr xmlns:o="urn:schemas-microsoft-com:office:office" xmlns:r="http://schemas.openxmlformats.org/officeDocument/2006/relationships" xmlns:v="urn:schemas-microsoft-com:vml" xmlns:w="http://schemas.openxmlformats.org/wordprocessingml/2006/main" xmlns:w10="urn:schemas-microsoft-com:office:word" xmlns:wp="http://schemas.openxmlformats.org/drawingml/2006/wordprocessingDrawing" xmlns:pic="http://schemas.openxmlformats.org/drawingml/2006/picture" xmlns:wps="http://schemas.microsoft.com/office/word/2010/wordprocessingShape" xmlns:wpg="http://schemas.microsoft.com/office/word/2010/wordprocessingGroup" xmlns:mc="http://schemas.openxmlformats.org/markup-compatibility/2006" xmlns:wp14="http://schemas.microsoft.com/office/word/2010/wordprocessingDrawing" xmlns:w14="http://schemas.microsoft.com/office/word/2010/wordml" xmlns:w15="http://schemas.microsoft.com/office/word/2012/wordml" mc:Ignorable="w14 wp14 w15">
   <w:sdt>
     <w:sdtPr>
-      <w:id w:val="-770158945"/>
+      <w:id w:val="-529718792"/>
       <w:docPartObj>
         <w:docPartGallery w:val="Page Numbers (Bottom of Page)"/>
         <w:docPartUnique w:val="true"/>
@@ -4205,7 +4044,7 @@
           <mc:AlternateContent>
             <mc:Choice Requires="wpg">
               <w:drawing>
-                <wp:anchor distT="0" distB="16510" distL="0" distR="23495" simplePos="0" relativeHeight="20" behindDoc="1" locked="0" layoutInCell="1" allowOverlap="1" wp14:anchorId="0A2BBC52">
+                <wp:anchor distT="0" distB="16510" distL="0" distR="23495" simplePos="0" relativeHeight="38" behindDoc="1" locked="0" layoutInCell="1" allowOverlap="1" wp14:anchorId="0694215B">
                   <wp:simplePos x="0" y="0"/>
                   <wp:positionH relativeFrom="column">
                     <wp:posOffset>0</wp:posOffset>
@@ -4216,7 +4055,7 @@
                   <wp:extent cx="1195070" cy="287655"/>
                   <wp:effectExtent l="9525" t="10795" r="10160" b="1270"/>
                   <wp:wrapNone/>
-                  <wp:docPr id="29" name="Grupo 2"/>
+                  <wp:docPr id="28" name="Grupo 2"/>
                   <a:graphic xmlns:a="http://schemas.openxmlformats.org/drawingml/2006/main">
                     <a:graphicData uri="http://schemas.microsoft.com/office/word/2010/wordprocessingGroup">
                       <wpg:wgp>
@@ -4231,7 +4070,7 @@
                         </wpg:grpSpPr>
                         <pic:pic xmlns:pic="http://schemas.openxmlformats.org/drawingml/2006/picture">
                           <pic:nvPicPr>
-                            <pic:cNvPr id="30" name="Imagen 2" descr="Logotipo&#10;&#10;Descripción generada automáticamente"/>
+                            <pic:cNvPr id="29" name="Imagen 2" descr="Logotipo&#10;&#10;Descripción generada automáticamente"/>
                             <pic:cNvPicPr/>
                           </pic:nvPicPr>
                           <pic:blipFill>
@@ -4253,7 +4092,7 @@
                           </pic:spPr>
                         </pic:pic>
                         <wps:wsp>
-                          <wps:cNvPr id="31" name="Rectángulo: esquinas redondeadas 3"/>
+                          <wps:cNvPr id="30" name="Rectángulo: esquinas redondeadas 3"/>
                           <wps:cNvSpPr/>
                           <wps:spPr>
                             <a:xfrm>
@@ -4423,7 +4262,7 @@
           <wp:extent cx="2066290" cy="560705"/>
           <wp:effectExtent l="0" t="0" r="0" b="0"/>
           <wp:wrapNone/>
-          <wp:docPr id="9" name="Imagen 6">
+          <wp:docPr id="8" name="Imagen 6">
             <a:extLst xmlns:a="http://schemas.openxmlformats.org/drawingml/2006/main">
               <a:ext uri="{C183D7F6-B498-43B3-948B-1728B52AA6E4}">
                 <adec:decorative xmlns:adec="http://schemas.microsoft.com/office/drawing/2017/decorative" val="1"/>
@@ -4437,7 +4276,7 @@
             <a:graphicData uri="http://schemas.openxmlformats.org/drawingml/2006/picture">
               <pic:pic xmlns:pic="http://schemas.openxmlformats.org/drawingml/2006/picture">
                 <pic:nvPicPr>
-                  <pic:cNvPr id="9" name="Imagen 6"/>
+                  <pic:cNvPr id="8" name="Imagen 6"/>
                   <pic:cNvPicPr>
                     <a:picLocks noChangeAspect="1" noChangeArrowheads="1"/>
                   </pic:cNvPicPr>
@@ -4506,7 +4345,7 @@
     <w:r>
       <w:rPr/>
       <w:drawing>
-        <wp:anchor distT="0" distB="0" distL="0" distR="0" simplePos="0" relativeHeight="5" behindDoc="1" locked="0" layoutInCell="0" allowOverlap="1">
+        <wp:anchor distT="0" distB="0" distL="0" distR="0" simplePos="0" relativeHeight="23" behindDoc="1" locked="0" layoutInCell="0" allowOverlap="1">
           <wp:simplePos x="0" y="0"/>
           <wp:positionH relativeFrom="margin">
             <wp:posOffset>4344670</wp:posOffset>
@@ -4517,7 +4356,7 @@
           <wp:extent cx="2066290" cy="560705"/>
           <wp:effectExtent l="0" t="0" r="0" b="0"/>
           <wp:wrapNone/>
-          <wp:docPr id="22" name="Imagen5">
+          <wp:docPr id="21" name="Imagen4">
             <a:extLst xmlns:a="http://schemas.openxmlformats.org/drawingml/2006/main">
               <a:ext uri="{C183D7F6-B498-43B3-948B-1728B52AA6E4}">
                 <adec:decorative xmlns:adec="http://schemas.microsoft.com/office/drawing/2017/decorative" val="1"/>
@@ -4531,7 +4370,7 @@
             <a:graphicData uri="http://schemas.openxmlformats.org/drawingml/2006/picture">
               <pic:pic xmlns:pic="http://schemas.openxmlformats.org/drawingml/2006/picture">
                 <pic:nvPicPr>
-                  <pic:cNvPr id="22" name="Imagen5"/>
+                  <pic:cNvPr id="21" name="Imagen4"/>
                   <pic:cNvPicPr>
                     <a:picLocks noChangeAspect="1" noChangeArrowheads="1"/>
                   </pic:cNvPicPr>
@@ -4597,7 +4436,7 @@
           <wp:extent cx="2066290" cy="560705"/>
           <wp:effectExtent l="0" t="0" r="0" b="0"/>
           <wp:wrapNone/>
-          <wp:docPr id="28" name="Imagen5 Copia 1"/>
+          <wp:docPr id="27" name="Imagen4 Copia 1"/>
           <wp:cNvGraphicFramePr>
             <a:graphicFrameLocks xmlns:a="http://schemas.openxmlformats.org/drawingml/2006/main" noChangeAspect="1"/>
           </wp:cNvGraphicFramePr>
@@ -4605,7 +4444,7 @@
             <a:graphicData uri="http://schemas.openxmlformats.org/drawingml/2006/picture">
               <pic:pic xmlns:pic="http://schemas.openxmlformats.org/drawingml/2006/picture">
                 <pic:nvPicPr>
-                  <pic:cNvPr id="28" name="Imagen5 Copia 1"/>
+                  <pic:cNvPr id="27" name="Imagen4 Copia 1"/>
                   <pic:cNvPicPr>
                     <a:picLocks noChangeAspect="1" noChangeArrowheads="1"/>
                   </pic:cNvPicPr>
@@ -4909,6 +4748,7 @@
   </w:abstractNum>
   <w:abstractNum w:abstractNumId="3">
     <w:lvl w:ilvl="0">
+      <w:start w:val="1"/>
       <w:numFmt w:val="bullet"/>
       <w:lvlText w:val=""/>
       <w:lvlJc w:val="start"/>
@@ -5045,7 +4885,6 @@
   </w:abstractNum>
   <w:abstractNum w:abstractNumId="4">
     <w:lvl w:ilvl="0">
-      <w:start w:val="1"/>
       <w:numFmt w:val="bullet"/>
       <w:lvlText w:val=""/>
       <w:lvlJc w:val="start"/>
@@ -5322,7 +5161,7 @@
   <w:docDefaults>
     <w:rPrDefault>
       <w:rPr>
-        <w:rFonts w:ascii="Arial" w:hAnsi="Arial" w:eastAsia="Arial" w:cs="" w:asciiTheme="minorHAnsi" w:cstheme="minorBidi" w:eastAsiaTheme="minorHAnsi" w:hAnsiTheme="minorHAnsi"/>
+        <w:rFonts w:ascii="Arial" w:hAnsi="Arial" w:eastAsia="Arial" w:cs="Arial" w:asciiTheme="minorHAnsi" w:cstheme="minorBidi" w:eastAsiaTheme="minorHAnsi" w:hAnsiTheme="minorHAnsi"/>
         <w:kern w:val="2"/>
         <w:sz w:val="22"/>
         <w:szCs w:val="22"/>
@@ -5726,7 +5565,7 @@
       <w:jc w:val="start"/>
     </w:pPr>
     <w:rPr>
-      <w:rFonts w:ascii="Arial" w:hAnsi="Arial" w:eastAsia="Arial" w:cs=""/>
+      <w:rFonts w:ascii="Arial" w:hAnsi="Arial" w:eastAsia="Arial" w:cs="Arial"/>
       <w:color w:themeColor="text1" w:themeTint="bf" w:val="404040"/>
       <w:kern w:val="2"/>
       <w:sz w:val="24"/>
@@ -5750,7 +5589,7 @@
       <w:outlineLvl w:val="0"/>
     </w:pPr>
     <w:rPr>
-      <w:rFonts w:eastAsia="" w:cs="" w:cstheme="majorBidi" w:eastAsiaTheme="majorEastAsia"/>
+      <w:rFonts w:eastAsia="ＭＳ Ｐゴシック" w:cs="Arial" w:cstheme="majorBidi" w:eastAsiaTheme="majorEastAsia"/>
       <w:b/>
       <w:kern w:val="0"/>
       <w:sz w:val="44"/>
@@ -5774,7 +5613,7 @@
       <w:outlineLvl w:val="1"/>
     </w:pPr>
     <w:rPr>
-      <w:rFonts w:eastAsia="" w:cs="" w:cstheme="majorBidi" w:eastAsiaTheme="majorEastAsia"/>
+      <w:rFonts w:eastAsia="ＭＳ Ｐゴシック" w:cs="Arial" w:cstheme="majorBidi" w:eastAsiaTheme="majorEastAsia"/>
       <w:b/>
       <w:sz w:val="32"/>
       <w:szCs w:val="26"/>
@@ -5816,7 +5655,7 @@
     <w:qFormat/>
     <w:rsid w:val="00e05d9e"/>
     <w:rPr>
-      <w:rFonts w:ascii="Arial" w:hAnsi="Arial" w:eastAsia="" w:cs="" w:cstheme="majorBidi" w:eastAsiaTheme="majorEastAsia"/>
+      <w:rFonts w:ascii="Arial" w:hAnsi="Arial" w:eastAsia="ＭＳ Ｐゴシック" w:cs="Arial" w:cstheme="majorBidi" w:eastAsiaTheme="majorEastAsia"/>
       <w:b/>
       <w:color w:themeColor="text1" w:themeTint="bf" w:val="404040"/>
       <w:spacing w:val="-10"/>
@@ -5831,9 +5670,9 @@
     <w:basedOn w:val="TtuloCar"/>
     <w:link w:val="carrera1"/>
     <w:qFormat/>
-    <w:rsid w:val="006873b9"/>
+    <w:rsid w:val="00c709bc"/>
     <w:rPr>
-      <w:rFonts w:ascii="Arial" w:hAnsi="Arial" w:eastAsia="" w:cs="" w:cstheme="majorBidi" w:eastAsiaTheme="majorEastAsia"/>
+      <w:rFonts w:ascii="Arial" w:hAnsi="Arial" w:eastAsia="ＭＳ Ｐゴシック" w:cs="Arial" w:cstheme="majorBidi" w:eastAsiaTheme="majorEastAsia"/>
       <w:b/>
       <w:color w:themeColor="text1" w:themeTint="bf" w:val="404040"/>
       <w:spacing w:val="-10"/>
@@ -5848,9 +5687,9 @@
     <w:basedOn w:val="carrera1Car"/>
     <w:link w:val="carrera2"/>
     <w:qFormat/>
-    <w:rsid w:val="006873b9"/>
+    <w:rsid w:val="00c709bc"/>
     <w:rPr>
-      <w:rFonts w:ascii="Arial" w:hAnsi="Arial" w:eastAsia="" w:cs="" w:cstheme="majorBidi" w:eastAsiaTheme="majorEastAsia"/>
+      <w:rFonts w:ascii="Arial" w:hAnsi="Arial" w:eastAsia="ＭＳ Ｐゴシック" w:cs="Arial" w:cstheme="majorBidi" w:eastAsiaTheme="majorEastAsia"/>
       <w:b/>
       <w:color w:themeColor="text1" w:themeTint="bf" w:val="404040"/>
       <w:spacing w:val="-10"/>
@@ -5867,7 +5706,7 @@
     <w:qFormat/>
     <w:rsid w:val="00241db1"/>
     <w:rPr>
-      <w:rFonts w:ascii="Arial" w:hAnsi="Arial" w:eastAsia="" w:cs="" w:cstheme="majorBidi" w:eastAsiaTheme="majorEastAsia"/>
+      <w:rFonts w:ascii="Arial" w:hAnsi="Arial" w:eastAsia="ＭＳ Ｐゴシック" w:cs="Arial" w:cstheme="majorBidi" w:eastAsiaTheme="majorEastAsia"/>
       <w:b/>
       <w:color w:themeColor="text1" w:themeTint="bf" w:val="404040"/>
       <w:kern w:val="0"/>
@@ -5950,7 +5789,7 @@
     <w:qFormat/>
     <w:rsid w:val="0065508a"/>
     <w:rPr>
-      <w:rFonts w:ascii="Arial" w:hAnsi="Arial" w:eastAsia="" w:cs="" w:cstheme="majorBidi" w:eastAsiaTheme="majorEastAsia"/>
+      <w:rFonts w:ascii="Arial" w:hAnsi="Arial" w:eastAsia="ＭＳ Ｐゴシック" w:cs="Arial" w:cstheme="majorBidi" w:eastAsiaTheme="majorEastAsia"/>
       <w:b/>
       <w:color w:themeColor="text1" w:themeTint="bf" w:val="404040"/>
       <w:sz w:val="32"/>
@@ -6081,7 +5920,7 @@
       <w:contextualSpacing/>
     </w:pPr>
     <w:rPr>
-      <w:rFonts w:eastAsia="" w:cs="" w:cstheme="majorBidi" w:eastAsiaTheme="majorEastAsia"/>
+      <w:rFonts w:eastAsia="ＭＳ Ｐゴシック" w:cs="Arial" w:cstheme="majorBidi" w:eastAsiaTheme="majorEastAsia"/>
       <w:b/>
       <w:spacing w:val="-10"/>
       <w:kern w:val="2"/>
@@ -6108,7 +5947,7 @@
     <w:next w:val="carrera2"/>
     <w:link w:val="carrera1Car"/>
     <w:qFormat/>
-    <w:rsid w:val="006873b9"/>
+    <w:rsid w:val="00c709bc"/>
     <w:pPr/>
     <w:rPr>
       <w:sz w:val="48"/>
@@ -6118,7 +5957,7 @@
     <w:name w:val="carrera2"/>
     <w:link w:val="carrera2Car"/>
     <w:qFormat/>
-    <w:rsid w:val="006873b9"/>
+    <w:rsid w:val="00c709bc"/>
     <w:pPr>
       <w:widowControl/>
       <w:bidi w:val="0"/>
@@ -6127,7 +5966,7 @@
       <w:jc w:val="start"/>
     </w:pPr>
     <w:rPr>
-      <w:rFonts w:ascii="Arial" w:hAnsi="Arial" w:eastAsia="" w:cs="" w:cstheme="majorBidi" w:eastAsiaTheme="majorEastAsia"/>
+      <w:rFonts w:ascii="Arial" w:hAnsi="Arial" w:eastAsia="ＭＳ Ｐゴシック" w:cs="Arial" w:cstheme="majorBidi" w:eastAsiaTheme="majorEastAsia"/>
       <w:b/>
       <w:color w:themeColor="text1" w:themeTint="bf" w:val="404040"/>
       <w:spacing w:val="-10"/>
@@ -6209,7 +6048,6 @@
         <w:numId w:val="1"/>
       </w:numPr>
       <w:spacing w:before="0" w:after="160"/>
-      <w:ind w:start="360"/>
       <w:contextualSpacing/>
     </w:pPr>
     <w:rPr>
@@ -6353,7 +6191,7 @@
     <w:basedOn w:val="Normal"/>
     <w:uiPriority w:val="1"/>
     <w:qFormat/>
-    <w:rsid w:val="006873b9"/>
+    <w:rsid w:val="00c709bc"/>
     <w:pPr>
       <w:spacing w:lineRule="auto" w:line="259"/>
     </w:pPr>
@@ -6369,7 +6207,7 @@
     <w:basedOn w:val="Normal"/>
     <w:uiPriority w:val="1"/>
     <w:qFormat/>
-    <w:rsid w:val="00220e71"/>
+    <w:rsid w:val="00c20947"/>
     <w:pPr>
       <w:spacing w:lineRule="auto" w:line="259"/>
     </w:pPr>
@@ -6616,12 +6454,26 @@
 </file>
 
 <file path=customXml/item2.xml><?xml version="1.0" encoding="utf-8"?>
-<?mso-contentType ?>
-<FormTemplates xmlns="http://schemas.microsoft.com/sharepoint/v3/contenttype/forms">
-  <Display>DocumentLibraryForm</Display>
-  <Edit>DocumentLibraryForm</Edit>
-  <New>DocumentLibraryForm</New>
-</FormTemplates>
+<p:properties xmlns:p="http://schemas.microsoft.com/office/2006/metadata/properties" xmlns:xsi="http://www.w3.org/2001/XMLSchema-instance" xmlns:pc="http://schemas.microsoft.com/office/infopath/2007/PartnerControls">
+  <documentManagement>
+    <lcf76f155ced4ddcb4097134ff3c332f xmlns="d0daa353-f819-43d1-badf-ce69fea8800d">
+      <Terms xmlns="http://schemas.microsoft.com/office/infopath/2007/PartnerControls"/>
+    </lcf76f155ced4ddcb4097134ff3c332f>
+    <TaxCatchAll xmlns="edc1eb1c-f9b5-429a-a0ce-702847a0aa2d" xsi:nil="true"/>
+    <Fecha_x0020_de_x0020_creaci_x00f3_n xmlns="d0daa353-f819-43d1-badf-ce69fea8800d" xsi:nil="true"/>
+    <Fechayhora xmlns="d0daa353-f819-43d1-badf-ce69fea8800d" xsi:nil="true"/>
+    <SharedWithUsers xmlns="edc1eb1c-f9b5-429a-a0ce-702847a0aa2d">
+      <UserInfo>
+        <DisplayName/>
+        <AccountId xsi:nil="true"/>
+        <AccountType/>
+      </UserInfo>
+    </SharedWithUsers>
+    <MediaLengthInSeconds xmlns="d0daa353-f819-43d1-badf-ce69fea8800d" xsi:nil="true"/>
+    <_ip_UnifiedCompliancePolicyUIAction xmlns="http://schemas.microsoft.com/sharepoint/v3" xsi:nil="true"/>
+    <_ip_UnifiedCompliancePolicyProperties xmlns="http://schemas.microsoft.com/sharepoint/v3" xsi:nil="true"/>
+  </documentManagement>
+</p:properties>
 </file>
 
 <file path=customXml/item3.xml><?xml version="1.0" encoding="utf-8"?>
@@ -6903,30 +6755,16 @@
 </file>
 
 <file path=customXml/item4.xml><?xml version="1.0" encoding="utf-8"?>
-<p:properties xmlns:p="http://schemas.microsoft.com/office/2006/metadata/properties" xmlns:xsi="http://www.w3.org/2001/XMLSchema-instance" xmlns:pc="http://schemas.microsoft.com/office/infopath/2007/PartnerControls">
-  <documentManagement>
-    <lcf76f155ced4ddcb4097134ff3c332f xmlns="d0daa353-f819-43d1-badf-ce69fea8800d">
-      <Terms xmlns="http://schemas.microsoft.com/office/infopath/2007/PartnerControls"/>
-    </lcf76f155ced4ddcb4097134ff3c332f>
-    <TaxCatchAll xmlns="edc1eb1c-f9b5-429a-a0ce-702847a0aa2d" xsi:nil="true"/>
-    <Fecha_x0020_de_x0020_creaci_x00f3_n xmlns="d0daa353-f819-43d1-badf-ce69fea8800d" xsi:nil="true"/>
-    <Fechayhora xmlns="d0daa353-f819-43d1-badf-ce69fea8800d" xsi:nil="true"/>
-    <SharedWithUsers xmlns="edc1eb1c-f9b5-429a-a0ce-702847a0aa2d">
-      <UserInfo>
-        <DisplayName/>
-        <AccountId xsi:nil="true"/>
-        <AccountType/>
-      </UserInfo>
-    </SharedWithUsers>
-    <MediaLengthInSeconds xmlns="d0daa353-f819-43d1-badf-ce69fea8800d" xsi:nil="true"/>
-    <_ip_UnifiedCompliancePolicyUIAction xmlns="http://schemas.microsoft.com/sharepoint/v3" xsi:nil="true"/>
-    <_ip_UnifiedCompliancePolicyProperties xmlns="http://schemas.microsoft.com/sharepoint/v3" xsi:nil="true"/>
-  </documentManagement>
-</p:properties>
+<?mso-contentType ?>
+<FormTemplates xmlns="http://schemas.microsoft.com/sharepoint/v3/contenttype/forms">
+  <Display>DocumentLibraryForm</Display>
+  <Edit>DocumentLibraryForm</Edit>
+  <New>DocumentLibraryForm</New>
+</FormTemplates>
 </file>
 
 <file path=customXml/itemProps1.xml><?xml version="1.0" encoding="utf-8"?>
-<ds:datastoreItem xmlns:ds="http://schemas.openxmlformats.org/officeDocument/2006/customXml" ds:itemID="{DEB73F9D-F662-47F0-B1B4-CC4EDF51573A}">
+<ds:datastoreItem xmlns:ds="http://schemas.openxmlformats.org/officeDocument/2006/customXml" ds:itemID="{6885F90C-BB57-4945-ACE1-53E888896D91}">
   <ds:schemaRefs>
     <ds:schemaRef ds:uri="http://schemas.openxmlformats.org/officeDocument/2006/bibliography"/>
   </ds:schemaRefs>
@@ -6934,18 +6772,6 @@
 </file>
 
 <file path=customXml/itemProps2.xml><?xml version="1.0" encoding="utf-8"?>
-<ds:datastoreItem xmlns:ds="http://schemas.openxmlformats.org/officeDocument/2006/customXml" ds:itemID="{58D8DE95-DF74-49C6-8885-90B115E8F94F}">
-  <ds:schemaRefs>
-    <ds:schemaRef ds:uri="http://schemas.microsoft.com/sharepoint/v3/contenttype/forms"/>
-  </ds:schemaRefs>
-</ds:datastoreItem>
-</file>
-
-<file path=customXml/itemProps3.xml><?xml version="1.0" encoding="utf-8"?>
-<ds:datastoreItem xmlns:ds="http://schemas.openxmlformats.org/officeDocument/2006/customXml" ds:itemID="{214206EF-2479-4493-BC83-B01338DF13B8}"/>
-</file>
-
-<file path=customXml/itemProps4.xml><?xml version="1.0" encoding="utf-8"?>
 <ds:datastoreItem xmlns:ds="http://schemas.openxmlformats.org/officeDocument/2006/customXml" ds:itemID="{C39D5494-1847-4215-BB00-A838605872D2}">
   <ds:schemaRefs>
     <ds:schemaRef ds:uri="http://schemas.microsoft.com/office/2006/metadata/properties"/>
@@ -6954,4 +6780,16 @@
     <ds:schemaRef ds:uri="edc1eb1c-f9b5-429a-a0ce-702847a0aa2d"/>
   </ds:schemaRefs>
 </ds:datastoreItem>
+</file>
+
+<file path=customXml/itemProps3.xml><?xml version="1.0" encoding="utf-8"?>
+<ds:datastoreItem xmlns:ds="http://schemas.openxmlformats.org/officeDocument/2006/customXml" ds:itemID="{47EF2022-71B6-49E9-B4B3-406B4472E9BD}"/>
+</file>
+
+<file path=customXml/itemProps4.xml><?xml version="1.0" encoding="utf-8"?>
+<ds:datastoreItem xmlns:ds="http://schemas.openxmlformats.org/officeDocument/2006/customXml" ds:itemID="{58D8DE95-DF74-49C6-8885-90B115E8F94F}">
+  <ds:schemaRefs>
+    <ds:schemaRef ds:uri="http://schemas.microsoft.com/sharepoint/v3/contenttype/forms"/>
+  </ds:schemaRefs>
+</ds:datastoreItem>
 </file>
</xml_diff>

<commit_message>
Adv: Se agrega encargo semana 4
</commit_message>
<xml_diff>
--- a/Encargo_Semanal.docx
+++ b/Encargo_Semanal.docx
@@ -10,7 +10,7 @@
       <w:r>
         <w:rPr/>
         <w:drawing>
-          <wp:anchor distT="0" distB="0" distL="0" distR="0" simplePos="0" relativeHeight="28" behindDoc="0" locked="0" layoutInCell="1" allowOverlap="1">
+          <wp:anchor distT="0" distB="0" distL="0" distR="0" simplePos="0" relativeHeight="29" behindDoc="0" locked="0" layoutInCell="1" allowOverlap="1">
             <wp:simplePos x="0" y="0"/>
             <wp:positionH relativeFrom="column">
               <wp:posOffset>-434340</wp:posOffset>
@@ -64,7 +64,7 @@
         <mc:AlternateContent>
           <mc:Choice Requires="wps">
             <w:drawing>
-              <wp:anchor distT="0" distB="3810" distL="0" distR="0" simplePos="0" relativeHeight="29" behindDoc="0" locked="0" layoutInCell="1" allowOverlap="1" wp14:anchorId="693102DD">
+              <wp:anchor distT="0" distB="3810" distL="0" distR="0" simplePos="0" relativeHeight="30" behindDoc="0" locked="0" layoutInCell="1" allowOverlap="1" wp14:anchorId="693102DD">
                 <wp:simplePos x="0" y="0"/>
                 <wp:positionH relativeFrom="column">
                   <wp:posOffset>1927860</wp:posOffset>
@@ -131,7 +131,7 @@
         <mc:AlternateContent>
           <mc:Choice Requires="wps">
             <w:drawing>
-              <wp:anchor distT="0" distB="0" distL="0" distR="3810" simplePos="0" relativeHeight="30" behindDoc="0" locked="0" layoutInCell="1" allowOverlap="1" wp14:anchorId="36699E54">
+              <wp:anchor distT="0" distB="0" distL="0" distR="3810" simplePos="0" relativeHeight="31" behindDoc="0" locked="0" layoutInCell="1" allowOverlap="1" wp14:anchorId="36699E54">
                 <wp:simplePos x="0" y="0"/>
                 <wp:positionH relativeFrom="column">
                   <wp:posOffset>-325120</wp:posOffset>
@@ -299,7 +299,7 @@
         <mc:AlternateContent>
           <mc:Choice Requires="wps">
             <w:drawing>
-              <wp:anchor distT="0" distB="4445" distL="0" distR="5715" simplePos="0" relativeHeight="31" behindDoc="0" locked="0" layoutInCell="1" allowOverlap="1" wp14:anchorId="3BFABDE3">
+              <wp:anchor distT="0" distB="4445" distL="0" distR="5715" simplePos="0" relativeHeight="32" behindDoc="0" locked="0" layoutInCell="1" allowOverlap="1" wp14:anchorId="3BFABDE3">
                 <wp:simplePos x="0" y="0"/>
                 <wp:positionH relativeFrom="column">
                   <wp:posOffset>-315595</wp:posOffset>
@@ -372,7 +372,7 @@
       </w:pPr>
       <w:r>
         <w:rPr/>
-        <w:t>Semana 3</w:t>
+        <w:t>Semana 4</w:t>
       </w:r>
     </w:p>
     <w:p>
@@ -417,7 +417,7 @@
           <w:bottom w:w="0" w:type="dxa"/>
           <w:end w:w="108" w:type="dxa"/>
         </w:tblCellMar>
-        <w:tblLook w:val="06a0" w:firstRow="1" w:noVBand="1" w:lastRow="0" w:firstColumn="1" w:lastColumn="0" w:noHBand="1"/>
+        <w:tblLook w:val="04a0" w:firstRow="1" w:noVBand="1" w:lastRow="0" w:firstColumn="1" w:lastColumn="0" w:noHBand="0"/>
       </w:tblPr>
       <w:tblGrid>
         <w:gridCol w:w="4961"/>
@@ -446,7 +446,7 @@
               <w:spacing w:lineRule="auto" w:line="240" w:before="120" w:after="0"/>
               <w:jc w:val="start"/>
               <w:rPr>
-                <w:rFonts w:eastAsia="Arial" w:cs="Arial"/>
+                <w:rFonts w:eastAsia="Arial" w:cs=""/>
                 <w:kern w:val="0"/>
                 <w:szCs w:val="22"/>
                 <w:lang w:val="es-CL" w:eastAsia="en-US" w:bidi="ar-SA"/>
@@ -454,7 +454,7 @@
             </w:pPr>
             <w:r>
               <w:rPr>
-                <w:rFonts w:eastAsia="Arial" w:cs="Arial"/>
+                <w:rFonts w:eastAsia="Arial" w:cs=""/>
                 <w:b/>
                 <w:bCs/>
                 <w:kern w:val="0"/>
@@ -465,14 +465,14 @@
             </w:r>
             <w:r>
               <w:rPr>
-                <w:rFonts w:eastAsia="Arial" w:cs="Arial"/>
+                <w:rFonts w:eastAsia="Arial" w:cs=""/>
                 <w:b/>
                 <w:bCs/>
                 <w:kern w:val="0"/>
                 <w:szCs w:val="22"/>
                 <w:lang w:val="es-CL" w:eastAsia="en-US" w:bidi="ar-SA"/>
               </w:rPr>
-              <w:t>Yerko Cortes Baeza</w:t>
+              <w:t>Yerko Cortes – Christopher Zuniga</w:t>
             </w:r>
           </w:p>
         </w:tc>
@@ -494,7 +494,7 @@
               <w:spacing w:lineRule="auto" w:line="240" w:before="120" w:after="0"/>
               <w:jc w:val="start"/>
               <w:rPr>
-                <w:rFonts w:eastAsia="Arial" w:cs="Arial"/>
+                <w:rFonts w:eastAsia="Arial" w:cs=""/>
                 <w:kern w:val="0"/>
                 <w:szCs w:val="22"/>
                 <w:lang w:val="es-CL" w:eastAsia="en-US" w:bidi="ar-SA"/>
@@ -502,7 +502,7 @@
             </w:pPr>
             <w:r>
               <w:rPr>
-                <w:rFonts w:eastAsia="Arial" w:cs="Arial"/>
+                <w:rFonts w:eastAsia="Arial" w:cs=""/>
                 <w:kern w:val="0"/>
                 <w:szCs w:val="22"/>
                 <w:lang w:val="es-CL" w:eastAsia="en-US" w:bidi="ar-SA"/>
@@ -540,7 +540,7 @@
             </w:pPr>
             <w:r>
               <w:rPr>
-                <w:rFonts w:eastAsia="Arial" w:cs="Arial"/>
+                <w:rFonts w:eastAsia="Arial" w:cs=""/>
                 <w:b/>
                 <w:bCs/>
                 <w:kern w:val="0"/>
@@ -551,7 +551,7 @@
             </w:r>
             <w:r>
               <w:rPr>
-                <w:rFonts w:eastAsia="Arial" w:cs="Arial"/>
+                <w:rFonts w:eastAsia="Arial" w:cs=""/>
                 <w:b/>
                 <w:bCs/>
                 <w:kern w:val="0"/>
@@ -586,7 +586,7 @@
             </w:pPr>
             <w:r>
               <w:rPr>
-                <w:rFonts w:eastAsia="Arial" w:cs="Arial"/>
+                <w:rFonts w:eastAsia="Arial" w:cs=""/>
                 <w:b/>
                 <w:bCs/>
                 <w:kern w:val="0"/>
@@ -597,7 +597,7 @@
             </w:r>
             <w:r>
               <w:rPr>
-                <w:rFonts w:eastAsia="Arial" w:cs="Arial"/>
+                <w:rFonts w:eastAsia="Arial" w:cs=""/>
                 <w:b/>
                 <w:bCs/>
                 <w:kern w:val="0"/>
@@ -632,7 +632,7 @@
               <w:spacing w:lineRule="auto" w:line="240" w:before="120" w:after="0"/>
               <w:jc w:val="start"/>
               <w:rPr>
-                <w:rFonts w:eastAsia="Arial" w:cs="Arial"/>
+                <w:rFonts w:eastAsia="Arial" w:cs=""/>
                 <w:kern w:val="0"/>
                 <w:szCs w:val="22"/>
                 <w:lang w:val="es-CL" w:eastAsia="en-US" w:bidi="ar-SA"/>
@@ -640,25 +640,25 @@
             </w:pPr>
             <w:r>
               <w:rPr>
-                <w:rFonts w:eastAsia="Arial" w:cs="Arial"/>
+                <w:rFonts w:eastAsia="Arial" w:cs=""/>
                 <w:b/>
                 <w:bCs/>
                 <w:kern w:val="0"/>
                 <w:szCs w:val="22"/>
                 <w:lang w:val="es-CL" w:eastAsia="en-US" w:bidi="ar-SA"/>
               </w:rPr>
-              <w:t>Profesor:</w:t>
+              <w:t xml:space="preserve">Profesor: </w:t>
             </w:r>
             <w:r>
               <w:rPr>
-                <w:rFonts w:eastAsia="Arial" w:cs="Arial"/>
+                <w:rFonts w:eastAsia="Arial" w:cs=""/>
                 <w:b/>
                 <w:bCs/>
                 <w:kern w:val="0"/>
                 <w:szCs w:val="22"/>
                 <w:lang w:val="es-CL" w:eastAsia="en-US" w:bidi="ar-SA"/>
               </w:rPr>
-              <w:t>Armando Romero Muñoz</w:t>
+              <w:t>Armando Romero</w:t>
             </w:r>
           </w:p>
         </w:tc>
@@ -680,7 +680,7 @@
               <w:spacing w:lineRule="auto" w:line="240" w:before="120" w:after="0"/>
               <w:jc w:val="start"/>
               <w:rPr>
-                <w:rFonts w:eastAsia="Arial" w:cs="Arial"/>
+                <w:rFonts w:eastAsia="Arial" w:cs=""/>
                 <w:kern w:val="0"/>
                 <w:szCs w:val="22"/>
                 <w:lang w:val="es-CL" w:eastAsia="en-US" w:bidi="ar-SA"/>
@@ -688,25 +688,25 @@
             </w:pPr>
             <w:r>
               <w:rPr>
-                <w:rFonts w:eastAsia="Arial" w:cs="Arial"/>
+                <w:rFonts w:eastAsia="Arial" w:cs=""/>
                 <w:b/>
                 <w:bCs/>
                 <w:kern w:val="0"/>
                 <w:szCs w:val="22"/>
                 <w:lang w:val="es-CL" w:eastAsia="en-US" w:bidi="ar-SA"/>
               </w:rPr>
-              <w:t>Fecha:</w:t>
+              <w:t xml:space="preserve">Fecha: </w:t>
             </w:r>
             <w:r>
               <w:rPr>
-                <w:rFonts w:eastAsia="Arial" w:cs="Arial"/>
+                <w:rFonts w:eastAsia="Arial" w:cs=""/>
                 <w:b/>
                 <w:bCs/>
                 <w:kern w:val="0"/>
                 <w:szCs w:val="22"/>
                 <w:lang w:val="es-CL" w:eastAsia="en-US" w:bidi="ar-SA"/>
               </w:rPr>
-              <w:t>31-08-2026</w:t>
+              <w:t>07-09-2026</w:t>
             </w:r>
           </w:p>
         </w:tc>
@@ -715,6 +715,7 @@
     <w:p>
       <w:pPr>
         <w:pStyle w:val="Normal"/>
+        <w:ind w:start="459"/>
         <w:rPr/>
       </w:pPr>
       <w:r>
@@ -742,7 +743,137 @@
       </w:pPr>
       <w:r>
         <w:rPr/>
-        <w:t>En esta tercera semana, realizarás una actividad sumativa individual llamada "Modelando jerarquía entre entidades", donde deberás dar solución al caso de negocio planteado, desarrollando un Modelo Entidad-Relación-Extendido (MER-E) basado en un contexto de la vida real. En esta actividad, será necesario que:</w:t>
+        <w:t xml:space="preserve">En esta cuarta semana, realizarás una actividad formativa en pareja llamada "Modelando y Normalizando datos", donde deberás dar solución al caso de negocio planteado, desarrollando un Modelo Entidad-Relación-Extendido (MER-E) normalizado (1FN, 2FN y 3FN) basado en un contexto de la vida real. En esta actividad, será necesario que identifiques todas las entidades, así como las relaciones entre ellas, con sus identificadores únicos, atributos obligatorios y opcionales, los supertipos y subtipos de ser necesarios. </w:t>
+      </w:r>
+    </w:p>
+    <w:p>
+      <w:pPr>
+        <w:pStyle w:val="Normal"/>
+        <w:rPr/>
+      </w:pPr>
+      <w:r>
+        <w:rPr/>
+        <w:t xml:space="preserve">Además, deberás analizar y determinar los tipos de datos más adecuados para cada atributo, así como su dominio. </w:t>
+      </w:r>
+    </w:p>
+    <w:p>
+      <w:pPr>
+        <w:pStyle w:val="Normal"/>
+        <w:rPr/>
+      </w:pPr>
+      <w:r>
+        <w:rPr/>
+      </w:r>
+    </w:p>
+    <w:p>
+      <w:pPr>
+        <w:pStyle w:val="Heading2"/>
+        <w:rPr/>
+      </w:pPr>
+      <w:r>
+        <w:rPr/>
+        <w:t>Instrucciones específicas</w:t>
+      </w:r>
+    </w:p>
+    <w:p>
+      <w:pPr>
+        <w:pStyle w:val="Normal"/>
+        <w:rPr/>
+      </w:pPr>
+      <w:r>
+        <w:rPr/>
+        <w:t>Para realizar la actividad formativa de la semana, analizaremos el siguiente caso:</w:t>
+      </w:r>
+    </w:p>
+    <w:p>
+      <w:pPr>
+        <w:pStyle w:val="Heading3"/>
+        <w:rPr>
+          <w:lang w:val="es-ES"/>
+        </w:rPr>
+      </w:pPr>
+      <w:r>
+        <w:rPr/>
+        <w:t>CONTEXTO CASO:</w:t>
+      </w:r>
+      <w:r>
+        <w:rPr>
+          <w:lang w:val="es-MX"/>
+        </w:rPr>
+        <w:t xml:space="preserve"> Ministerio del Trabajo de Chile</w:t>
+      </w:r>
+    </w:p>
+    <w:p>
+      <w:pPr>
+        <w:pStyle w:val="Normal"/>
+        <w:rPr>
+          <w:lang w:val="es-ES"/>
+        </w:rPr>
+      </w:pPr>
+      <w:r>
+        <w:rPr>
+          <w:lang w:val="es-MX"/>
+        </w:rPr>
+        <w:t>El constante avance de las tecnologías de la información, presente en todas las industrias a nivel global, ha dado lugar a la proliferación de empresas que han evolucionado hasta convertirse en grandes corporaciones. En este contexto, empresas como Microsoft, Cisco Systems, Apple, Amazon, Oracle, Google, y otras grandes del sector están firmando convenios con distintos países para seleccionar y posteriormente contratar, mediante un concurso público, a los mejores profesionales en el campo de las TICs.</w:t>
+      </w:r>
+      <w:r>
+        <w:rPr>
+          <w:lang w:val="es-ES"/>
+        </w:rPr>
+        <w:t> </w:t>
+      </w:r>
+    </w:p>
+    <w:p>
+      <w:pPr>
+        <w:pStyle w:val="Normal"/>
+        <w:rPr>
+          <w:lang w:val="es-ES"/>
+        </w:rPr>
+      </w:pPr>
+      <w:r>
+        <w:rPr>
+          <w:lang w:val="es-MX"/>
+        </w:rPr>
+        <w:t>En este marco, se le ha encargado a usted el diseño de una base de datos normalizada a cargo del Ministerio del Trabajo de Chile, cuyo objetivo es almacenar toda la información relevante de los postulantes, evitando redundancias en los datos. La misión será crear un modelo Modelo Entidad Relación Extendido de alta calidad aplicando las 3 Formas Normales, de acuerdo con las siguientes especificaciones:</w:t>
+      </w:r>
+      <w:r>
+        <w:rPr>
+          <w:lang w:val="es-ES"/>
+        </w:rPr>
+        <w:t> </w:t>
+      </w:r>
+    </w:p>
+    <w:p>
+      <w:pPr>
+        <w:pStyle w:val="Normal"/>
+        <w:ind w:start="459"/>
+        <w:rPr/>
+      </w:pPr>
+      <w:r>
+        <w:rPr>
+          <w:rFonts w:asciiTheme="majorHAnsi" w:hAnsiTheme="majorHAnsi"/>
+          <w:szCs w:val="24"/>
+          <w:lang w:val="es-ES"/>
+        </w:rPr>
+        <w:t> </w:t>
+      </w:r>
+      <w:r>
+        <w:br w:type="page"/>
+      </w:r>
+    </w:p>
+    <w:p>
+      <w:pPr>
+        <w:pStyle w:val="Heading3"/>
+        <w:spacing w:before="0" w:after="120"/>
+        <w:rPr>
+          <w:lang w:val="es-ES"/>
+        </w:rPr>
+      </w:pPr>
+      <w:r>
+        <w:rPr>
+          <w:lang w:val="es-MX"/>
+        </w:rPr>
+        <w:t>Reglas de negocio</w:t>
       </w:r>
     </w:p>
     <w:p>
@@ -750,101 +881,9 @@
         <w:pStyle w:val="ListParagraph"/>
         <w:numPr>
           <w:ilvl w:val="0"/>
-          <w:numId w:val="4"/>
+          <w:numId w:val="1"/>
         </w:numPr>
-        <w:rPr/>
-      </w:pPr>
-      <w:r>
-        <w:rPr/>
-        <w:t>Identifiques todas las entidades, los supertipos y subtipos con sus atributos identificadores, atributos obligatorios y opcionales.</w:t>
-      </w:r>
-    </w:p>
-    <w:p>
-      <w:pPr>
-        <w:pStyle w:val="ListParagraph"/>
-        <w:numPr>
-          <w:ilvl w:val="0"/>
-          <w:numId w:val="4"/>
-        </w:numPr>
-        <w:rPr/>
-      </w:pPr>
-      <w:r>
-        <w:rPr/>
-        <w:t>Identifiques las relaciones entre las entidades.</w:t>
-      </w:r>
-    </w:p>
-    <w:p>
-      <w:pPr>
-        <w:pStyle w:val="ListParagraph"/>
-        <w:numPr>
-          <w:ilvl w:val="0"/>
-          <w:numId w:val="4"/>
-        </w:numPr>
-        <w:rPr/>
-      </w:pPr>
-      <w:r>
-        <w:rPr/>
-        <w:t xml:space="preserve">Analices y determines los tipos de datos más </w:t>
-      </w:r>
-      <w:r>
-        <w:rPr>
-          <w:u w:val="none"/>
-        </w:rPr>
-        <w:t>adecuados</w:t>
-      </w:r>
-      <w:r>
-        <w:rPr/>
-        <w:t xml:space="preserve"> para cada atributo, así como su dominio. </w:t>
-      </w:r>
-    </w:p>
-    <w:p>
-      <w:pPr>
-        <w:pStyle w:val="Normal"/>
-        <w:rPr/>
-      </w:pPr>
-      <w:r>
-        <w:rPr/>
-      </w:r>
-    </w:p>
-    <w:p>
-      <w:pPr>
-        <w:pStyle w:val="Heading2"/>
-        <w:rPr/>
-      </w:pPr>
-      <w:r>
-        <w:rPr/>
-        <w:t>Instrucciones específicas</w:t>
-      </w:r>
-    </w:p>
-    <w:p>
-      <w:pPr>
-        <w:pStyle w:val="Normal"/>
-        <w:rPr/>
-      </w:pPr>
-      <w:r>
-        <w:rPr/>
-        <w:t>Para llevar a cabo la actividad sumativa de la semana, a continuación te presentaremos el</w:t>
-        <w:br/>
-        <w:t>contexto de negocio que deberás analizar en detalle:</w:t>
-      </w:r>
-    </w:p>
-    <w:p>
-      <w:pPr>
-        <w:pStyle w:val="Normal"/>
-        <w:rPr>
-          <w:rStyle w:val="Ttulo3Car"/>
-        </w:rPr>
-      </w:pPr>
-      <w:r>
-        <w:rPr>
-          <w:rStyle w:val="Ttulo3Car"/>
-        </w:rPr>
-        <w:t xml:space="preserve">CONTEXTO CASO: Compañía HiLogic Solutions </w:t>
-      </w:r>
-    </w:p>
-    <w:p>
-      <w:pPr>
-        <w:pStyle w:val="Normal"/>
+        <w:ind w:hanging="360" w:start="360"/>
         <w:rPr>
           <w:lang w:val="es-MX"/>
         </w:rPr>
@@ -853,237 +892,30 @@
         <w:rPr>
           <w:lang w:val="es-MX"/>
         </w:rPr>
-        <w:t xml:space="preserve">HiLogic Solutions es una empresa especializada en la comercialización de productos y servicios tecnológicos, con el objetivo de satisfacer las necesidades tanto de empresas como de consumidores individuales. En un mercado caracterizado por la constante innovación, HiLogic se ha consolidado como un actor clave, ofreciendo soluciones tecnológicas avanzadas en áreas como hardware, dispositivos móviles y equipos de comunicación. </w:t>
-      </w:r>
-    </w:p>
-    <w:p>
-      <w:pPr>
-        <w:pStyle w:val="Normal"/>
-        <w:rPr/>
-      </w:pPr>
-      <w:r>
-        <w:rPr>
-          <w:lang w:val="es-MX"/>
-        </w:rPr>
-        <w:t>Actualmente la empresa ofrece una variedad de productos de tecnología a un muy buen precio, tales como: PC, teléfonos celulares, módems, notebooks, impresoras, dispositivos tecnológicos, y una variedad de accesorios, que ofrece en ocho sucursales ubicadas estratégicamente.  Existe la posibilidad de abrir cinco nuevas sucursales en los próximos años.</w:t>
-      </w:r>
-      <w:r>
-        <w:rPr/>
-        <w:t xml:space="preserve"> </w:t>
-      </w:r>
-      <w:r>
-        <w:br w:type="page"/>
-      </w:r>
-    </w:p>
-    <w:p>
-      <w:pPr>
-        <w:pStyle w:val="Normal"/>
-        <w:spacing w:before="0" w:after="160"/>
-        <w:rPr/>
-      </w:pPr>
-      <w:r>
-        <w:rPr>
-          <w:lang w:val="es-MX"/>
-        </w:rPr>
-        <w:t>En los últimos periodos de facturación, la compañía ha enfrentado diversos problemas relacionados con la cuadratura de los ingresos por ventas y en las comisiones asociadas a ventas que eventualmente se asignan a vendedores y supervisores contratados. Por este motivo, ha decidido recopilar la información relevante para implementar una base de datos de calidad en el corto plazo.</w:t>
-      </w:r>
-    </w:p>
-    <w:p>
-      <w:pPr>
-        <w:pStyle w:val="Normal"/>
-        <w:rPr>
-          <w:lang w:val="es-MX"/>
-        </w:rPr>
-      </w:pPr>
-      <w:r>
-        <w:rPr>
-          <w:lang w:val="es-MX"/>
-        </w:rPr>
-        <w:t>Para esta fase del desarrollo, se solicita la generación del modelo Entidad-Relación Extendido (MER-E), según los requisitos de negocio detallados a continuación.</w:t>
-      </w:r>
-    </w:p>
-    <w:p>
-      <w:pPr>
-        <w:pStyle w:val="Normal"/>
-        <w:rPr>
+        <w:t>Considera que los profesionales que postulan pueden extranjeros, pero deben residir en Chile, y pueden postularse a una sola empresa nacional o internacional, y para esto deben completar la información de la vista 1, donde el sistema les generará un número de folio de postulante irrepetible:</w:t>
+      </w:r>
+    </w:p>
+    <w:p>
+      <w:pPr>
+        <w:pStyle w:val="Normal"/>
+        <w:spacing w:lineRule="auto" w:line="240"/>
+        <w:rPr>
+          <w:rFonts w:ascii="Arial" w:hAnsi="Arial" w:asciiTheme="majorHAnsi" w:hAnsiTheme="majorHAnsi"/>
           <w:b/>
           <w:bCs/>
+          <w:szCs w:val="24"/>
           <w:lang w:val="es-MX"/>
         </w:rPr>
       </w:pPr>
       <w:r>
         <w:rPr>
+          <w:rFonts w:asciiTheme="majorHAnsi" w:hAnsiTheme="majorHAnsi"/>
           <w:b/>
           <w:bCs/>
+          <w:szCs w:val="24"/>
           <w:lang w:val="es-MX"/>
         </w:rPr>
-        <w:t>Reglas de negocio:</w:t>
-      </w:r>
-    </w:p>
-    <w:p>
-      <w:pPr>
-        <w:pStyle w:val="ListParagraph"/>
-        <w:numPr>
-          <w:ilvl w:val="0"/>
-          <w:numId w:val="3"/>
-        </w:numPr>
-        <w:rPr>
-          <w:lang w:val="es-MX"/>
-        </w:rPr>
-      </w:pPr>
-      <w:r>
-        <w:rPr>
-          <w:lang w:val="es-MX"/>
-        </w:rPr>
-        <w:t>La compañía tiene 8 sucursales ubicadas en distintas comunas. De las sucursales se requiere almacenar el “número de sucursal” que identifique a cada una de ellas, el nombre y la dirección completa. El nombre de la sucursal no puede repetirse en la base de datos.</w:t>
-      </w:r>
-    </w:p>
-    <w:p>
-      <w:pPr>
-        <w:pStyle w:val="ListParagraph"/>
-        <w:numPr>
-          <w:ilvl w:val="0"/>
-          <w:numId w:val="3"/>
-        </w:numPr>
-        <w:rPr>
-          <w:lang w:val="es-MX"/>
-        </w:rPr>
-      </w:pPr>
-      <w:r>
-        <w:rPr>
-          <w:lang w:val="es-MX"/>
-        </w:rPr>
-        <w:t>La compañía vende diferentes productos que se identifican por un código numérico, una descripción, un valor (precio unitario que puede estar entre los 2 mil pesos hasta los 5 millones de pesos), marca del producto y el stock disponible en la bodega. La cantidad de productos en bodega no puede superar las 3.000 unidades.</w:t>
-      </w:r>
-    </w:p>
-    <w:p>
-      <w:pPr>
-        <w:pStyle w:val="ListParagraph"/>
-        <w:numPr>
-          <w:ilvl w:val="0"/>
-          <w:numId w:val="3"/>
-        </w:numPr>
-        <w:rPr>
-          <w:lang w:val="es-MX"/>
-        </w:rPr>
-      </w:pPr>
-      <w:r>
-        <w:rPr>
-          <w:lang w:val="es-MX"/>
-        </w:rPr>
-        <w:t>Los clientes pueden adquirir del orden de 5.000 productos distintos en cualquiera de las sucursales disponibles.</w:t>
-      </w:r>
-    </w:p>
-    <w:p>
-      <w:pPr>
-        <w:pStyle w:val="ListParagraph"/>
-        <w:numPr>
-          <w:ilvl w:val="0"/>
-          <w:numId w:val="3"/>
-        </w:numPr>
-        <w:rPr>
-          <w:lang w:val="es-MX"/>
-        </w:rPr>
-      </w:pPr>
-      <w:r>
-        <w:rPr>
-          <w:lang w:val="es-MX"/>
-        </w:rPr>
-        <w:t>Cuando el cliente realiza una compra el vendedor le debe emitir una boleta con el siguiente detalle: número de boleta, fecha de boleta, monto de venta, cantidad de productos.</w:t>
-      </w:r>
-    </w:p>
-    <w:p>
-      <w:pPr>
-        <w:pStyle w:val="ListParagraph"/>
-        <w:numPr>
-          <w:ilvl w:val="0"/>
-          <w:numId w:val="3"/>
-        </w:numPr>
-        <w:rPr>
-          <w:lang w:val="es-MX"/>
-        </w:rPr>
-      </w:pPr>
-      <w:r>
-        <w:rPr>
-          <w:lang w:val="es-MX"/>
-        </w:rPr>
-        <w:t>Con el tiempo, los clientes acumulan puntos en función de las compras realizadas, lo que permite clasificar a dos tipos de clientes. Según el puntaje acumulado, se identifica al Cliente VIP, quien recibirá un porcentaje de descuento (entre 1% y 99.9%) en futuras compras. Por otro lado, los clientes Normales recibirán un descuento fijo en pesos, que se aplicará en la siguiente compra y tendrá un límite máximo de 20.000 pesos.</w:t>
-      </w:r>
-      <w:r>
-        <w:rPr/>
-        <w:t xml:space="preserve"> </w:t>
-      </w:r>
-    </w:p>
-    <w:p>
-      <w:pPr>
-        <w:pStyle w:val="ListParagraph"/>
-        <w:numPr>
-          <w:ilvl w:val="0"/>
-          <w:numId w:val="3"/>
-        </w:numPr>
-        <w:rPr>
-          <w:lang w:val="es-MX"/>
-        </w:rPr>
-      </w:pPr>
-      <w:r>
-        <w:rPr>
-          <w:lang w:val="es-MX"/>
-        </w:rPr>
-        <w:t>Los trabajadores contratados pueden tener un sólo cargo en la empresa, tales como:  administrativo, gerente, supervisor, jefe de área, vendedores, etc.   Debe registrarse en el contrato a qué sucursal pertenecerán, que es parte de la identificación de contrato. No se debe permitir que un trabajador se cambie de sucursal, debe permanecer en la sucursal que lo contrató.</w:t>
-      </w:r>
-    </w:p>
-    <w:p>
-      <w:pPr>
-        <w:pStyle w:val="ListParagraph"/>
-        <w:numPr>
-          <w:ilvl w:val="0"/>
-          <w:numId w:val="3"/>
-        </w:numPr>
-        <w:rPr>
-          <w:lang w:val="es-MX"/>
-        </w:rPr>
-      </w:pPr>
-      <w:r>
-        <w:rPr>
-          <w:lang w:val="es-MX"/>
-        </w:rPr>
-        <w:t>Existe un listado de quince cargos en la empresa tipificados con código numérico y una descripción. Se sabe que hay cargos aún no han sido asignados.</w:t>
-      </w:r>
-    </w:p>
-    <w:p>
-      <w:pPr>
-        <w:pStyle w:val="ListParagraph"/>
-        <w:numPr>
-          <w:ilvl w:val="0"/>
-          <w:numId w:val="3"/>
-        </w:numPr>
-        <w:rPr>
-          <w:lang w:val="es-MX"/>
-        </w:rPr>
-      </w:pPr>
-      <w:r>
-        <w:rPr>
-          <w:lang w:val="es-MX"/>
-        </w:rPr>
-        <w:t>Está la posibilidad que un trabajador sea recontratado por la compañía en otra fecha posterior y en otra sucursal, para lo que habría que realizar un nuevo contrato.</w:t>
-      </w:r>
-    </w:p>
-    <w:p>
-      <w:pPr>
-        <w:pStyle w:val="ListParagraph"/>
-        <w:numPr>
-          <w:ilvl w:val="0"/>
-          <w:numId w:val="3"/>
-        </w:numPr>
-        <w:rPr>
-          <w:lang w:val="es-MX"/>
-        </w:rPr>
-      </w:pPr>
-      <w:r>
-        <w:rPr>
-          <w:lang w:val="es-MX"/>
-        </w:rPr>
-        <w:t>La empresa en los últimos años está recibiendo alumnos pasantes para capacitarlos en ventas, a los que se le realiza un contrato diferente al resto de los trabajadores con contrato indefinido (ver vista de usuario).  Por ejemplo: los practicantes pueden o no tener un cargo asignado, en cambio a los trabajadores con contrato indefinido se les debe registrar un cargo, una AFP, y un sistema de salud. Revisa en detalle la siguiente vista de usuario, para observar las diferencias contractuales.</w:t>
+        <w:t>Figura 1</w:t>
       </w:r>
     </w:p>
     <w:p>
@@ -1091,54 +923,36 @@
         <w:pStyle w:val="Normal"/>
         <w:spacing w:lineRule="auto" w:line="240"/>
         <w:rPr>
-          <w:b/>
-          <w:bCs/>
-          <w:lang w:val="es-MX"/>
-        </w:rPr>
-      </w:pPr>
-      <w:r>
-        <w:rPr>
-          <w:b/>
-          <w:bCs/>
-          <w:lang w:val="es-MX"/>
-        </w:rPr>
-        <w:t>Figura 1</w:t>
-      </w:r>
-    </w:p>
-    <w:p>
-      <w:pPr>
-        <w:pStyle w:val="Normal"/>
-        <w:spacing w:lineRule="auto" w:line="240"/>
-        <w:rPr>
+          <w:rFonts w:ascii="Arial" w:hAnsi="Arial" w:asciiTheme="majorHAnsi" w:hAnsiTheme="majorHAnsi"/>
           <w:i/>
           <w:iCs/>
-          <w:lang w:val="es-MX"/>
-        </w:rPr>
-      </w:pPr>
-      <w:r>
-        <w:rPr>
+          <w:szCs w:val="24"/>
+          <w:lang w:val="es-ES"/>
+        </w:rPr>
+      </w:pPr>
+      <w:r>
+        <w:rPr>
+          <w:rFonts w:asciiTheme="majorHAnsi" w:hAnsiTheme="majorHAnsi"/>
           <w:i/>
           <w:iCs/>
-          <w:lang w:val="es-MX"/>
-        </w:rPr>
-        <w:t>Vista de usuario: los espacios que no se rellenaron son optativos</w:t>
-      </w:r>
-    </w:p>
-    <w:p>
-      <w:pPr>
-        <w:pStyle w:val="Normal"/>
-        <w:spacing w:lineRule="auto" w:line="240"/>
-        <w:rPr>
-          <w:lang w:val="es-MX"/>
-        </w:rPr>
+          <w:szCs w:val="24"/>
+        </w:rPr>
+        <w:t>Ejemplo de formulario de postulación con datos personales y académicos</w:t>
+      </w:r>
+    </w:p>
+    <w:p>
+      <w:pPr>
+        <w:pStyle w:val="NormalWeb"/>
+        <w:spacing w:before="280" w:after="280"/>
+        <w:rPr/>
       </w:pPr>
       <w:r>
         <w:rPr/>
         <w:drawing>
           <wp:inline distT="0" distB="0" distL="0" distR="0">
-            <wp:extent cx="5913755" cy="3246755"/>
+            <wp:extent cx="6315075" cy="2228850"/>
             <wp:effectExtent l="0" t="0" r="0" b="0"/>
-            <wp:docPr id="5" name="Imagen 940319334" descr="Esta figura muestra el modelo relacional que conecta la entidad Cheque con la entidad Persona mediante una relación de emisión. Cada cheque, identificado por su id_cheque, tiene atributos como fecha_emision y monto. En el caso de los espacios no rellenados, estos se consideran optativos y no afectan el flujo general del modelo. Una persona, representada con su rut_persona, dv_persona y nom_persona, puede emitir uno o más cheques. "/>
+            <wp:docPr id="5" name="Imagen 625340145" descr="La imagen muestra un formulario digital de postulación organizado en una tabla con múltiples secciones y campos. En la parte superior se visualizan el folio del postulante, el nombre de la empresa, la dirección de la empresa y la fecha de postulación. En el cuerpo del formulario aparecen datos personales como nombres, apellidos, género, correo electrónico, estado civil, fecha de nacimiento, país de origen, dirección en Chile, renta actual, dominio de idiomas y sitio web. En la parte inferior se presentan los antecedentes académicos y profesionales, incluyendo dos profesiones con sus respectivas fechas de obtención del título y el grado académico, donde la opción &quot;Magíster&quot; se encuentra seleccionada. Algunos campos contienen texto en color azul para representar enlaces o información destacada. La imagen corresponde a un ejemplo de un formulario estructurado utilizado para registrar antecedentes de un postulante."/>
             <wp:cNvGraphicFramePr>
               <a:graphicFrameLocks xmlns:a="http://schemas.openxmlformats.org/drawingml/2006/main" noChangeAspect="1"/>
             </wp:cNvGraphicFramePr>
@@ -1146,7 +960,7 @@
               <a:graphicData uri="http://schemas.openxmlformats.org/drawingml/2006/picture">
                 <pic:pic xmlns:pic="http://schemas.openxmlformats.org/drawingml/2006/picture">
                   <pic:nvPicPr>
-                    <pic:cNvPr id="5" name="Imagen 940319334" descr="Esta figura muestra el modelo relacional que conecta la entidad Cheque con la entidad Persona mediante una relación de emisión. Cada cheque, identificado por su id_cheque, tiene atributos como fecha_emision y monto. En el caso de los espacios no rellenados, estos se consideran optativos y no afectan el flujo general del modelo. Una persona, representada con su rut_persona, dv_persona y nom_persona, puede emitir uno o más cheques. "/>
+                    <pic:cNvPr id="5" name="Imagen 625340145" descr="La imagen muestra un formulario digital de postulación organizado en una tabla con múltiples secciones y campos. En la parte superior se visualizan el folio del postulante, el nombre de la empresa, la dirección de la empresa y la fecha de postulación. En el cuerpo del formulario aparecen datos personales como nombres, apellidos, género, correo electrónico, estado civil, fecha de nacimiento, país de origen, dirección en Chile, renta actual, dominio de idiomas y sitio web. En la parte inferior se presentan los antecedentes académicos y profesionales, incluyendo dos profesiones con sus respectivas fechas de obtención del título y el grado académico, donde la opción &quot;Magíster&quot; se encuentra seleccionada. Algunos campos contienen texto en color azul para representar enlaces o información destacada. La imagen corresponde a un ejemplo de un formulario estructurado utilizado para registrar antecedentes de un postulante."/>
                     <pic:cNvPicPr>
                       <a:picLocks noChangeAspect="1" noChangeArrowheads="1"/>
                     </pic:cNvPicPr>
@@ -1160,7 +974,7 @@
                   <pic:spPr bwMode="auto">
                     <a:xfrm>
                       <a:off x="0" y="0"/>
-                      <a:ext cx="5913755" cy="3246755"/>
+                      <a:ext cx="6315075" cy="2228850"/>
                     </a:xfrm>
                     <a:prstGeom prst="rect">
                       <a:avLst/>
@@ -1176,24 +990,223 @@
     </w:p>
     <w:p>
       <w:pPr>
-        <w:pStyle w:val="Normal"/>
-        <w:rPr/>
-      </w:pPr>
-      <w:r>
-        <w:rPr>
-          <w:i/>
-          <w:iCs/>
-        </w:rPr>
-        <w:t>Nota.</w:t>
-      </w:r>
-      <w:r>
-        <w:rPr/>
-        <w:t xml:space="preserve"> La imagen muestra la vista de usuario de tipos de contratos.</w:t>
-      </w:r>
-    </w:p>
-    <w:p>
-      <w:pPr>
-        <w:pStyle w:val="Normal"/>
+        <w:pStyle w:val="ListParagraph"/>
+        <w:numPr>
+          <w:ilvl w:val="0"/>
+          <w:numId w:val="1"/>
+        </w:numPr>
+        <w:ind w:hanging="360" w:start="360"/>
+        <w:rPr>
+          <w:lang w:val="es-ES"/>
+        </w:rPr>
+      </w:pPr>
+      <w:r>
+        <w:rPr>
+          <w:lang w:val="es-MX"/>
+        </w:rPr>
+        <w:t>Las empresas contratantes como Amazon, Google y Oracle tienen residencia en Chile, mientras que las demás compañías tienen domicilio en otros países.</w:t>
+      </w:r>
+    </w:p>
+    <w:p>
+      <w:pPr>
+        <w:pStyle w:val="ListParagraph"/>
+        <w:numPr>
+          <w:ilvl w:val="0"/>
+          <w:numId w:val="1"/>
+        </w:numPr>
+        <w:ind w:hanging="360" w:start="360"/>
+        <w:rPr>
+          <w:lang w:val="es-ES"/>
+        </w:rPr>
+      </w:pPr>
+      <w:r>
+        <w:rPr>
+          <w:lang w:val="es-MX"/>
+        </w:rPr>
+        <w:t>Las empresas que ofrecen los cargos IT se deben identificar por una sigla, por ejemplo: “ora”: Oracle, cis: Cisco System, etc., seguido de un correlativo 01, 02, etc. Además, se debe registrar la dirección completa de la empresa, especificando la ciudad, país.</w:t>
+      </w:r>
+    </w:p>
+    <w:p>
+      <w:pPr>
+        <w:pStyle w:val="ListParagraph"/>
+        <w:numPr>
+          <w:ilvl w:val="0"/>
+          <w:numId w:val="1"/>
+        </w:numPr>
+        <w:ind w:hanging="360" w:start="360"/>
+        <w:rPr>
+          <w:lang w:val="es-ES"/>
+        </w:rPr>
+      </w:pPr>
+      <w:r>
+        <w:rPr>
+          <w:lang w:val="es-MX"/>
+        </w:rPr>
+        <w:t>Las postulaciones realizadas a empresas con ubicación en Chile deben incluir la pretensión de renta en pesos que el postulante necesita, en cambio las postulaciones a empresas con residencia en el extranjero deben incluir datos adicionales:  nivel de dominio de idioma, fecha de la visa, y el identificador de visa (tarjeta para el trabajo, que comienza con 3 letras, seguidas de 10 números).</w:t>
+      </w:r>
+    </w:p>
+    <w:p>
+      <w:pPr>
+        <w:pStyle w:val="ListParagraph"/>
+        <w:numPr>
+          <w:ilvl w:val="0"/>
+          <w:numId w:val="1"/>
+        </w:numPr>
+        <w:ind w:hanging="360" w:start="360"/>
+        <w:rPr>
+          <w:lang w:val="es-ES"/>
+        </w:rPr>
+      </w:pPr>
+      <w:r>
+        <w:rPr>
+          <w:lang w:val="es-MX"/>
+        </w:rPr>
+        <w:t>Se debe registrar la remuneración máxima ofrecida por cada empresa en moneda local, que oscila entre $1.850.000 y $4.800.000 CLP (pesos chilenos).</w:t>
+      </w:r>
+    </w:p>
+    <w:p>
+      <w:pPr>
+        <w:pStyle w:val="ListParagraph"/>
+        <w:numPr>
+          <w:ilvl w:val="0"/>
+          <w:numId w:val="1"/>
+        </w:numPr>
+        <w:ind w:hanging="360" w:start="360"/>
+        <w:rPr>
+          <w:lang w:val="es-ES"/>
+        </w:rPr>
+      </w:pPr>
+      <w:r>
+        <w:rPr>
+          <w:lang w:val="es-MX"/>
+        </w:rPr>
+        <w:t>Los postulantes deben declarar al menos una profesión, registrando en la base de datos la fecha de obtención de cada título profesional (un máximo de dos títulos). </w:t>
+      </w:r>
+      <w:r>
+        <w:rPr>
+          <w:lang w:val="es-ES"/>
+        </w:rPr>
+        <w:t> </w:t>
+      </w:r>
+    </w:p>
+    <w:p>
+      <w:pPr>
+        <w:pStyle w:val="ListParagraph"/>
+        <w:numPr>
+          <w:ilvl w:val="0"/>
+          <w:numId w:val="1"/>
+        </w:numPr>
+        <w:ind w:hanging="360" w:start="360"/>
+        <w:rPr>
+          <w:lang w:val="es-ES"/>
+        </w:rPr>
+      </w:pPr>
+      <w:r>
+        <w:rPr>
+          <w:lang w:val="es-MX"/>
+        </w:rPr>
+        <w:t>También es importante registrar el grado académico del postulante, que puede ser “Licenciado, Magíster o Doctorado”. </w:t>
+      </w:r>
+      <w:r>
+        <w:rPr>
+          <w:lang w:val="es-ES"/>
+        </w:rPr>
+        <w:t> </w:t>
+      </w:r>
+    </w:p>
+    <w:p>
+      <w:pPr>
+        <w:pStyle w:val="ListParagraph"/>
+        <w:numPr>
+          <w:ilvl w:val="0"/>
+          <w:numId w:val="1"/>
+        </w:numPr>
+        <w:ind w:hanging="360" w:start="360"/>
+        <w:rPr>
+          <w:lang w:val="es-ES"/>
+        </w:rPr>
+      </w:pPr>
+      <w:r>
+        <w:rPr>
+          <w:lang w:val="es-MX"/>
+        </w:rPr>
+        <w:t>No todos los profesionales que postulan cuentan con un "sitio web", pero debes chequear que no sea un dato repetido en la base de datos.</w:t>
+      </w:r>
+      <w:r>
+        <w:rPr>
+          <w:lang w:val="es-ES"/>
+        </w:rPr>
+        <w:t> </w:t>
+      </w:r>
+    </w:p>
+    <w:p>
+      <w:pPr>
+        <w:pStyle w:val="ListParagraph"/>
+        <w:numPr>
+          <w:ilvl w:val="0"/>
+          <w:numId w:val="1"/>
+        </w:numPr>
+        <w:ind w:hanging="360" w:start="360"/>
+        <w:rPr>
+          <w:lang w:val="es-ES"/>
+        </w:rPr>
+      </w:pPr>
+      <w:r>
+        <w:rPr>
+          <w:lang w:val="es-MX"/>
+        </w:rPr>
+        <w:t>En el formulario no se solicita el RUT-DV, ya que pueden postularse profesionales de otras nacionalidades que no tengan el documento. Pero debes considerar para los chilenos, que el RUT debe validarse chequeando el dígito verificador del RUT (0,1, 2, 3, 4, 5... 9,’K').</w:t>
+      </w:r>
+      <w:r>
+        <w:rPr>
+          <w:lang w:val="es-ES"/>
+        </w:rPr>
+        <w:t> </w:t>
+      </w:r>
+    </w:p>
+    <w:p>
+      <w:pPr>
+        <w:pStyle w:val="Normal"/>
+        <w:rPr>
+          <w:lang w:val="es-MX"/>
+        </w:rPr>
+      </w:pPr>
+      <w:r>
+        <w:rPr>
+          <w:lang w:val="es-MX"/>
+        </w:rPr>
+      </w:r>
+    </w:p>
+    <w:p>
+      <w:pPr>
+        <w:pStyle w:val="Normal"/>
+        <w:rPr>
+          <w:lang w:val="es-MX"/>
+        </w:rPr>
+      </w:pPr>
+      <w:r>
+        <w:rPr>
+          <w:lang w:val="es-MX"/>
+        </w:rPr>
+      </w:r>
+    </w:p>
+    <w:p>
+      <w:pPr>
+        <w:pStyle w:val="Normal"/>
+        <w:rPr>
+          <w:lang w:val="es-MX"/>
+        </w:rPr>
+      </w:pPr>
+      <w:r>
+        <w:rPr>
+          <w:lang w:val="es-MX"/>
+        </w:rPr>
+      </w:r>
+    </w:p>
+    <w:p>
+      <w:pPr>
+        <w:pStyle w:val="Normal"/>
+        <w:ind w:start="459"/>
         <w:rPr/>
       </w:pPr>
       <w:r>
@@ -1279,7 +1292,7 @@
       </w:pPr>
       <w:r>
         <w:rPr/>
-        <w:t>Modelo Entidad-Relación (MER) solicitado en notación Barker.</w:t>
+        <w:t>Modelo Entidad-Relación-Extendido (MER-E) solicitado en notación Barker.</w:t>
       </w:r>
     </w:p>
     <w:p>
@@ -1328,14 +1341,14 @@
         <w:tblLook w:val="04a0" w:firstRow="1" w:noVBand="1" w:lastRow="0" w:firstColumn="1" w:lastColumn="0" w:noHBand="0"/>
       </w:tblPr>
       <w:tblGrid>
-        <w:gridCol w:w="5059"/>
-        <w:gridCol w:w="4854"/>
+        <w:gridCol w:w="4916"/>
+        <w:gridCol w:w="4997"/>
       </w:tblGrid>
       <w:tr>
         <w:trPr/>
         <w:tc>
           <w:tcPr>
-            <w:tcW w:w="5059" w:type="dxa"/>
+            <w:tcW w:w="4916" w:type="dxa"/>
             <w:tcBorders/>
           </w:tcPr>
           <w:p>
@@ -1345,24 +1358,24 @@
               <w:spacing w:before="120" w:after="120"/>
               <w:jc w:val="center"/>
               <w:rPr>
-                <w:rFonts w:eastAsia="Arial" w:cs="Arial"/>
+                <w:rFonts w:eastAsia="Arial" w:cs=""/>
                 <w:szCs w:val="22"/>
                 <w:lang w:val="es-CL" w:eastAsia="en-US" w:bidi="ar-SA"/>
               </w:rPr>
             </w:pPr>
             <w:r>
               <w:rPr>
-                <w:rFonts w:eastAsia="Arial" w:cs="Arial"/>
+                <w:rFonts w:eastAsia="Arial" w:cs=""/>
                 <w:szCs w:val="22"/>
                 <w:lang w:val="es-CL" w:eastAsia="en-US" w:bidi="ar-SA"/>
               </w:rPr>
-              <w:t>Modelo Entidad-Relación (MER)</w:t>
+              <w:t>Modelo en notación Barker</w:t>
             </w:r>
           </w:p>
         </w:tc>
         <w:tc>
           <w:tcPr>
-            <w:tcW w:w="4854" w:type="dxa"/>
+            <w:tcW w:w="4997" w:type="dxa"/>
             <w:tcBorders/>
           </w:tcPr>
           <w:p>
@@ -1372,14 +1385,14 @@
               <w:spacing w:before="120" w:after="120"/>
               <w:jc w:val="center"/>
               <w:rPr>
-                <w:rFonts w:eastAsia="Arial" w:cs="Arial"/>
+                <w:rFonts w:eastAsia="Arial" w:cs=""/>
                 <w:szCs w:val="22"/>
                 <w:lang w:val="es-CL" w:eastAsia="en-US" w:bidi="ar-SA"/>
               </w:rPr>
             </w:pPr>
             <w:r>
               <w:rPr>
-                <w:rFonts w:eastAsia="Arial" w:cs="Arial"/>
+                <w:rFonts w:eastAsia="Arial" w:cs=""/>
                 <w:szCs w:val="22"/>
                 <w:lang w:val="es-CL" w:eastAsia="en-US" w:bidi="ar-SA"/>
               </w:rPr>
@@ -1389,32 +1402,31 @@
         </w:tc>
       </w:tr>
       <w:tr>
-        <w:trPr>
-          <w:trHeight w:val="5156" w:hRule="atLeast"/>
-        </w:trPr>
+        <w:trPr/>
         <w:tc>
           <w:tcPr>
-            <w:tcW w:w="5059" w:type="dxa"/>
+            <w:tcW w:w="4916" w:type="dxa"/>
             <w:tcBorders/>
           </w:tcPr>
           <w:p>
             <w:pPr>
-              <w:pStyle w:val="Normal"/>
+              <w:pStyle w:val="texto-tabla"/>
               <w:widowControl/>
-              <w:spacing w:lineRule="auto" w:line="240" w:before="0" w:after="0"/>
+              <w:spacing w:before="240" w:after="240"/>
               <w:jc w:val="start"/>
               <w:rPr>
-                <w:kern w:val="2"/>
-                <w14:ligatures w14:val="standardContextual"/>
+                <w:rFonts w:eastAsia="Arial" w:cs=""/>
+                <w:szCs w:val="22"/>
+                <w:lang w:val="es-CL" w:eastAsia="en-US" w:bidi="ar-SA"/>
               </w:rPr>
             </w:pPr>
             <w:r>
               <w:rPr>
-                <w:rFonts w:eastAsia="Arial" w:cs="Arial"/>
+                <w:rFonts w:eastAsia="Arial" w:cs=""/>
                 <w:szCs w:val="22"/>
                 <w:lang w:val="es-CL" w:eastAsia="en-US" w:bidi="ar-SA"/>
               </w:rPr>
-              <w:object w:dxaOrig="10530" w:dyaOrig="9540">
+              <w:object w:dxaOrig="10260" w:dyaOrig="9180">
                 <v:shapetype id="_x0000_tole_rId7" coordsize="21600,21600" o:spt="7" o:preferrelative="t" path="m@4@5l@4@11@9@11@9@5xe" filled="f" stroked="f">
                   <v:stroke joinstyle="miter"/>
                   <v:formulas>
@@ -1434,30 +1446,28 @@
                   <v:path o:extrusionok="f" gradientshapeok="t" o:connecttype="rect"/>
                   <o:lock v:ext="edit" aspectratio="t"/>
                 </v:shapetype>
-                <v:shape id="ole_rId7" type="_x0000_tole_rId7" style="width:246pt;height:222pt;mso-wrap-distance-right:0pt" filled="f" o:ole="">
+                <v:shape id="ole_rId7" type="_x0000_tole_rId7" style="width:231pt;height:207pt;mso-wrap-distance-right:0pt" filled="f" o:ole="">
                   <v:imagedata r:id="rId8" o:title=""/>
                 </v:shape>
-                <o:OLEObject Type="Embed" ProgID="PBrush" ShapeID="ole_rId7" DrawAspect="Content" ObjectID="_1619578241" r:id="rId7"/>
+                <o:OLEObject Type="Embed" ProgID="PBrush" ShapeID="ole_rId7" DrawAspect="Content" ObjectID="_1801042927" r:id="rId7"/>
               </w:object>
             </w:r>
           </w:p>
           <w:p>
             <w:pPr>
-              <w:pStyle w:val="Normal"/>
+              <w:pStyle w:val="texto-tabla"/>
               <w:widowControl/>
-              <w:spacing w:lineRule="auto" w:line="240" w:before="0" w:after="0"/>
+              <w:spacing w:before="240" w:after="240"/>
               <w:jc w:val="start"/>
               <w:rPr>
-                <w:rFonts w:eastAsia="Arial" w:cs="Arial"/>
-                <w:kern w:val="0"/>
+                <w:rFonts w:eastAsia="Arial" w:cs=""/>
                 <w:szCs w:val="22"/>
                 <w:lang w:val="es-CL" w:eastAsia="en-US" w:bidi="ar-SA"/>
               </w:rPr>
             </w:pPr>
             <w:r>
               <w:rPr>
-                <w:rFonts w:eastAsia="Arial" w:cs="Arial"/>
-                <w:kern w:val="0"/>
+                <w:rFonts w:eastAsia="Arial" w:cs=""/>
                 <w:szCs w:val="22"/>
                 <w:lang w:val="es-CL" w:eastAsia="en-US" w:bidi="ar-SA"/>
               </w:rPr>
@@ -1466,26 +1476,24 @@
         </w:tc>
         <w:tc>
           <w:tcPr>
-            <w:tcW w:w="4854" w:type="dxa"/>
+            <w:tcW w:w="4997" w:type="dxa"/>
             <w:tcBorders/>
           </w:tcPr>
           <w:p>
             <w:pPr>
-              <w:pStyle w:val="Normal"/>
+              <w:pStyle w:val="texto-tabla"/>
               <w:widowControl/>
-              <w:spacing w:lineRule="auto" w:line="240" w:before="0" w:after="0"/>
+              <w:spacing w:before="240" w:after="240"/>
               <w:jc w:val="start"/>
               <w:rPr>
-                <w:rFonts w:eastAsia="Arial" w:cs="Arial"/>
-                <w:kern w:val="0"/>
+                <w:rFonts w:eastAsia="Arial" w:cs=""/>
                 <w:szCs w:val="22"/>
                 <w:lang w:val="es-CL" w:eastAsia="en-US" w:bidi="ar-SA"/>
               </w:rPr>
             </w:pPr>
             <w:r>
               <w:rPr>
-                <w:rFonts w:eastAsia="Arial" w:cs="Arial"/>
-                <w:kern w:val="0"/>
+                <w:rFonts w:eastAsia="Arial" w:cs=""/>
                 <w:szCs w:val="22"/>
                 <w:lang w:val="es-CL" w:eastAsia="en-US" w:bidi="ar-SA"/>
               </w:rPr>
@@ -1509,10 +1517,10 @@
                   <v:path o:extrusionok="f" gradientshapeok="t" o:connecttype="rect"/>
                   <o:lock v:ext="edit" aspectratio="t"/>
                 </v:shapetype>
-                <v:shape id="ole_rId9" type="_x0000_tole_rId9" style="width:235.5pt;height:188.25pt;mso-wrap-distance-right:0pt" filled="f" o:ole="">
+                <v:shape id="ole_rId9" type="_x0000_tole_rId9" style="width:239.25pt;height:192.75pt;mso-wrap-distance-right:0pt" filled="f" o:ole="">
                   <v:imagedata r:id="rId10" o:title=""/>
                 </v:shape>
-                <o:OLEObject Type="Embed" ProgID="PBrush" ShapeID="ole_rId9" DrawAspect="Content" ObjectID="_2026552067" r:id="rId9"/>
+                <o:OLEObject Type="Embed" ProgID="PBrush" ShapeID="ole_rId9" DrawAspect="Content" ObjectID="_1783813546" r:id="rId9"/>
               </w:object>
             </w:r>
           </w:p>
@@ -1531,7 +1539,6 @@
     <w:p>
       <w:pPr>
         <w:pStyle w:val="Normal"/>
-        <w:ind w:start="459"/>
         <w:rPr/>
       </w:pPr>
       <w:r>
@@ -1561,7 +1568,7 @@
         <mc:AlternateContent>
           <mc:Choice Requires="wps">
             <w:drawing>
-              <wp:anchor distT="40005" distB="58420" distL="109220" distR="118110" simplePos="0" relativeHeight="34" behindDoc="0" locked="0" layoutInCell="0" allowOverlap="1" wp14:anchorId="25D5EF06">
+              <wp:anchor distT="40005" distB="58420" distL="109220" distR="118110" simplePos="0" relativeHeight="35" behindDoc="0" locked="0" layoutInCell="0" allowOverlap="1" wp14:anchorId="25D5EF06">
                 <wp:simplePos x="0" y="0"/>
                 <wp:positionH relativeFrom="column">
                   <wp:posOffset>75565</wp:posOffset>
@@ -1921,10 +1928,10 @@
             <wp:positionV relativeFrom="paragraph">
               <wp:align>top</wp:align>
             </wp:positionV>
-            <wp:extent cx="6019165" cy="4164330"/>
+            <wp:extent cx="6019165" cy="3061335"/>
             <wp:effectExtent l="0" t="0" r="0" b="0"/>
             <wp:wrapSquare wrapText="largest"/>
-            <wp:docPr id="7" name="Imagen5"/>
+            <wp:docPr id="7" name="Imagen7"/>
             <wp:cNvGraphicFramePr>
               <a:graphicFrameLocks xmlns:a="http://schemas.openxmlformats.org/drawingml/2006/main" noChangeAspect="1"/>
             </wp:cNvGraphicFramePr>
@@ -1932,7 +1939,7 @@
               <a:graphicData uri="http://schemas.openxmlformats.org/drawingml/2006/picture">
                 <pic:pic xmlns:pic="http://schemas.openxmlformats.org/drawingml/2006/picture">
                   <pic:nvPicPr>
-                    <pic:cNvPr id="7" name="Imagen5"/>
+                    <pic:cNvPr id="7" name="Imagen7"/>
                     <pic:cNvPicPr>
                       <a:picLocks noChangeAspect="1" noChangeArrowheads="1"/>
                     </pic:cNvPicPr>
@@ -1946,7 +1953,7 @@
                   <pic:spPr bwMode="auto">
                     <a:xfrm>
                       <a:off x="0" y="0"/>
-                      <a:ext cx="6019165" cy="4164330"/>
+                      <a:ext cx="6019165" cy="3061335"/>
                     </a:xfrm>
                     <a:prstGeom prst="rect">
                       <a:avLst/>
@@ -2006,7 +2013,7 @@
         <mc:AlternateContent>
           <mc:Choice Requires="wps">
             <w:drawing>
-              <wp:anchor distT="40640" distB="52705" distL="109220" distR="118110" simplePos="0" relativeHeight="36" behindDoc="0" locked="0" layoutInCell="0" allowOverlap="1" wp14:anchorId="6BD093D9">
+              <wp:anchor distT="40640" distB="52705" distL="109220" distR="118110" simplePos="0" relativeHeight="37" behindDoc="0" locked="0" layoutInCell="0" allowOverlap="1" wp14:anchorId="6BD093D9">
                 <wp:simplePos x="0" y="0"/>
                 <wp:positionH relativeFrom="column">
                   <wp:posOffset>-635</wp:posOffset>
@@ -2102,10 +2109,10 @@
             <wp:positionV relativeFrom="paragraph">
               <wp:align>top</wp:align>
             </wp:positionV>
-            <wp:extent cx="6019165" cy="4236085"/>
+            <wp:extent cx="6019165" cy="3042920"/>
             <wp:effectExtent l="0" t="0" r="0" b="0"/>
             <wp:wrapSquare wrapText="largest"/>
-            <wp:docPr id="13" name="Imagen7"/>
+            <wp:docPr id="13" name="Imagen5"/>
             <wp:cNvGraphicFramePr>
               <a:graphicFrameLocks xmlns:a="http://schemas.openxmlformats.org/drawingml/2006/main" noChangeAspect="1"/>
             </wp:cNvGraphicFramePr>
@@ -2113,7 +2120,7 @@
               <a:graphicData uri="http://schemas.openxmlformats.org/drawingml/2006/picture">
                 <pic:pic xmlns:pic="http://schemas.openxmlformats.org/drawingml/2006/picture">
                   <pic:nvPicPr>
-                    <pic:cNvPr id="13" name="Imagen7"/>
+                    <pic:cNvPr id="13" name="Imagen5"/>
                     <pic:cNvPicPr>
                       <a:picLocks noChangeAspect="1" noChangeArrowheads="1"/>
                     </pic:cNvPicPr>
@@ -2127,7 +2134,7 @@
                   <pic:spPr bwMode="auto">
                     <a:xfrm>
                       <a:off x="0" y="0"/>
-                      <a:ext cx="6019165" cy="4236085"/>
+                      <a:ext cx="6019165" cy="3042920"/>
                     </a:xfrm>
                     <a:prstGeom prst="rect">
                       <a:avLst/>
@@ -2147,22 +2154,7 @@
     </w:p>
     <w:p>
       <w:pPr>
-        <w:pStyle w:val="ListParagraph"/>
-        <w:numPr>
-          <w:ilvl w:val="0"/>
-          <w:numId w:val="0"/>
-        </w:numPr>
-        <w:ind w:hanging="0" w:start="720"/>
-        <w:rPr/>
-      </w:pPr>
-      <w:r>
-        <w:rPr/>
-      </w:r>
-    </w:p>
-    <w:p>
-      <w:pPr>
-        <w:pStyle w:val="Normal"/>
-        <w:ind w:start="459"/>
+        <w:pStyle w:val="Normal"/>
         <w:rPr>
           <w:b/>
           <w:bCs/>
@@ -2174,14 +2166,10 @@
           <w:bCs/>
         </w:rPr>
       </w:r>
-      <w:r>
-        <w:br w:type="page"/>
-      </w:r>
-    </w:p>
-    <w:p>
-      <w:pPr>
-        <w:pStyle w:val="Normal"/>
-        <w:spacing w:before="0" w:after="160"/>
+    </w:p>
+    <w:p>
+      <w:pPr>
+        <w:pStyle w:val="Normal"/>
         <w:rPr>
           <w:b/>
           <w:bCs/>
@@ -2192,32 +2180,15 @@
           <w:b/>
           <w:bCs/>
         </w:rPr>
-        <w:t xml:space="preserve">Paso 2: </w:t>
-      </w:r>
-    </w:p>
-    <w:p>
-      <w:pPr>
-        <w:pStyle w:val="Normal"/>
-        <w:rPr/>
-      </w:pPr>
-      <w:r>
-        <w:rPr/>
-        <w:t>Además, tendrás que descargar el resultado y generar un archivo DMD y una subcarpeta.</w:t>
-      </w:r>
-    </w:p>
-    <w:p>
-      <w:pPr>
-        <w:pStyle w:val="Normal"/>
-        <w:rPr/>
-      </w:pPr>
-      <w:r>
-        <w:rPr/>
-        <w:t>Para ello, tendrás que hacer clic en la opción “Guardar como” del menú “Archivo”, lo que desplegará el submenú que se ilustra en la siguiente imagen:</w:t>
-      </w:r>
-    </w:p>
-    <w:p>
-      <w:pPr>
-        <w:pStyle w:val="Normal"/>
+      </w:r>
+      <w:r>
+        <w:br w:type="page"/>
+      </w:r>
+    </w:p>
+    <w:p>
+      <w:pPr>
+        <w:pStyle w:val="Normal"/>
+        <w:spacing w:before="0" w:after="160"/>
         <w:rPr>
           <w:b/>
           <w:bCs/>
@@ -2228,12 +2199,50 @@
           <w:b/>
           <w:bCs/>
         </w:rPr>
+        <w:t xml:space="preserve">Paso 2: </w:t>
+      </w:r>
+    </w:p>
+    <w:p>
+      <w:pPr>
+        <w:pStyle w:val="Normal"/>
+        <w:rPr/>
+      </w:pPr>
+      <w:r>
+        <w:rPr/>
+        <w:t>Además, tendrás que descargar el resultado y generar un archivo DMD y una subcarpeta.</w:t>
+      </w:r>
+    </w:p>
+    <w:p>
+      <w:pPr>
+        <w:pStyle w:val="Normal"/>
+        <w:rPr/>
+      </w:pPr>
+      <w:r>
+        <w:rPr/>
+        <w:t>Para ello, tendrás que hacer clic en la opción “Guardar como” del menú “Archivo”, lo que desplegará el submenú que se ilustra en la siguiente imagen:</w:t>
+      </w:r>
+    </w:p>
+    <w:p>
+      <w:pPr>
+        <w:pStyle w:val="Normal"/>
+        <w:spacing w:lineRule="auto" w:line="240"/>
+        <w:rPr>
+          <w:b/>
+          <w:bCs/>
+        </w:rPr>
+      </w:pPr>
+      <w:r>
+        <w:rPr>
+          <w:b/>
+          <w:bCs/>
+        </w:rPr>
         <w:t>Figura 2</w:t>
       </w:r>
     </w:p>
     <w:p>
       <w:pPr>
         <w:pStyle w:val="Normal"/>
+        <w:spacing w:lineRule="auto" w:line="240"/>
         <w:rPr/>
       </w:pPr>
       <w:r>
@@ -2345,6 +2354,7 @@
     <w:p>
       <w:pPr>
         <w:pStyle w:val="Normal"/>
+        <w:spacing w:lineRule="auto" w:line="240"/>
         <w:rPr>
           <w:b/>
           <w:bCs/>
@@ -2355,12 +2365,29 @@
           <w:b/>
           <w:bCs/>
         </w:rPr>
+      </w:r>
+    </w:p>
+    <w:p>
+      <w:pPr>
+        <w:pStyle w:val="Normal"/>
+        <w:spacing w:lineRule="auto" w:line="240"/>
+        <w:rPr>
+          <w:b/>
+          <w:bCs/>
+        </w:rPr>
+      </w:pPr>
+      <w:r>
+        <w:rPr>
+          <w:b/>
+          <w:bCs/>
+        </w:rPr>
         <w:t>Figura 3</w:t>
       </w:r>
     </w:p>
     <w:p>
       <w:pPr>
         <w:pStyle w:val="Normal"/>
+        <w:spacing w:lineRule="auto" w:line="240"/>
         <w:rPr>
           <w:i/>
           <w:iCs/>
@@ -2373,11 +2400,21 @@
         </w:rPr>
         <w:t>Ejemplo de archivos de diseño generado con SQL Developer Data Modeler</w:t>
       </w:r>
+    </w:p>
+    <w:p>
+      <w:pPr>
+        <w:pStyle w:val="Normal"/>
+        <w:rPr>
+          <w:rFonts w:eastAsia="" w:cs="" w:cstheme="majorBidi" w:eastAsiaTheme="majorEastAsia"/>
+          <w:sz w:val="44"/>
+          <w:szCs w:val="32"/>
+        </w:rPr>
+      </w:pPr>
       <w:r>
         <w:rPr/>
         <w:drawing>
           <wp:inline distT="0" distB="0" distL="0" distR="0">
-            <wp:extent cx="3657600" cy="904875"/>
+            <wp:extent cx="3743325" cy="904875"/>
             <wp:effectExtent l="0" t="0" r="0" b="0"/>
             <wp:docPr id="15" name="Imagen 18" descr="La figura muestra la estructura de archivos generada al guardar un modelo en Oracle Data Modeler. Se observa una carpeta denominada Modelo_Base, que contiene recursos asociados al modelo, y un archivo con extensión .dmd llamado Modelo_Base.dmd, que corresponde al archivo principal del modelo lógico o físico creado. Este formato organiza los datos y configuraciones necesarias para el trabajo con diagramas y relaciones."/>
             <wp:cNvGraphicFramePr>
@@ -2394,7 +2431,6 @@
                   </pic:nvPicPr>
                   <pic:blipFill>
                     <a:blip r:embed="rId21"/>
-                    <a:srcRect l="2289" t="0" r="0" b="0"/>
                     <a:stretch>
                       <a:fillRect/>
                     </a:stretch>
@@ -2402,7 +2438,7 @@
                   <pic:spPr bwMode="auto">
                     <a:xfrm>
                       <a:off x="0" y="0"/>
-                      <a:ext cx="3657600" cy="904875"/>
+                      <a:ext cx="3743325" cy="904875"/>
                     </a:xfrm>
                     <a:prstGeom prst="rect">
                       <a:avLst/>
@@ -2550,32 +2586,6 @@
     <w:p>
       <w:pPr>
         <w:pStyle w:val="Normal"/>
-        <w:rPr/>
-      </w:pPr>
-      <w:r>
-        <w:rPr/>
-      </w:r>
-    </w:p>
-    <w:p>
-      <w:pPr>
-        <w:pStyle w:val="Normal"/>
-        <w:rPr/>
-      </w:pPr>
-      <w:r>
-        <w:rPr>
-          <w:b/>
-        </w:rPr>
-        <w:t xml:space="preserve">Paso 3: </w:t>
-      </w:r>
-      <w:r>
-        <w:rPr/>
-        <w:t>Una vez generado el archivo .dmd y su subcarpeta correspondiente, todo este contenido debe comprimirse en un solo archivo ZIP o RAR.</w:t>
-      </w:r>
-    </w:p>
-    <w:p>
-      <w:pPr>
-        <w:pStyle w:val="Normal"/>
-        <w:spacing w:lineRule="auto" w:line="240"/>
         <w:rPr>
           <w:b/>
           <w:bCs/>
@@ -2586,6 +2596,39 @@
           <w:b/>
           <w:bCs/>
         </w:rPr>
+      </w:r>
+    </w:p>
+    <w:p>
+      <w:pPr>
+        <w:pStyle w:val="Normal"/>
+        <w:rPr/>
+      </w:pPr>
+      <w:r>
+        <w:rPr>
+          <w:b/>
+          <w:bCs/>
+        </w:rPr>
+        <w:t xml:space="preserve">Paso 3: </w:t>
+      </w:r>
+      <w:r>
+        <w:rPr/>
+        <w:t>Una vez generado el archivo .dmd y su subcarpeta correspondiente, todo este contenido debe comprimirse en un solo archivo ZIP o RAR.</w:t>
+      </w:r>
+    </w:p>
+    <w:p>
+      <w:pPr>
+        <w:pStyle w:val="Normal"/>
+        <w:spacing w:lineRule="auto" w:line="240"/>
+        <w:rPr>
+          <w:b/>
+          <w:bCs/>
+        </w:rPr>
+      </w:pPr>
+      <w:r>
+        <w:rPr>
+          <w:b/>
+          <w:bCs/>
+        </w:rPr>
         <w:t>Figura 5</w:t>
       </w:r>
     </w:p>
@@ -2617,7 +2660,7 @@
         <w:rPr/>
         <w:drawing>
           <wp:inline distT="0" distB="0" distL="0" distR="0">
-            <wp:extent cx="2242185" cy="1259205"/>
+            <wp:extent cx="2000250" cy="1123315"/>
             <wp:effectExtent l="0" t="0" r="0" b="0"/>
             <wp:docPr id="17" name="Imagen 22" descr="La figura muestra la estructura interna del archivo comprimido Encargo_Semanal.zip."/>
             <wp:cNvGraphicFramePr>
@@ -2641,7 +2684,7 @@
                   <pic:spPr bwMode="auto">
                     <a:xfrm>
                       <a:off x="0" y="0"/>
-                      <a:ext cx="2242185" cy="1259205"/>
+                      <a:ext cx="2000250" cy="1123315"/>
                     </a:xfrm>
                     <a:prstGeom prst="rect">
                       <a:avLst/>
@@ -2659,8 +2702,6 @@
       <w:pPr>
         <w:pStyle w:val="Normal"/>
         <w:rPr>
-          <w:b/>
-          <w:bCs/>
           <w:lang w:val="en-US"/>
         </w:rPr>
       </w:pPr>
@@ -2708,7 +2749,7 @@
         <w:rPr>
           <w:lang w:val="en-US"/>
         </w:rPr>
-        <w:t xml:space="preserve"> </w:t>
+        <w:t> </w:t>
       </w:r>
       <w:r>
         <w:br w:type="page"/>
@@ -2766,18 +2807,10 @@
           <w:tab w:val="clear" w:pos="708"/>
           <w:tab w:val="left" w:pos="2790" w:leader="none"/>
         </w:tabs>
-        <w:spacing w:lineRule="auto" w:line="240"/>
-        <w:rPr>
-          <w:b/>
-          <w:bCs/>
-        </w:rPr>
-      </w:pPr>
-      <w:r>
-        <w:rPr>
-          <w:b/>
-          <w:bCs/>
-        </w:rPr>
-        <w:t>Figura 6</w:t>
+        <w:rPr/>
+      </w:pPr>
+      <w:r>
+        <w:rPr/>
       </w:r>
     </w:p>
     <w:p>
@@ -2789,6 +2822,27 @@
         </w:tabs>
         <w:spacing w:lineRule="auto" w:line="240"/>
         <w:rPr>
+          <w:b/>
+          <w:bCs/>
+        </w:rPr>
+      </w:pPr>
+      <w:r>
+        <w:rPr>
+          <w:b/>
+          <w:bCs/>
+        </w:rPr>
+        <w:t>Figura 6</w:t>
+      </w:r>
+    </w:p>
+    <w:p>
+      <w:pPr>
+        <w:pStyle w:val="Normal"/>
+        <w:tabs>
+          <w:tab w:val="clear" w:pos="708"/>
+          <w:tab w:val="left" w:pos="2790" w:leader="none"/>
+        </w:tabs>
+        <w:spacing w:lineRule="auto" w:line="240"/>
+        <w:rPr>
           <w:i/>
           <w:iCs/>
         </w:rPr>
@@ -2804,9 +2858,15 @@
         <w:rPr/>
         <w:drawing>
           <wp:inline distT="0" distB="0" distL="0" distR="0">
-            <wp:extent cx="5948045" cy="2364105"/>
+            <wp:extent cx="5803265" cy="2306320"/>
             <wp:effectExtent l="0" t="0" r="0" b="0"/>
-            <wp:docPr id="18" name="Imagen 24" descr="Interfaz de usuario gráfica, Texto, Aplicación&#10;&#10;El contenido generado por IA puede ser incorrecto."/>
+            <wp:docPr id="18" name="Imagen 24">
+              <a:extLst xmlns:a="http://schemas.openxmlformats.org/drawingml/2006/main">
+                <a:ext uri="{C183D7F6-B498-43B3-948B-1728B52AA6E4}">
+                  <adec:decorative xmlns:adec="http://schemas.microsoft.com/office/drawing/2017/decorative" val="1"/>
+                </a:ext>
+              </a:extLst>
+            </wp:docPr>
             <wp:cNvGraphicFramePr>
               <a:graphicFrameLocks xmlns:a="http://schemas.openxmlformats.org/drawingml/2006/main" noChangeAspect="1"/>
             </wp:cNvGraphicFramePr>
@@ -2814,7 +2874,7 @@
               <a:graphicData uri="http://schemas.openxmlformats.org/drawingml/2006/picture">
                 <pic:pic xmlns:pic="http://schemas.openxmlformats.org/drawingml/2006/picture">
                   <pic:nvPicPr>
-                    <pic:cNvPr id="18" name="Imagen 24" descr="Interfaz de usuario gráfica, Texto, Aplicación&#10;&#10;El contenido generado por IA puede ser incorrecto."/>
+                    <pic:cNvPr id="18" name="Imagen 24"/>
                     <pic:cNvPicPr>
                       <a:picLocks noChangeAspect="1" noChangeArrowheads="1"/>
                     </pic:cNvPicPr>
@@ -2828,7 +2888,7 @@
                   <pic:spPr bwMode="auto">
                     <a:xfrm>
                       <a:off x="0" y="0"/>
-                      <a:ext cx="5948045" cy="2364105"/>
+                      <a:ext cx="5803265" cy="2306320"/>
                     </a:xfrm>
                     <a:prstGeom prst="rect">
                       <a:avLst/>
@@ -2907,13 +2967,29 @@
       <w:pPr>
         <w:pStyle w:val="Normal"/>
         <w:spacing w:lineRule="auto" w:line="240"/>
-        <w:rPr/>
-      </w:pPr>
-      <w:r>
         <w:rPr>
           <w:b/>
           <w:bCs/>
         </w:rPr>
+      </w:pPr>
+      <w:r>
+        <w:rPr>
+          <w:b/>
+          <w:bCs/>
+        </w:rPr>
+      </w:r>
+    </w:p>
+    <w:p>
+      <w:pPr>
+        <w:pStyle w:val="Normal"/>
+        <w:spacing w:lineRule="auto" w:line="240"/>
+        <w:rPr/>
+      </w:pPr>
+      <w:r>
+        <w:rPr>
+          <w:b/>
+          <w:bCs/>
+        </w:rPr>
         <w:t>Figura 7</w:t>
       </w:r>
     </w:p>
@@ -2937,9 +3013,15 @@
         <w:rPr/>
         <w:drawing>
           <wp:inline distT="0" distB="0" distL="0" distR="0">
-            <wp:extent cx="6138545" cy="1688465"/>
+            <wp:extent cx="5581650" cy="1536065"/>
             <wp:effectExtent l="0" t="0" r="0" b="0"/>
-            <wp:docPr id="19" name="Imagen3" descr="Interfaz de usuario gráfica, Texto, Aplicación, Correo electrónico&#10;&#10;El contenido generado por IA puede ser incorrecto."/>
+            <wp:docPr id="19" name="Imagen3">
+              <a:extLst xmlns:a="http://schemas.openxmlformats.org/drawingml/2006/main">
+                <a:ext uri="{C183D7F6-B498-43B3-948B-1728B52AA6E4}">
+                  <adec:decorative xmlns:adec="http://schemas.microsoft.com/office/drawing/2017/decorative" val="1"/>
+                </a:ext>
+              </a:extLst>
+            </wp:docPr>
             <wp:cNvGraphicFramePr>
               <a:graphicFrameLocks xmlns:a="http://schemas.openxmlformats.org/drawingml/2006/main" noChangeAspect="1"/>
             </wp:cNvGraphicFramePr>
@@ -2947,7 +3029,7 @@
               <a:graphicData uri="http://schemas.openxmlformats.org/drawingml/2006/picture">
                 <pic:pic xmlns:pic="http://schemas.openxmlformats.org/drawingml/2006/picture">
                   <pic:nvPicPr>
-                    <pic:cNvPr id="19" name="Imagen3" descr="Interfaz de usuario gráfica, Texto, Aplicación, Correo electrónico&#10;&#10;El contenido generado por IA puede ser incorrecto."/>
+                    <pic:cNvPr id="19" name="Imagen3"/>
                     <pic:cNvPicPr>
                       <a:picLocks noChangeAspect="1" noChangeArrowheads="1"/>
                     </pic:cNvPicPr>
@@ -2962,7 +3044,7 @@
                   <pic:spPr bwMode="auto">
                     <a:xfrm>
                       <a:off x="0" y="0"/>
-                      <a:ext cx="6138545" cy="1688465"/>
+                      <a:ext cx="5581650" cy="1536065"/>
                     </a:xfrm>
                     <a:prstGeom prst="rect">
                       <a:avLst/>
@@ -3030,14 +3112,10 @@
         </w:rPr>
         <w:t>   </w:t>
       </w:r>
-      <w:r>
-        <w:br w:type="page"/>
-      </w:r>
-    </w:p>
-    <w:p>
-      <w:pPr>
-        <w:pStyle w:val="Normal"/>
-        <w:spacing w:before="0" w:after="160"/>
+    </w:p>
+    <w:p>
+      <w:pPr>
+        <w:pStyle w:val="Normal"/>
         <w:rPr/>
       </w:pPr>
       <w:r>
@@ -3084,103 +3162,6 @@
           <w:iCs/>
         </w:rPr>
         <w:t>Visualización de entrega en el AVA</w:t>
-      </w:r>
-    </w:p>
-    <w:p>
-      <w:pPr>
-        <w:pStyle w:val="Normal"/>
-        <w:rPr/>
-      </w:pPr>
-      <w:r>
-        <w:rPr/>
-        <w:drawing>
-          <wp:inline distT="0" distB="0" distL="0" distR="0">
-            <wp:extent cx="6195060" cy="2197100"/>
-            <wp:effectExtent l="0" t="0" r="0" b="0"/>
-            <wp:docPr id="20" name="Imagen 10" descr="Interfaz de usuario gráfica, Texto&#10;&#10;Descripción generada automáticamente"/>
-            <wp:cNvGraphicFramePr>
-              <a:graphicFrameLocks xmlns:a="http://schemas.openxmlformats.org/drawingml/2006/main" noChangeAspect="1"/>
-            </wp:cNvGraphicFramePr>
-            <a:graphic xmlns:a="http://schemas.openxmlformats.org/drawingml/2006/main">
-              <a:graphicData uri="http://schemas.openxmlformats.org/drawingml/2006/picture">
-                <pic:pic xmlns:pic="http://schemas.openxmlformats.org/drawingml/2006/picture">
-                  <pic:nvPicPr>
-                    <pic:cNvPr id="20" name="Imagen 10" descr="Interfaz de usuario gráfica, Texto&#10;&#10;Descripción generada automáticamente"/>
-                    <pic:cNvPicPr>
-                      <a:picLocks noChangeAspect="1" noChangeArrowheads="1"/>
-                    </pic:cNvPicPr>
-                  </pic:nvPicPr>
-                  <pic:blipFill>
-                    <a:blip r:embed="rId31"/>
-                    <a:srcRect l="1662" t="26471" r="0" b="0"/>
-                    <a:stretch>
-                      <a:fillRect/>
-                    </a:stretch>
-                  </pic:blipFill>
-                  <pic:spPr bwMode="auto">
-                    <a:xfrm>
-                      <a:off x="0" y="0"/>
-                      <a:ext cx="6195060" cy="2197100"/>
-                    </a:xfrm>
-                    <a:prstGeom prst="rect">
-                      <a:avLst/>
-                    </a:prstGeom>
-                    <a:noFill/>
-                  </pic:spPr>
-                </pic:pic>
-              </a:graphicData>
-            </a:graphic>
-          </wp:inline>
-        </w:drawing>
-      </w:r>
-      <w:r>
-        <w:rPr/>
-        <w:br/>
-      </w:r>
-    </w:p>
-    <w:p>
-      <w:pPr>
-        <w:pStyle w:val="Normal"/>
-        <w:rPr/>
-      </w:pPr>
-      <w:r>
-        <w:rPr/>
-      </w:r>
-    </w:p>
-    <w:p>
-      <w:pPr>
-        <w:pStyle w:val="Normal"/>
-        <w:rPr/>
-      </w:pPr>
-      <w:r>
-        <w:rPr/>
-      </w:r>
-    </w:p>
-    <w:p>
-      <w:pPr>
-        <w:pStyle w:val="Normal"/>
-        <w:rPr/>
-      </w:pPr>
-      <w:r>
-        <w:rPr/>
-      </w:r>
-    </w:p>
-    <w:p>
-      <w:pPr>
-        <w:pStyle w:val="Normal"/>
-        <w:rPr/>
-      </w:pPr>
-      <w:r>
-        <w:rPr/>
-      </w:r>
-    </w:p>
-    <w:p>
-      <w:pPr>
-        <w:pStyle w:val="Normal"/>
-        <w:rPr/>
-      </w:pPr>
-      <w:r>
-        <w:rPr/>
       </w:r>
     </w:p>
     <w:p>
@@ -3207,6 +3188,55 @@
       </w:pPr>
       <w:r>
         <w:rPr/>
+        <w:drawing>
+          <wp:inline distT="0" distB="0" distL="0" distR="0">
+            <wp:extent cx="6299835" cy="2197100"/>
+            <wp:effectExtent l="0" t="0" r="0" b="0"/>
+            <wp:docPr id="20" name="Imagen 10">
+              <a:extLst xmlns:a="http://schemas.openxmlformats.org/drawingml/2006/main">
+                <a:ext uri="{C183D7F6-B498-43B3-948B-1728B52AA6E4}">
+                  <adec:decorative xmlns:adec="http://schemas.microsoft.com/office/drawing/2017/decorative" val="1"/>
+                </a:ext>
+              </a:extLst>
+            </wp:docPr>
+            <wp:cNvGraphicFramePr>
+              <a:graphicFrameLocks xmlns:a="http://schemas.openxmlformats.org/drawingml/2006/main" noChangeAspect="1"/>
+            </wp:cNvGraphicFramePr>
+            <a:graphic xmlns:a="http://schemas.openxmlformats.org/drawingml/2006/main">
+              <a:graphicData uri="http://schemas.openxmlformats.org/drawingml/2006/picture">
+                <pic:pic xmlns:pic="http://schemas.openxmlformats.org/drawingml/2006/picture">
+                  <pic:nvPicPr>
+                    <pic:cNvPr id="20" name="Imagen 10"/>
+                    <pic:cNvPicPr>
+                      <a:picLocks noChangeAspect="1" noChangeArrowheads="1"/>
+                    </pic:cNvPicPr>
+                  </pic:nvPicPr>
+                  <pic:blipFill>
+                    <a:blip r:embed="rId31"/>
+                    <a:srcRect l="0" t="26471" r="0" b="0"/>
+                    <a:stretch>
+                      <a:fillRect/>
+                    </a:stretch>
+                  </pic:blipFill>
+                  <pic:spPr bwMode="auto">
+                    <a:xfrm>
+                      <a:off x="0" y="0"/>
+                      <a:ext cx="6299835" cy="2197100"/>
+                    </a:xfrm>
+                    <a:prstGeom prst="rect">
+                      <a:avLst/>
+                    </a:prstGeom>
+                    <a:noFill/>
+                  </pic:spPr>
+                </pic:pic>
+              </a:graphicData>
+            </a:graphic>
+          </wp:inline>
+        </w:drawing>
+      </w:r>
+      <w:r>
+        <w:rPr/>
+        <w:br/>
       </w:r>
     </w:p>
     <w:p>
@@ -3282,13 +3312,13 @@
         <mc:AlternateContent>
           <mc:Choice Requires="wps">
             <w:drawing>
-              <wp:anchor distT="0" distB="0" distL="0" distR="9525" simplePos="0" relativeHeight="32" behindDoc="0" locked="0" layoutInCell="1" allowOverlap="1" wp14:anchorId="71A805CC">
+              <wp:anchor distT="0" distB="0" distL="0" distR="9525" simplePos="0" relativeHeight="33" behindDoc="0" locked="0" layoutInCell="1" allowOverlap="1" wp14:anchorId="71A805CC">
                 <wp:simplePos x="0" y="0"/>
                 <wp:positionH relativeFrom="column">
-                  <wp:posOffset>-374650</wp:posOffset>
+                  <wp:posOffset>-375285</wp:posOffset>
                 </wp:positionH>
                 <wp:positionV relativeFrom="paragraph">
-                  <wp:posOffset>426720</wp:posOffset>
+                  <wp:posOffset>401320</wp:posOffset>
                 </wp:positionV>
                 <wp:extent cx="7019925" cy="4500245"/>
                 <wp:effectExtent l="1270" t="1270" r="0" b="0"/>
@@ -3338,7 +3368,7 @@
           </mc:Choice>
           <mc:Fallback>
             <w:pict>
-              <v:roundrect id="shape_0" fillcolor="#e6e7e8" stroked="f" o:allowincell="f" style="position:absolute;margin-left:-29.5pt;margin-top:33.6pt;width:552.7pt;height:354.3pt;mso-wrap-style:none;v-text-anchor:middle" wp14:anchorId="71A805CC">
+              <v:roundrect id="shape_0" fillcolor="#e6e7e8" stroked="f" o:allowincell="f" style="position:absolute;margin-left:-29.55pt;margin-top:31.6pt;width:552.7pt;height:354.3pt;mso-wrap-style:none;v-text-anchor:middle" wp14:anchorId="71A805CC">
                 <v:fill o:detectmouseclick="t" type="solid" color2="#191817"/>
                 <v:stroke color="#3465a4" weight="12600" joinstyle="miter" endcap="flat"/>
                 <w10:wrap type="none"/>
@@ -3392,7 +3422,7 @@
       <w:r>
         <w:rPr/>
         <w:drawing>
-          <wp:anchor distT="0" distB="0" distL="0" distR="0" simplePos="0" relativeHeight="33" behindDoc="0" locked="0" layoutInCell="1" allowOverlap="1">
+          <wp:anchor distT="0" distB="0" distL="0" distR="0" simplePos="0" relativeHeight="34" behindDoc="0" locked="0" layoutInCell="1" allowOverlap="1">
             <wp:simplePos x="0" y="0"/>
             <wp:positionH relativeFrom="column">
               <wp:posOffset>1642745</wp:posOffset>
@@ -3807,7 +3837,7 @@
 <w:ftr xmlns:o="urn:schemas-microsoft-com:office:office" xmlns:r="http://schemas.openxmlformats.org/officeDocument/2006/relationships" xmlns:v="urn:schemas-microsoft-com:vml" xmlns:w="http://schemas.openxmlformats.org/wordprocessingml/2006/main" xmlns:w10="urn:schemas-microsoft-com:office:word" xmlns:wp="http://schemas.openxmlformats.org/drawingml/2006/wordprocessingDrawing" xmlns:pic="http://schemas.openxmlformats.org/drawingml/2006/picture" xmlns:wps="http://schemas.microsoft.com/office/word/2010/wordprocessingShape" xmlns:wpg="http://schemas.microsoft.com/office/word/2010/wordprocessingGroup" xmlns:mc="http://schemas.openxmlformats.org/markup-compatibility/2006" xmlns:wp14="http://schemas.microsoft.com/office/word/2010/wordprocessingDrawing" xmlns:w14="http://schemas.microsoft.com/office/word/2010/wordml" xmlns:w15="http://schemas.microsoft.com/office/word/2012/wordml" mc:Ignorable="w14 wp14 w15">
   <w:sdt>
     <w:sdtPr>
-      <w:id w:val="-529718792"/>
+      <w:id w:val="-770158945"/>
       <w:docPartObj>
         <w:docPartGallery w:val="Page Numbers (Bottom of Page)"/>
         <w:docPartUnique w:val="true"/>
@@ -3825,7 +3855,7 @@
           <mc:AlternateContent>
             <mc:Choice Requires="wpg">
               <w:drawing>
-                <wp:anchor distT="0" distB="16510" distL="0" distR="23495" simplePos="0" relativeHeight="27" behindDoc="1" locked="0" layoutInCell="1" allowOverlap="1" wp14:anchorId="0694215B">
+                <wp:anchor distT="0" distB="16510" distL="0" distR="23495" simplePos="0" relativeHeight="9" behindDoc="1" locked="0" layoutInCell="1" allowOverlap="1" wp14:anchorId="0A2BBC52">
                   <wp:simplePos x="0" y="0"/>
                   <wp:positionH relativeFrom="column">
                     <wp:posOffset>5206365</wp:posOffset>
@@ -4026,7 +4056,7 @@
 <w:ftr xmlns:o="urn:schemas-microsoft-com:office:office" xmlns:r="http://schemas.openxmlformats.org/officeDocument/2006/relationships" xmlns:v="urn:schemas-microsoft-com:vml" xmlns:w="http://schemas.openxmlformats.org/wordprocessingml/2006/main" xmlns:w10="urn:schemas-microsoft-com:office:word" xmlns:wp="http://schemas.openxmlformats.org/drawingml/2006/wordprocessingDrawing" xmlns:pic="http://schemas.openxmlformats.org/drawingml/2006/picture" xmlns:wps="http://schemas.microsoft.com/office/word/2010/wordprocessingShape" xmlns:wpg="http://schemas.microsoft.com/office/word/2010/wordprocessingGroup" xmlns:mc="http://schemas.openxmlformats.org/markup-compatibility/2006" xmlns:wp14="http://schemas.microsoft.com/office/word/2010/wordprocessingDrawing" xmlns:w14="http://schemas.microsoft.com/office/word/2010/wordml" xmlns:w15="http://schemas.microsoft.com/office/word/2012/wordml" mc:Ignorable="w14 wp14 w15">
   <w:sdt>
     <w:sdtPr>
-      <w:id w:val="-529718792"/>
+      <w:id w:val="-770158945"/>
       <w:docPartObj>
         <w:docPartGallery w:val="Page Numbers (Bottom of Page)"/>
         <w:docPartUnique w:val="true"/>
@@ -4044,7 +4074,7 @@
           <mc:AlternateContent>
             <mc:Choice Requires="wpg">
               <w:drawing>
-                <wp:anchor distT="0" distB="16510" distL="0" distR="23495" simplePos="0" relativeHeight="38" behindDoc="1" locked="0" layoutInCell="1" allowOverlap="1" wp14:anchorId="0694215B">
+                <wp:anchor distT="0" distB="16510" distL="0" distR="23495" simplePos="0" relativeHeight="20" behindDoc="1" locked="0" layoutInCell="1" allowOverlap="1" wp14:anchorId="0A2BBC52">
                   <wp:simplePos x="0" y="0"/>
                   <wp:positionH relativeFrom="column">
                     <wp:posOffset>0</wp:posOffset>
@@ -4345,7 +4375,7 @@
     <w:r>
       <w:rPr/>
       <w:drawing>
-        <wp:anchor distT="0" distB="0" distL="0" distR="0" simplePos="0" relativeHeight="23" behindDoc="1" locked="0" layoutInCell="0" allowOverlap="1">
+        <wp:anchor distT="0" distB="0" distL="0" distR="0" simplePos="0" relativeHeight="5" behindDoc="1" locked="0" layoutInCell="0" allowOverlap="1">
           <wp:simplePos x="0" y="0"/>
           <wp:positionH relativeFrom="margin">
             <wp:posOffset>4344670</wp:posOffset>
@@ -4749,279 +4779,6 @@
   <w:abstractNum w:abstractNumId="3">
     <w:lvl w:ilvl="0">
       <w:start w:val="1"/>
-      <w:numFmt w:val="bullet"/>
-      <w:lvlText w:val=""/>
-      <w:lvlJc w:val="start"/>
-      <w:pPr>
-        <w:tabs>
-          <w:tab w:val="num" w:pos="0"/>
-        </w:tabs>
-        <w:ind w:start="720" w:hanging="360"/>
-      </w:pPr>
-      <w:rPr>
-        <w:rFonts w:ascii="Symbol" w:hAnsi="Symbol" w:cs="Symbol" w:hint="default"/>
-      </w:rPr>
-    </w:lvl>
-    <w:lvl w:ilvl="1">
-      <w:start w:val="1"/>
-      <w:numFmt w:val="bullet"/>
-      <w:lvlText w:val="o"/>
-      <w:lvlJc w:val="start"/>
-      <w:pPr>
-        <w:tabs>
-          <w:tab w:val="num" w:pos="0"/>
-        </w:tabs>
-        <w:ind w:start="1440" w:hanging="360"/>
-      </w:pPr>
-      <w:rPr>
-        <w:rFonts w:ascii="Courier New" w:hAnsi="Courier New" w:cs="Courier New" w:hint="default"/>
-      </w:rPr>
-    </w:lvl>
-    <w:lvl w:ilvl="2">
-      <w:start w:val="1"/>
-      <w:numFmt w:val="bullet"/>
-      <w:lvlText w:val=""/>
-      <w:lvlJc w:val="start"/>
-      <w:pPr>
-        <w:tabs>
-          <w:tab w:val="num" w:pos="0"/>
-        </w:tabs>
-        <w:ind w:start="2160" w:hanging="360"/>
-      </w:pPr>
-      <w:rPr>
-        <w:rFonts w:ascii="Wingdings" w:hAnsi="Wingdings" w:cs="Wingdings" w:hint="default"/>
-      </w:rPr>
-    </w:lvl>
-    <w:lvl w:ilvl="3">
-      <w:start w:val="1"/>
-      <w:numFmt w:val="bullet"/>
-      <w:lvlText w:val=""/>
-      <w:lvlJc w:val="start"/>
-      <w:pPr>
-        <w:tabs>
-          <w:tab w:val="num" w:pos="0"/>
-        </w:tabs>
-        <w:ind w:start="2880" w:hanging="360"/>
-      </w:pPr>
-      <w:rPr>
-        <w:rFonts w:ascii="Symbol" w:hAnsi="Symbol" w:cs="Symbol" w:hint="default"/>
-      </w:rPr>
-    </w:lvl>
-    <w:lvl w:ilvl="4">
-      <w:start w:val="1"/>
-      <w:numFmt w:val="bullet"/>
-      <w:lvlText w:val="o"/>
-      <w:lvlJc w:val="start"/>
-      <w:pPr>
-        <w:tabs>
-          <w:tab w:val="num" w:pos="0"/>
-        </w:tabs>
-        <w:ind w:start="3600" w:hanging="360"/>
-      </w:pPr>
-      <w:rPr>
-        <w:rFonts w:ascii="Courier New" w:hAnsi="Courier New" w:cs="Courier New" w:hint="default"/>
-      </w:rPr>
-    </w:lvl>
-    <w:lvl w:ilvl="5">
-      <w:start w:val="1"/>
-      <w:numFmt w:val="bullet"/>
-      <w:lvlText w:val=""/>
-      <w:lvlJc w:val="start"/>
-      <w:pPr>
-        <w:tabs>
-          <w:tab w:val="num" w:pos="0"/>
-        </w:tabs>
-        <w:ind w:start="4320" w:hanging="360"/>
-      </w:pPr>
-      <w:rPr>
-        <w:rFonts w:ascii="Wingdings" w:hAnsi="Wingdings" w:cs="Wingdings" w:hint="default"/>
-      </w:rPr>
-    </w:lvl>
-    <w:lvl w:ilvl="6">
-      <w:start w:val="1"/>
-      <w:numFmt w:val="bullet"/>
-      <w:lvlText w:val=""/>
-      <w:lvlJc w:val="start"/>
-      <w:pPr>
-        <w:tabs>
-          <w:tab w:val="num" w:pos="0"/>
-        </w:tabs>
-        <w:ind w:start="5040" w:hanging="360"/>
-      </w:pPr>
-      <w:rPr>
-        <w:rFonts w:ascii="Symbol" w:hAnsi="Symbol" w:cs="Symbol" w:hint="default"/>
-      </w:rPr>
-    </w:lvl>
-    <w:lvl w:ilvl="7">
-      <w:start w:val="1"/>
-      <w:numFmt w:val="bullet"/>
-      <w:lvlText w:val="o"/>
-      <w:lvlJc w:val="start"/>
-      <w:pPr>
-        <w:tabs>
-          <w:tab w:val="num" w:pos="0"/>
-        </w:tabs>
-        <w:ind w:start="5760" w:hanging="360"/>
-      </w:pPr>
-      <w:rPr>
-        <w:rFonts w:ascii="Courier New" w:hAnsi="Courier New" w:cs="Courier New" w:hint="default"/>
-      </w:rPr>
-    </w:lvl>
-    <w:lvl w:ilvl="8">
-      <w:start w:val="1"/>
-      <w:numFmt w:val="bullet"/>
-      <w:lvlText w:val=""/>
-      <w:lvlJc w:val="start"/>
-      <w:pPr>
-        <w:tabs>
-          <w:tab w:val="num" w:pos="0"/>
-        </w:tabs>
-        <w:ind w:start="6480" w:hanging="360"/>
-      </w:pPr>
-      <w:rPr>
-        <w:rFonts w:ascii="Wingdings" w:hAnsi="Wingdings" w:cs="Wingdings" w:hint="default"/>
-      </w:rPr>
-    </w:lvl>
-  </w:abstractNum>
-  <w:abstractNum w:abstractNumId="4">
-    <w:lvl w:ilvl="0">
-      <w:numFmt w:val="bullet"/>
-      <w:lvlText w:val=""/>
-      <w:lvlJc w:val="start"/>
-      <w:pPr>
-        <w:tabs>
-          <w:tab w:val="num" w:pos="0"/>
-        </w:tabs>
-        <w:ind w:start="720" w:hanging="360"/>
-      </w:pPr>
-      <w:rPr>
-        <w:rFonts w:ascii="Symbol" w:hAnsi="Symbol" w:cs="Symbol" w:hint="default"/>
-      </w:rPr>
-    </w:lvl>
-    <w:lvl w:ilvl="1">
-      <w:start w:val="1"/>
-      <w:numFmt w:val="bullet"/>
-      <w:lvlText w:val="o"/>
-      <w:lvlJc w:val="start"/>
-      <w:pPr>
-        <w:tabs>
-          <w:tab w:val="num" w:pos="0"/>
-        </w:tabs>
-        <w:ind w:start="1440" w:hanging="360"/>
-      </w:pPr>
-      <w:rPr>
-        <w:rFonts w:ascii="Courier New" w:hAnsi="Courier New" w:cs="Courier New" w:hint="default"/>
-      </w:rPr>
-    </w:lvl>
-    <w:lvl w:ilvl="2">
-      <w:start w:val="1"/>
-      <w:numFmt w:val="bullet"/>
-      <w:lvlText w:val=""/>
-      <w:lvlJc w:val="start"/>
-      <w:pPr>
-        <w:tabs>
-          <w:tab w:val="num" w:pos="0"/>
-        </w:tabs>
-        <w:ind w:start="2160" w:hanging="360"/>
-      </w:pPr>
-      <w:rPr>
-        <w:rFonts w:ascii="Wingdings" w:hAnsi="Wingdings" w:cs="Wingdings" w:hint="default"/>
-      </w:rPr>
-    </w:lvl>
-    <w:lvl w:ilvl="3">
-      <w:start w:val="1"/>
-      <w:numFmt w:val="bullet"/>
-      <w:lvlText w:val=""/>
-      <w:lvlJc w:val="start"/>
-      <w:pPr>
-        <w:tabs>
-          <w:tab w:val="num" w:pos="0"/>
-        </w:tabs>
-        <w:ind w:start="2880" w:hanging="360"/>
-      </w:pPr>
-      <w:rPr>
-        <w:rFonts w:ascii="Symbol" w:hAnsi="Symbol" w:cs="Symbol" w:hint="default"/>
-      </w:rPr>
-    </w:lvl>
-    <w:lvl w:ilvl="4">
-      <w:start w:val="1"/>
-      <w:numFmt w:val="bullet"/>
-      <w:lvlText w:val="o"/>
-      <w:lvlJc w:val="start"/>
-      <w:pPr>
-        <w:tabs>
-          <w:tab w:val="num" w:pos="0"/>
-        </w:tabs>
-        <w:ind w:start="3600" w:hanging="360"/>
-      </w:pPr>
-      <w:rPr>
-        <w:rFonts w:ascii="Courier New" w:hAnsi="Courier New" w:cs="Courier New" w:hint="default"/>
-      </w:rPr>
-    </w:lvl>
-    <w:lvl w:ilvl="5">
-      <w:start w:val="1"/>
-      <w:numFmt w:val="bullet"/>
-      <w:lvlText w:val=""/>
-      <w:lvlJc w:val="start"/>
-      <w:pPr>
-        <w:tabs>
-          <w:tab w:val="num" w:pos="0"/>
-        </w:tabs>
-        <w:ind w:start="4320" w:hanging="360"/>
-      </w:pPr>
-      <w:rPr>
-        <w:rFonts w:ascii="Wingdings" w:hAnsi="Wingdings" w:cs="Wingdings" w:hint="default"/>
-      </w:rPr>
-    </w:lvl>
-    <w:lvl w:ilvl="6">
-      <w:start w:val="1"/>
-      <w:numFmt w:val="bullet"/>
-      <w:lvlText w:val=""/>
-      <w:lvlJc w:val="start"/>
-      <w:pPr>
-        <w:tabs>
-          <w:tab w:val="num" w:pos="0"/>
-        </w:tabs>
-        <w:ind w:start="5040" w:hanging="360"/>
-      </w:pPr>
-      <w:rPr>
-        <w:rFonts w:ascii="Symbol" w:hAnsi="Symbol" w:cs="Symbol" w:hint="default"/>
-      </w:rPr>
-    </w:lvl>
-    <w:lvl w:ilvl="7">
-      <w:start w:val="1"/>
-      <w:numFmt w:val="bullet"/>
-      <w:lvlText w:val="o"/>
-      <w:lvlJc w:val="start"/>
-      <w:pPr>
-        <w:tabs>
-          <w:tab w:val="num" w:pos="0"/>
-        </w:tabs>
-        <w:ind w:start="5760" w:hanging="360"/>
-      </w:pPr>
-      <w:rPr>
-        <w:rFonts w:ascii="Courier New" w:hAnsi="Courier New" w:cs="Courier New" w:hint="default"/>
-      </w:rPr>
-    </w:lvl>
-    <w:lvl w:ilvl="8">
-      <w:start w:val="1"/>
-      <w:numFmt w:val="bullet"/>
-      <w:lvlText w:val=""/>
-      <w:lvlJc w:val="start"/>
-      <w:pPr>
-        <w:tabs>
-          <w:tab w:val="num" w:pos="0"/>
-        </w:tabs>
-        <w:ind w:start="6480" w:hanging="360"/>
-      </w:pPr>
-      <w:rPr>
-        <w:rFonts w:ascii="Wingdings" w:hAnsi="Wingdings" w:cs="Wingdings" w:hint="default"/>
-      </w:rPr>
-    </w:lvl>
-  </w:abstractNum>
-  <w:abstractNum w:abstractNumId="5">
-    <w:lvl w:ilvl="0">
-      <w:start w:val="1"/>
       <w:numFmt w:val="none"/>
       <w:suff w:val="nothing"/>
       <w:lvlText w:val=""/>
@@ -5147,12 +4904,6 @@
   <w:num w:numId="3">
     <w:abstractNumId w:val="3"/>
   </w:num>
-  <w:num w:numId="4">
-    <w:abstractNumId w:val="4"/>
-  </w:num>
-  <w:num w:numId="5">
-    <w:abstractNumId w:val="5"/>
-  </w:num>
 </w:numbering>
 </file>
 
@@ -5161,7 +4912,7 @@
   <w:docDefaults>
     <w:rPrDefault>
       <w:rPr>
-        <w:rFonts w:ascii="Arial" w:hAnsi="Arial" w:eastAsia="Arial" w:cs="Arial" w:asciiTheme="minorHAnsi" w:cstheme="minorBidi" w:eastAsiaTheme="minorHAnsi" w:hAnsiTheme="minorHAnsi"/>
+        <w:rFonts w:ascii="Arial" w:hAnsi="Arial" w:eastAsia="Arial" w:cs="" w:asciiTheme="minorHAnsi" w:cstheme="minorBidi" w:eastAsiaTheme="minorHAnsi" w:hAnsiTheme="minorHAnsi"/>
         <w:kern w:val="2"/>
         <w:sz w:val="22"/>
         <w:szCs w:val="22"/>
@@ -5565,7 +5316,7 @@
       <w:jc w:val="start"/>
     </w:pPr>
     <w:rPr>
-      <w:rFonts w:ascii="Arial" w:hAnsi="Arial" w:eastAsia="Arial" w:cs="Arial"/>
+      <w:rFonts w:ascii="Arial" w:hAnsi="Arial" w:eastAsia="Arial" w:cs=""/>
       <w:color w:themeColor="text1" w:themeTint="bf" w:val="404040"/>
       <w:kern w:val="2"/>
       <w:sz w:val="24"/>
@@ -5589,7 +5340,7 @@
       <w:outlineLvl w:val="0"/>
     </w:pPr>
     <w:rPr>
-      <w:rFonts w:eastAsia="ＭＳ Ｐゴシック" w:cs="Arial" w:cstheme="majorBidi" w:eastAsiaTheme="majorEastAsia"/>
+      <w:rFonts w:eastAsia="" w:cs="" w:cstheme="majorBidi" w:eastAsiaTheme="majorEastAsia"/>
       <w:b/>
       <w:kern w:val="0"/>
       <w:sz w:val="44"/>
@@ -5613,7 +5364,7 @@
       <w:outlineLvl w:val="1"/>
     </w:pPr>
     <w:rPr>
-      <w:rFonts w:eastAsia="ＭＳ Ｐゴシック" w:cs="Arial" w:cstheme="majorBidi" w:eastAsiaTheme="majorEastAsia"/>
+      <w:rFonts w:eastAsia="" w:cs="" w:cstheme="majorBidi" w:eastAsiaTheme="majorEastAsia"/>
       <w:b/>
       <w:sz w:val="32"/>
       <w:szCs w:val="26"/>
@@ -5643,7 +5394,6 @@
   <w:style w:type="character" w:styleId="DefaultParagraphFont" w:default="1">
     <w:name w:val="Default Paragraph Font"/>
     <w:uiPriority w:val="1"/>
-    <w:semiHidden/>
     <w:unhideWhenUsed/>
     <w:qFormat/>
     <w:rPr/>
@@ -5655,7 +5405,7 @@
     <w:qFormat/>
     <w:rsid w:val="00e05d9e"/>
     <w:rPr>
-      <w:rFonts w:ascii="Arial" w:hAnsi="Arial" w:eastAsia="ＭＳ Ｐゴシック" w:cs="Arial" w:cstheme="majorBidi" w:eastAsiaTheme="majorEastAsia"/>
+      <w:rFonts w:ascii="Arial" w:hAnsi="Arial" w:eastAsia="" w:cs="" w:cstheme="majorBidi" w:eastAsiaTheme="majorEastAsia"/>
       <w:b/>
       <w:color w:themeColor="text1" w:themeTint="bf" w:val="404040"/>
       <w:spacing w:val="-10"/>
@@ -5670,9 +5420,9 @@
     <w:basedOn w:val="TtuloCar"/>
     <w:link w:val="carrera1"/>
     <w:qFormat/>
-    <w:rsid w:val="00c709bc"/>
+    <w:rsid w:val="006873b9"/>
     <w:rPr>
-      <w:rFonts w:ascii="Arial" w:hAnsi="Arial" w:eastAsia="ＭＳ Ｐゴシック" w:cs="Arial" w:cstheme="majorBidi" w:eastAsiaTheme="majorEastAsia"/>
+      <w:rFonts w:ascii="Arial" w:hAnsi="Arial" w:eastAsia="" w:cs="" w:cstheme="majorBidi" w:eastAsiaTheme="majorEastAsia"/>
       <w:b/>
       <w:color w:themeColor="text1" w:themeTint="bf" w:val="404040"/>
       <w:spacing w:val="-10"/>
@@ -5687,9 +5437,9 @@
     <w:basedOn w:val="carrera1Car"/>
     <w:link w:val="carrera2"/>
     <w:qFormat/>
-    <w:rsid w:val="00c709bc"/>
+    <w:rsid w:val="006873b9"/>
     <w:rPr>
-      <w:rFonts w:ascii="Arial" w:hAnsi="Arial" w:eastAsia="ＭＳ Ｐゴシック" w:cs="Arial" w:cstheme="majorBidi" w:eastAsiaTheme="majorEastAsia"/>
+      <w:rFonts w:ascii="Arial" w:hAnsi="Arial" w:eastAsia="" w:cs="" w:cstheme="majorBidi" w:eastAsiaTheme="majorEastAsia"/>
       <w:b/>
       <w:color w:themeColor="text1" w:themeTint="bf" w:val="404040"/>
       <w:spacing w:val="-10"/>
@@ -5706,7 +5456,7 @@
     <w:qFormat/>
     <w:rsid w:val="00241db1"/>
     <w:rPr>
-      <w:rFonts w:ascii="Arial" w:hAnsi="Arial" w:eastAsia="ＭＳ Ｐゴシック" w:cs="Arial" w:cstheme="majorBidi" w:eastAsiaTheme="majorEastAsia"/>
+      <w:rFonts w:ascii="Arial" w:hAnsi="Arial" w:eastAsia="" w:cs="" w:cstheme="majorBidi" w:eastAsiaTheme="majorEastAsia"/>
       <w:b/>
       <w:color w:themeColor="text1" w:themeTint="bf" w:val="404040"/>
       <w:kern w:val="0"/>
@@ -5789,7 +5539,7 @@
     <w:qFormat/>
     <w:rsid w:val="0065508a"/>
     <w:rPr>
-      <w:rFonts w:ascii="Arial" w:hAnsi="Arial" w:eastAsia="ＭＳ Ｐゴシック" w:cs="Arial" w:cstheme="majorBidi" w:eastAsiaTheme="majorEastAsia"/>
+      <w:rFonts w:ascii="Arial" w:hAnsi="Arial" w:eastAsia="" w:cs="" w:cstheme="majorBidi" w:eastAsiaTheme="majorEastAsia"/>
       <w:b/>
       <w:color w:themeColor="text1" w:themeTint="bf" w:val="404040"/>
       <w:sz w:val="32"/>
@@ -5920,7 +5670,7 @@
       <w:contextualSpacing/>
     </w:pPr>
     <w:rPr>
-      <w:rFonts w:eastAsia="ＭＳ Ｐゴシック" w:cs="Arial" w:cstheme="majorBidi" w:eastAsiaTheme="majorEastAsia"/>
+      <w:rFonts w:eastAsia="" w:cs="" w:cstheme="majorBidi" w:eastAsiaTheme="majorEastAsia"/>
       <w:b/>
       <w:spacing w:val="-10"/>
       <w:kern w:val="2"/>
@@ -5947,7 +5697,7 @@
     <w:next w:val="carrera2"/>
     <w:link w:val="carrera1Car"/>
     <w:qFormat/>
-    <w:rsid w:val="00c709bc"/>
+    <w:rsid w:val="006873b9"/>
     <w:pPr/>
     <w:rPr>
       <w:sz w:val="48"/>
@@ -5957,7 +5707,7 @@
     <w:name w:val="carrera2"/>
     <w:link w:val="carrera2Car"/>
     <w:qFormat/>
-    <w:rsid w:val="00c709bc"/>
+    <w:rsid w:val="006873b9"/>
     <w:pPr>
       <w:widowControl/>
       <w:bidi w:val="0"/>
@@ -5966,7 +5716,7 @@
       <w:jc w:val="start"/>
     </w:pPr>
     <w:rPr>
-      <w:rFonts w:ascii="Arial" w:hAnsi="Arial" w:eastAsia="ＭＳ Ｐゴシック" w:cs="Arial" w:cstheme="majorBidi" w:eastAsiaTheme="majorEastAsia"/>
+      <w:rFonts w:ascii="Arial" w:hAnsi="Arial" w:eastAsia="" w:cs="" w:cstheme="majorBidi" w:eastAsiaTheme="majorEastAsia"/>
       <w:b/>
       <w:color w:themeColor="text1" w:themeTint="bf" w:val="404040"/>
       <w:spacing w:val="-10"/>
@@ -6048,6 +5798,7 @@
         <w:numId w:val="1"/>
       </w:numPr>
       <w:spacing w:before="0" w:after="160"/>
+      <w:ind w:start="360"/>
       <w:contextualSpacing/>
     </w:pPr>
     <w:rPr>
@@ -6191,7 +5942,7 @@
     <w:basedOn w:val="Normal"/>
     <w:uiPriority w:val="1"/>
     <w:qFormat/>
-    <w:rsid w:val="00c709bc"/>
+    <w:rsid w:val="006873b9"/>
     <w:pPr>
       <w:spacing w:lineRule="auto" w:line="259"/>
     </w:pPr>
@@ -6207,7 +5958,7 @@
     <w:basedOn w:val="Normal"/>
     <w:uiPriority w:val="1"/>
     <w:qFormat/>
-    <w:rsid w:val="00c20947"/>
+    <w:rsid w:val="00220e71"/>
     <w:pPr>
       <w:spacing w:lineRule="auto" w:line="259"/>
     </w:pPr>
@@ -6217,6 +5968,25 @@
       <w:kern w:val="0"/>
       <w:sz w:val="36"/>
       <w:szCs w:val="36"/>
+      <w14:ligatures w14:val="none"/>
+    </w:rPr>
+  </w:style>
+  <w:style w:type="paragraph" w:styleId="NormalWeb">
+    <w:name w:val="Normal (Web)"/>
+    <w:basedOn w:val="Normal"/>
+    <w:uiPriority w:val="99"/>
+    <w:unhideWhenUsed/>
+    <w:qFormat/>
+    <w:rsid w:val="007c5444"/>
+    <w:pPr>
+      <w:spacing w:lineRule="auto" w:line="240" w:beforeAutospacing="1" w:afterAutospacing="1"/>
+    </w:pPr>
+    <w:rPr>
+      <w:rFonts w:ascii="Times New Roman" w:hAnsi="Times New Roman" w:eastAsia="Times New Roman" w:cs="Times New Roman"/>
+      <w:color w:val="auto"/>
+      <w:kern w:val="0"/>
+      <w:szCs w:val="24"/>
+      <w:lang w:val="es-MX" w:eastAsia="es-MX"/>
       <w14:ligatures w14:val="none"/>
     </w:rPr>
   </w:style>
@@ -6450,33 +6220,6 @@
 </file>
 
 <file path=customXml/item1.xml><?xml version="1.0" encoding="utf-8"?>
-<b:Sources xmlns:b="http://schemas.openxmlformats.org/officeDocument/2006/bibliography" xmlns="http://schemas.openxmlformats.org/officeDocument/2006/bibliography" SelectedStyle="\APASixthEditionOfficeOnline.xsl" StyleName="APA" Version="6"/>
-</file>
-
-<file path=customXml/item2.xml><?xml version="1.0" encoding="utf-8"?>
-<p:properties xmlns:p="http://schemas.microsoft.com/office/2006/metadata/properties" xmlns:xsi="http://www.w3.org/2001/XMLSchema-instance" xmlns:pc="http://schemas.microsoft.com/office/infopath/2007/PartnerControls">
-  <documentManagement>
-    <lcf76f155ced4ddcb4097134ff3c332f xmlns="d0daa353-f819-43d1-badf-ce69fea8800d">
-      <Terms xmlns="http://schemas.microsoft.com/office/infopath/2007/PartnerControls"/>
-    </lcf76f155ced4ddcb4097134ff3c332f>
-    <TaxCatchAll xmlns="edc1eb1c-f9b5-429a-a0ce-702847a0aa2d" xsi:nil="true"/>
-    <Fecha_x0020_de_x0020_creaci_x00f3_n xmlns="d0daa353-f819-43d1-badf-ce69fea8800d" xsi:nil="true"/>
-    <Fechayhora xmlns="d0daa353-f819-43d1-badf-ce69fea8800d" xsi:nil="true"/>
-    <SharedWithUsers xmlns="edc1eb1c-f9b5-429a-a0ce-702847a0aa2d">
-      <UserInfo>
-        <DisplayName/>
-        <AccountId xsi:nil="true"/>
-        <AccountType/>
-      </UserInfo>
-    </SharedWithUsers>
-    <MediaLengthInSeconds xmlns="d0daa353-f819-43d1-badf-ce69fea8800d" xsi:nil="true"/>
-    <_ip_UnifiedCompliancePolicyUIAction xmlns="http://schemas.microsoft.com/sharepoint/v3" xsi:nil="true"/>
-    <_ip_UnifiedCompliancePolicyProperties xmlns="http://schemas.microsoft.com/sharepoint/v3" xsi:nil="true"/>
-  </documentManagement>
-</p:properties>
-</file>
-
-<file path=customXml/item3.xml><?xml version="1.0" encoding="utf-8"?>
 <ct:contentTypeSchema xmlns:ct="http://schemas.microsoft.com/office/2006/metadata/contentType" xmlns:ma="http://schemas.microsoft.com/office/2006/metadata/properties/metaAttributes" ct:_="" ma:_="" ma:contentTypeName="Documento" ma:contentTypeID="0x01010070BFDEA41A5D8B46AA5DA2E2389CBE4E" ma:contentTypeVersion="23" ma:contentTypeDescription="Crear nuevo documento." ma:contentTypeScope="" ma:versionID="490cbdf45969e6e1fa52b80167f5a80f">
   <xsd:schema xmlns:xsd="http://www.w3.org/2001/XMLSchema" xmlns:xs="http://www.w3.org/2001/XMLSchema" xmlns:p="http://schemas.microsoft.com/office/2006/metadata/properties" xmlns:ns1="http://schemas.microsoft.com/sharepoint/v3" xmlns:ns2="d0daa353-f819-43d1-badf-ce69fea8800d" xmlns:ns3="edc1eb1c-f9b5-429a-a0ce-702847a0aa2d" targetNamespace="http://schemas.microsoft.com/office/2006/metadata/properties" ma:root="true" ma:fieldsID="a1528bd698619fda81f73a8d7d8a525d" ns1:_="" ns2:_="" ns3:_="">
     <xsd:import namespace="http://schemas.microsoft.com/sharepoint/v3"/>
@@ -6754,7 +6497,7 @@
 </ct:contentTypeSchema>
 </file>
 
-<file path=customXml/item4.xml><?xml version="1.0" encoding="utf-8"?>
+<file path=customXml/item2.xml><?xml version="1.0" encoding="utf-8"?>
 <?mso-contentType ?>
 <FormTemplates xmlns="http://schemas.microsoft.com/sharepoint/v3/contenttype/forms">
   <Display>DocumentLibraryForm</Display>
@@ -6763,15 +6506,54 @@
 </FormTemplates>
 </file>
 
+<file path=customXml/item3.xml><?xml version="1.0" encoding="utf-8"?>
+<b:Sources xmlns:b="http://schemas.openxmlformats.org/officeDocument/2006/bibliography" xmlns="http://schemas.openxmlformats.org/officeDocument/2006/bibliography" SelectedStyle="\APASixthEditionOfficeOnline.xsl" StyleName="APA" Version="6"/>
+</file>
+
+<file path=customXml/item4.xml><?xml version="1.0" encoding="utf-8"?>
+<p:properties xmlns:p="http://schemas.microsoft.com/office/2006/metadata/properties" xmlns:xsi="http://www.w3.org/2001/XMLSchema-instance" xmlns:pc="http://schemas.microsoft.com/office/infopath/2007/PartnerControls">
+  <documentManagement>
+    <lcf76f155ced4ddcb4097134ff3c332f xmlns="d0daa353-f819-43d1-badf-ce69fea8800d">
+      <Terms xmlns="http://schemas.microsoft.com/office/infopath/2007/PartnerControls"/>
+    </lcf76f155ced4ddcb4097134ff3c332f>
+    <TaxCatchAll xmlns="edc1eb1c-f9b5-429a-a0ce-702847a0aa2d" xsi:nil="true"/>
+    <Fecha_x0020_de_x0020_creaci_x00f3_n xmlns="d0daa353-f819-43d1-badf-ce69fea8800d" xsi:nil="true"/>
+    <Fechayhora xmlns="d0daa353-f819-43d1-badf-ce69fea8800d" xsi:nil="true"/>
+    <SharedWithUsers xmlns="edc1eb1c-f9b5-429a-a0ce-702847a0aa2d">
+      <UserInfo>
+        <DisplayName/>
+        <AccountId xsi:nil="true"/>
+        <AccountType/>
+      </UserInfo>
+    </SharedWithUsers>
+    <MediaLengthInSeconds xmlns="d0daa353-f819-43d1-badf-ce69fea8800d" xsi:nil="true"/>
+    <_ip_UnifiedCompliancePolicyUIAction xmlns="http://schemas.microsoft.com/sharepoint/v3" xsi:nil="true"/>
+    <_ip_UnifiedCompliancePolicyProperties xmlns="http://schemas.microsoft.com/sharepoint/v3" xsi:nil="true"/>
+  </documentManagement>
+</p:properties>
+</file>
+
 <file path=customXml/itemProps1.xml><?xml version="1.0" encoding="utf-8"?>
-<ds:datastoreItem xmlns:ds="http://schemas.openxmlformats.org/officeDocument/2006/customXml" ds:itemID="{6885F90C-BB57-4945-ACE1-53E888896D91}">
+<ds:datastoreItem xmlns:ds="http://schemas.openxmlformats.org/officeDocument/2006/customXml" ds:itemID="{C28C73C0-C971-4EF9-BCF6-DA8A179F8E59}"/>
+</file>
+
+<file path=customXml/itemProps2.xml><?xml version="1.0" encoding="utf-8"?>
+<ds:datastoreItem xmlns:ds="http://schemas.openxmlformats.org/officeDocument/2006/customXml" ds:itemID="{58D8DE95-DF74-49C6-8885-90B115E8F94F}">
+  <ds:schemaRefs>
+    <ds:schemaRef ds:uri="http://schemas.microsoft.com/sharepoint/v3/contenttype/forms"/>
+  </ds:schemaRefs>
+</ds:datastoreItem>
+</file>
+
+<file path=customXml/itemProps3.xml><?xml version="1.0" encoding="utf-8"?>
+<ds:datastoreItem xmlns:ds="http://schemas.openxmlformats.org/officeDocument/2006/customXml" ds:itemID="{DEB73F9D-F662-47F0-B1B4-CC4EDF51573A}">
   <ds:schemaRefs>
     <ds:schemaRef ds:uri="http://schemas.openxmlformats.org/officeDocument/2006/bibliography"/>
   </ds:schemaRefs>
 </ds:datastoreItem>
 </file>
 
-<file path=customXml/itemProps2.xml><?xml version="1.0" encoding="utf-8"?>
+<file path=customXml/itemProps4.xml><?xml version="1.0" encoding="utf-8"?>
 <ds:datastoreItem xmlns:ds="http://schemas.openxmlformats.org/officeDocument/2006/customXml" ds:itemID="{C39D5494-1847-4215-BB00-A838605872D2}">
   <ds:schemaRefs>
     <ds:schemaRef ds:uri="http://schemas.microsoft.com/office/2006/metadata/properties"/>
@@ -6780,16 +6562,4 @@
     <ds:schemaRef ds:uri="edc1eb1c-f9b5-429a-a0ce-702847a0aa2d"/>
   </ds:schemaRefs>
 </ds:datastoreItem>
-</file>
-
-<file path=customXml/itemProps3.xml><?xml version="1.0" encoding="utf-8"?>
-<ds:datastoreItem xmlns:ds="http://schemas.openxmlformats.org/officeDocument/2006/customXml" ds:itemID="{47EF2022-71B6-49E9-B4B3-406B4472E9BD}"/>
-</file>
-
-<file path=customXml/itemProps4.xml><?xml version="1.0" encoding="utf-8"?>
-<ds:datastoreItem xmlns:ds="http://schemas.openxmlformats.org/officeDocument/2006/customXml" ds:itemID="{58D8DE95-DF74-49C6-8885-90B115E8F94F}">
-  <ds:schemaRefs>
-    <ds:schemaRef ds:uri="http://schemas.microsoft.com/sharepoint/v3/contenttype/forms"/>
-  </ds:schemaRefs>
-</ds:datastoreItem>
 </file>
</xml_diff>